<commit_message>
preoceso PT2 SE -> ERROR MATRIZ OBSTACULE
</commit_message>
<xml_diff>
--- a/sistemas_operativos/unidad_1/actividad2/actividad2.docx
+++ b/sistemas_operativos/unidad_1/actividad2/actividad2.docx
@@ -387,40 +387,19 @@
           <w:rFonts w:ascii="Arial" w:hAnsi="Arial" w:cs="Arial"/>
         </w:rPr>
         <w:lastRenderedPageBreak/>
-        <w:t>Copie el archivo primero que está dentro de /home/sist20232/</w:t>
-      </w:r>
-      <w:proofErr w:type="spellStart"/>
-      <w:r>
-        <w:rPr>
-          <w:rFonts w:ascii="Arial" w:hAnsi="Arial" w:cs="Arial"/>
-        </w:rPr>
-        <w:t>lety</w:t>
-      </w:r>
-      <w:proofErr w:type="spellEnd"/>
-      <w:r>
-        <w:rPr>
-          <w:rFonts w:ascii="Arial" w:hAnsi="Arial" w:cs="Arial"/>
-        </w:rPr>
-        <w:t xml:space="preserve">/filtros a su home </w:t>
-      </w:r>
-      <w:proofErr w:type="spellStart"/>
-      <w:r>
-        <w:rPr>
-          <w:rFonts w:ascii="Arial" w:hAnsi="Arial" w:cs="Arial"/>
-        </w:rPr>
-        <w:t>directory</w:t>
-      </w:r>
-      <w:proofErr w:type="spellEnd"/>
-    </w:p>
-    <w:p>
-      <w:pPr>
-        <w:rPr>
-          <w:rFonts w:ascii="Arial" w:hAnsi="Arial" w:cs="Arial"/>
-        </w:rPr>
-      </w:pPr>
-      <w:r>
-        <w:rPr>
-          <w:rFonts w:ascii="Arial" w:hAnsi="Arial" w:cs="Arial"/>
+        <w:t>Copie el archivo primero que está dentro de /home/sist20232/lety/filtros a su home directory</w:t>
+      </w:r>
+    </w:p>
+    <w:p>
+      <w:pPr>
+        <w:rPr>
+          <w:rFonts w:ascii="Arial" w:hAnsi="Arial" w:cs="Arial"/>
+        </w:rPr>
+      </w:pPr>
+      <w:r>
+        <w:rPr>
+          <w:rFonts w:ascii="Arial" w:hAnsi="Arial" w:cs="Arial"/>
+          <w:noProof/>
         </w:rPr>
         <w:drawing>
           <wp:inline distT="0" distB="0" distL="0" distR="0" wp14:anchorId="12CB68DC" wp14:editId="452A2E3D">
@@ -474,32 +453,19 @@
         <w:rPr>
           <w:rFonts w:ascii="Arial" w:hAnsi="Arial" w:cs="Arial"/>
         </w:rPr>
-        <w:t xml:space="preserve">Copie el archivo segundo (está en el mismo directorio) home </w:t>
-      </w:r>
-      <w:proofErr w:type="spellStart"/>
-      <w:r>
-        <w:rPr>
-          <w:rFonts w:ascii="Arial" w:hAnsi="Arial" w:cs="Arial"/>
-        </w:rPr>
-        <w:t>directory</w:t>
-      </w:r>
-      <w:proofErr w:type="spellEnd"/>
-      <w:r>
-        <w:rPr>
-          <w:rFonts w:ascii="Arial" w:hAnsi="Arial" w:cs="Arial"/>
-        </w:rPr>
-        <w:t>.</w:t>
-      </w:r>
-    </w:p>
-    <w:p>
-      <w:pPr>
-        <w:rPr>
-          <w:rFonts w:ascii="Arial" w:hAnsi="Arial" w:cs="Arial"/>
-        </w:rPr>
-      </w:pPr>
-      <w:r>
-        <w:rPr>
-          <w:rFonts w:ascii="Arial" w:hAnsi="Arial" w:cs="Arial"/>
+        <w:t>Copie el archivo segundo (está en el mismo directorio) home directory.</w:t>
+      </w:r>
+    </w:p>
+    <w:p>
+      <w:pPr>
+        <w:rPr>
+          <w:rFonts w:ascii="Arial" w:hAnsi="Arial" w:cs="Arial"/>
+        </w:rPr>
+      </w:pPr>
+      <w:r>
+        <w:rPr>
+          <w:rFonts w:ascii="Arial" w:hAnsi="Arial" w:cs="Arial"/>
+          <w:noProof/>
         </w:rPr>
         <w:drawing>
           <wp:inline distT="0" distB="0" distL="0" distR="0" wp14:anchorId="55823754" wp14:editId="169CE1A7">
@@ -596,21 +562,7 @@
           <w:rFonts w:ascii="Arial" w:hAnsi="Arial" w:cs="Arial"/>
         </w:rPr>
         <w:lastRenderedPageBreak/>
-        <w:t>Copie el archivo intermedio de /home/sist20232/</w:t>
-      </w:r>
-      <w:proofErr w:type="spellStart"/>
-      <w:r>
-        <w:rPr>
-          <w:rFonts w:ascii="Arial" w:hAnsi="Arial" w:cs="Arial"/>
-        </w:rPr>
-        <w:t>lety</w:t>
-      </w:r>
-      <w:proofErr w:type="spellEnd"/>
-      <w:r>
-        <w:rPr>
-          <w:rFonts w:ascii="Arial" w:hAnsi="Arial" w:cs="Arial"/>
-        </w:rPr>
-        <w:t>/filtros</w:t>
+        <w:t>Copie el archivo intermedio de /home/sist20232/lety/filtros</w:t>
       </w:r>
       <w:r>
         <w:rPr>
@@ -635,6 +587,7 @@
       <w:r>
         <w:rPr>
           <w:rFonts w:ascii="Arial" w:hAnsi="Arial" w:cs="Arial"/>
+          <w:noProof/>
         </w:rPr>
         <w:drawing>
           <wp:inline distT="0" distB="0" distL="0" distR="0" wp14:anchorId="29329ED1" wp14:editId="4FADC3C8">
@@ -700,6 +653,7 @@
       <w:r>
         <w:rPr>
           <w:rFonts w:ascii="Arial" w:hAnsi="Arial" w:cs="Arial"/>
+          <w:noProof/>
         </w:rPr>
         <w:drawing>
           <wp:inline distT="0" distB="0" distL="0" distR="0" wp14:anchorId="6CAF3030" wp14:editId="2CDD0AF8">
@@ -801,6 +755,7 @@
       <w:r>
         <w:rPr>
           <w:rFonts w:ascii="Arial" w:hAnsi="Arial" w:cs="Arial"/>
+          <w:noProof/>
         </w:rPr>
         <w:drawing>
           <wp:inline distT="0" distB="0" distL="0" distR="0" wp14:anchorId="2C5FF15D" wp14:editId="37484283">
@@ -854,34 +809,19 @@
         <w:rPr>
           <w:rFonts w:ascii="Arial" w:hAnsi="Arial" w:cs="Arial"/>
         </w:rPr>
-        <w:t>Copie los tres archivos (</w:t>
-      </w:r>
-      <w:proofErr w:type="spellStart"/>
-      <w:proofErr w:type="gramStart"/>
-      <w:r>
-        <w:rPr>
-          <w:rFonts w:ascii="Arial" w:hAnsi="Arial" w:cs="Arial"/>
-        </w:rPr>
-        <w:t>primero,segundo</w:t>
-      </w:r>
-      <w:proofErr w:type="spellEnd"/>
-      <w:proofErr w:type="gramEnd"/>
-      <w:r>
-        <w:rPr>
-          <w:rFonts w:ascii="Arial" w:hAnsi="Arial" w:cs="Arial"/>
-        </w:rPr>
-        <w:t xml:space="preserve"> e intermedio) utilizando una sola instrucción</w:t>
-      </w:r>
-    </w:p>
-    <w:p>
-      <w:pPr>
-        <w:rPr>
-          <w:rFonts w:ascii="Arial" w:hAnsi="Arial" w:cs="Arial"/>
-        </w:rPr>
-      </w:pPr>
-      <w:r>
-        <w:rPr>
-          <w:rFonts w:ascii="Arial" w:hAnsi="Arial" w:cs="Arial"/>
+        <w:t>Copie los tres archivos (primero,segundo e intermedio) utilizando una sola instrucción</w:t>
+      </w:r>
+    </w:p>
+    <w:p>
+      <w:pPr>
+        <w:rPr>
+          <w:rFonts w:ascii="Arial" w:hAnsi="Arial" w:cs="Arial"/>
+        </w:rPr>
+      </w:pPr>
+      <w:r>
+        <w:rPr>
+          <w:rFonts w:ascii="Arial" w:hAnsi="Arial" w:cs="Arial"/>
+          <w:noProof/>
         </w:rPr>
         <w:drawing>
           <wp:inline distT="0" distB="0" distL="0" distR="0" wp14:anchorId="0A1B9897" wp14:editId="19EAB5AA">
@@ -948,6 +888,7 @@
       <w:r>
         <w:rPr>
           <w:rFonts w:ascii="Arial" w:hAnsi="Arial" w:cs="Arial"/>
+          <w:noProof/>
         </w:rPr>
         <w:lastRenderedPageBreak/>
         <w:drawing>
@@ -997,6 +938,7 @@
       <w:r>
         <w:rPr>
           <w:rFonts w:ascii="Arial" w:hAnsi="Arial" w:cs="Arial"/>
+          <w:noProof/>
         </w:rPr>
         <w:drawing>
           <wp:inline distT="0" distB="0" distL="0" distR="0" wp14:anchorId="0AA03E4B" wp14:editId="0210249C">
@@ -1037,6 +979,38 @@
     </w:p>
     <w:p>
       <w:pPr>
+        <w:ind w:left="360"/>
+        <w:rPr>
+          <w:rFonts w:ascii="Arial" w:hAnsi="Arial" w:cs="Arial"/>
+        </w:rPr>
+      </w:pPr>
+    </w:p>
+    <w:p>
+      <w:pPr>
+        <w:ind w:left="360"/>
+        <w:rPr>
+          <w:rFonts w:ascii="Arial" w:hAnsi="Arial" w:cs="Arial"/>
+        </w:rPr>
+      </w:pPr>
+    </w:p>
+    <w:p>
+      <w:pPr>
+        <w:ind w:left="360"/>
+        <w:rPr>
+          <w:rFonts w:ascii="Arial" w:hAnsi="Arial" w:cs="Arial"/>
+        </w:rPr>
+      </w:pPr>
+    </w:p>
+    <w:p>
+      <w:pPr>
+        <w:ind w:left="360"/>
+        <w:rPr>
+          <w:rFonts w:ascii="Arial" w:hAnsi="Arial" w:cs="Arial"/>
+        </w:rPr>
+      </w:pPr>
+    </w:p>
+    <w:p>
+      <w:pPr>
         <w:pStyle w:val="ListParagraph"/>
         <w:numPr>
           <w:ilvl w:val="0"/>
@@ -1050,6 +1024,7 @@
         <w:rPr>
           <w:rFonts w:ascii="Arial" w:hAnsi="Arial" w:cs="Arial"/>
         </w:rPr>
+        <w:lastRenderedPageBreak/>
         <w:t>Muestre en pantalla el contenido de Enpaz.txt, numerando cada línea.</w:t>
       </w:r>
     </w:p>
@@ -1059,6 +1034,46 @@
           <w:rFonts w:ascii="Arial" w:hAnsi="Arial" w:cs="Arial"/>
         </w:rPr>
       </w:pPr>
+      <w:r>
+        <w:rPr>
+          <w:rFonts w:ascii="Arial" w:hAnsi="Arial" w:cs="Arial"/>
+        </w:rPr>
+        <w:drawing>
+          <wp:inline distT="0" distB="0" distL="0" distR="0" wp14:anchorId="15F99E0D" wp14:editId="5DF071CB">
+            <wp:extent cx="5400040" cy="2808605"/>
+            <wp:effectExtent l="0" t="0" r="0" b="0"/>
+            <wp:docPr id="2" name="Picture 2"/>
+            <wp:cNvGraphicFramePr>
+              <a:graphicFrameLocks xmlns:a="http://schemas.openxmlformats.org/drawingml/2006/main" noChangeAspect="1"/>
+            </wp:cNvGraphicFramePr>
+            <a:graphic xmlns:a="http://schemas.openxmlformats.org/drawingml/2006/main">
+              <a:graphicData uri="http://schemas.openxmlformats.org/drawingml/2006/picture">
+                <pic:pic xmlns:pic="http://schemas.openxmlformats.org/drawingml/2006/picture">
+                  <pic:nvPicPr>
+                    <pic:cNvPr id="1" name=""/>
+                    <pic:cNvPicPr/>
+                  </pic:nvPicPr>
+                  <pic:blipFill>
+                    <a:blip r:embed="rId16"/>
+                    <a:stretch>
+                      <a:fillRect/>
+                    </a:stretch>
+                  </pic:blipFill>
+                  <pic:spPr>
+                    <a:xfrm>
+                      <a:off x="0" y="0"/>
+                      <a:ext cx="5400040" cy="2808605"/>
+                    </a:xfrm>
+                    <a:prstGeom prst="rect">
+                      <a:avLst/>
+                    </a:prstGeom>
+                  </pic:spPr>
+                </pic:pic>
+              </a:graphicData>
+            </a:graphic>
+          </wp:inline>
+        </w:drawing>
+      </w:r>
     </w:p>
     <w:p>
       <w:pPr>
@@ -1069,15 +1084,73 @@
         </w:numPr>
         <w:rPr>
           <w:rFonts w:ascii="Arial" w:hAnsi="Arial" w:cs="Arial"/>
-          <w:lang w:val="en-US"/>
-        </w:rPr>
-      </w:pPr>
-      <w:r>
-        <w:rPr>
-          <w:rFonts w:ascii="Arial" w:hAnsi="Arial" w:cs="Arial"/>
-          <w:lang w:val="en-US"/>
-        </w:rPr>
-        <w:t>S</w:t>
+        </w:rPr>
+      </w:pPr>
+      <w:r>
+        <w:rPr>
+          <w:rFonts w:ascii="Arial" w:hAnsi="Arial" w:cs="Arial"/>
+        </w:rPr>
+        <w:t>Copie el archivo SuavePatria.txt de /home/sist20232/lety/filtros</w:t>
+      </w:r>
+      <w:r>
+        <w:rPr>
+          <w:rFonts w:ascii="Arial" w:hAnsi="Arial" w:cs="Arial"/>
+        </w:rPr>
+        <w:t xml:space="preserve"> </w:t>
+      </w:r>
+      <w:r>
+        <w:rPr>
+          <w:rFonts w:ascii="Arial" w:hAnsi="Arial" w:cs="Arial"/>
+        </w:rPr>
+        <w:t>a su directorio</w:t>
+      </w:r>
+    </w:p>
+    <w:p>
+      <w:pPr>
+        <w:ind w:left="360"/>
+        <w:rPr>
+          <w:rFonts w:ascii="Arial" w:hAnsi="Arial" w:cs="Arial"/>
+        </w:rPr>
+      </w:pPr>
+      <w:r>
+        <w:rPr>
+          <w:rFonts w:ascii="Arial" w:hAnsi="Arial" w:cs="Arial"/>
+        </w:rPr>
+        <w:drawing>
+          <wp:inline distT="0" distB="0" distL="0" distR="0" wp14:anchorId="75364F93" wp14:editId="0982DBC4">
+            <wp:extent cx="6123302" cy="1610751"/>
+            <wp:effectExtent l="0" t="0" r="0" b="8890"/>
+            <wp:docPr id="4" name="Picture 4"/>
+            <wp:cNvGraphicFramePr>
+              <a:graphicFrameLocks xmlns:a="http://schemas.openxmlformats.org/drawingml/2006/main" noChangeAspect="1"/>
+            </wp:cNvGraphicFramePr>
+            <a:graphic xmlns:a="http://schemas.openxmlformats.org/drawingml/2006/main">
+              <a:graphicData uri="http://schemas.openxmlformats.org/drawingml/2006/picture">
+                <pic:pic xmlns:pic="http://schemas.openxmlformats.org/drawingml/2006/picture">
+                  <pic:nvPicPr>
+                    <pic:cNvPr id="1" name=""/>
+                    <pic:cNvPicPr/>
+                  </pic:nvPicPr>
+                  <pic:blipFill>
+                    <a:blip r:embed="rId17"/>
+                    <a:stretch>
+                      <a:fillRect/>
+                    </a:stretch>
+                  </pic:blipFill>
+                  <pic:spPr>
+                    <a:xfrm>
+                      <a:off x="0" y="0"/>
+                      <a:ext cx="6156334" cy="1619440"/>
+                    </a:xfrm>
+                    <a:prstGeom prst="rect">
+                      <a:avLst/>
+                    </a:prstGeom>
+                  </pic:spPr>
+                </pic:pic>
+              </a:graphicData>
+            </a:graphic>
+          </wp:inline>
+        </w:drawing>
       </w:r>
     </w:p>
     <w:p>
@@ -1089,15 +1162,61 @@
         </w:numPr>
         <w:rPr>
           <w:rFonts w:ascii="Arial" w:hAnsi="Arial" w:cs="Arial"/>
-          <w:lang w:val="en-US"/>
-        </w:rPr>
-      </w:pPr>
-      <w:r>
-        <w:rPr>
-          <w:rFonts w:ascii="Arial" w:hAnsi="Arial" w:cs="Arial"/>
-          <w:lang w:val="en-US"/>
-        </w:rPr>
-        <w:t>D</w:t>
+        </w:rPr>
+      </w:pPr>
+      <w:r>
+        <w:rPr>
+          <w:rFonts w:ascii="Arial" w:hAnsi="Arial" w:cs="Arial"/>
+        </w:rPr>
+        <w:t>Muestre en pantalla el contenido del archivo amorosos.txt en el monitor</w:t>
+      </w:r>
+    </w:p>
+    <w:p>
+      <w:pPr>
+        <w:rPr>
+          <w:rFonts w:ascii="Arial" w:hAnsi="Arial" w:cs="Arial"/>
+        </w:rPr>
+      </w:pPr>
+      <w:r>
+        <w:rPr>
+          <w:rFonts w:ascii="Arial" w:hAnsi="Arial" w:cs="Arial"/>
+        </w:rPr>
+        <w:lastRenderedPageBreak/>
+        <w:drawing>
+          <wp:inline distT="0" distB="0" distL="0" distR="0" wp14:anchorId="7F12C7F2" wp14:editId="1540CD2A">
+            <wp:extent cx="4260850" cy="3394551"/>
+            <wp:effectExtent l="0" t="0" r="6350" b="0"/>
+            <wp:docPr id="6" name="Picture 6"/>
+            <wp:cNvGraphicFramePr>
+              <a:graphicFrameLocks xmlns:a="http://schemas.openxmlformats.org/drawingml/2006/main" noChangeAspect="1"/>
+            </wp:cNvGraphicFramePr>
+            <a:graphic xmlns:a="http://schemas.openxmlformats.org/drawingml/2006/main">
+              <a:graphicData uri="http://schemas.openxmlformats.org/drawingml/2006/picture">
+                <pic:pic xmlns:pic="http://schemas.openxmlformats.org/drawingml/2006/picture">
+                  <pic:nvPicPr>
+                    <pic:cNvPr id="1" name=""/>
+                    <pic:cNvPicPr/>
+                  </pic:nvPicPr>
+                  <pic:blipFill>
+                    <a:blip r:embed="rId18"/>
+                    <a:stretch>
+                      <a:fillRect/>
+                    </a:stretch>
+                  </pic:blipFill>
+                  <pic:spPr>
+                    <a:xfrm>
+                      <a:off x="0" y="0"/>
+                      <a:ext cx="4271425" cy="3402976"/>
+                    </a:xfrm>
+                    <a:prstGeom prst="rect">
+                      <a:avLst/>
+                    </a:prstGeom>
+                  </pic:spPr>
+                </pic:pic>
+              </a:graphicData>
+            </a:graphic>
+          </wp:inline>
+        </w:drawing>
       </w:r>
     </w:p>
     <w:p>
@@ -1109,15 +1228,136 @@
         </w:numPr>
         <w:rPr>
           <w:rFonts w:ascii="Arial" w:hAnsi="Arial" w:cs="Arial"/>
-          <w:lang w:val="en-US"/>
-        </w:rPr>
-      </w:pPr>
-      <w:r>
-        <w:rPr>
-          <w:rFonts w:ascii="Arial" w:hAnsi="Arial" w:cs="Arial"/>
-          <w:lang w:val="en-US"/>
-        </w:rPr>
-        <w:t>Sd</w:t>
+        </w:rPr>
+      </w:pPr>
+      <w:r>
+        <w:rPr>
+          <w:rFonts w:ascii="Arial" w:hAnsi="Arial" w:cs="Arial"/>
+        </w:rPr>
+        <w:t>Vuelva a mostrar el archivo amorosos.txt, pero por páginas.</w:t>
+      </w:r>
+    </w:p>
+    <w:p>
+      <w:pPr>
+        <w:rPr>
+          <w:rFonts w:ascii="Arial" w:hAnsi="Arial" w:cs="Arial"/>
+        </w:rPr>
+      </w:pPr>
+      <w:r>
+        <w:rPr>
+          <w:rFonts w:ascii="Arial" w:hAnsi="Arial" w:cs="Arial"/>
+        </w:rPr>
+        <w:drawing>
+          <wp:inline distT="0" distB="0" distL="0" distR="0" wp14:anchorId="67E8287F" wp14:editId="2969809A">
+            <wp:extent cx="3348990" cy="3636868"/>
+            <wp:effectExtent l="0" t="0" r="3810" b="1905"/>
+            <wp:docPr id="7" name="Picture 7"/>
+            <wp:cNvGraphicFramePr>
+              <a:graphicFrameLocks xmlns:a="http://schemas.openxmlformats.org/drawingml/2006/main" noChangeAspect="1"/>
+            </wp:cNvGraphicFramePr>
+            <a:graphic xmlns:a="http://schemas.openxmlformats.org/drawingml/2006/main">
+              <a:graphicData uri="http://schemas.openxmlformats.org/drawingml/2006/picture">
+                <pic:pic xmlns:pic="http://schemas.openxmlformats.org/drawingml/2006/picture">
+                  <pic:nvPicPr>
+                    <pic:cNvPr id="1" name=""/>
+                    <pic:cNvPicPr/>
+                  </pic:nvPicPr>
+                  <pic:blipFill>
+                    <a:blip r:embed="rId19"/>
+                    <a:stretch>
+                      <a:fillRect/>
+                    </a:stretch>
+                  </pic:blipFill>
+                  <pic:spPr>
+                    <a:xfrm>
+                      <a:off x="0" y="0"/>
+                      <a:ext cx="3355427" cy="3643858"/>
+                    </a:xfrm>
+                    <a:prstGeom prst="rect">
+                      <a:avLst/>
+                    </a:prstGeom>
+                  </pic:spPr>
+                </pic:pic>
+              </a:graphicData>
+            </a:graphic>
+          </wp:inline>
+        </w:drawing>
+      </w:r>
+    </w:p>
+    <w:p>
+      <w:pPr>
+        <w:rPr>
+          <w:rFonts w:ascii="Arial" w:hAnsi="Arial" w:cs="Arial"/>
+        </w:rPr>
+      </w:pPr>
+    </w:p>
+    <w:p>
+      <w:pPr>
+        <w:rPr>
+          <w:rFonts w:ascii="Arial" w:hAnsi="Arial" w:cs="Arial"/>
+        </w:rPr>
+      </w:pPr>
+    </w:p>
+    <w:p>
+      <w:pPr>
+        <w:rPr>
+          <w:rFonts w:ascii="Arial" w:hAnsi="Arial" w:cs="Arial"/>
+        </w:rPr>
+      </w:pPr>
+    </w:p>
+    <w:p>
+      <w:pPr>
+        <w:rPr>
+          <w:rFonts w:ascii="Arial" w:hAnsi="Arial" w:cs="Arial"/>
+        </w:rPr>
+      </w:pPr>
+    </w:p>
+    <w:p>
+      <w:pPr>
+        <w:rPr>
+          <w:rFonts w:ascii="Arial" w:hAnsi="Arial" w:cs="Arial"/>
+        </w:rPr>
+      </w:pPr>
+      <w:r>
+        <w:rPr>
+          <w:rFonts w:ascii="Arial" w:hAnsi="Arial" w:cs="Arial"/>
+        </w:rPr>
+        <w:lastRenderedPageBreak/>
+        <w:drawing>
+          <wp:inline distT="0" distB="0" distL="0" distR="0" wp14:anchorId="5F09925E" wp14:editId="10E4E6E8">
+            <wp:extent cx="3818890" cy="3989537"/>
+            <wp:effectExtent l="0" t="0" r="0" b="0"/>
+            <wp:docPr id="10" name="Picture 10"/>
+            <wp:cNvGraphicFramePr>
+              <a:graphicFrameLocks xmlns:a="http://schemas.openxmlformats.org/drawingml/2006/main" noChangeAspect="1"/>
+            </wp:cNvGraphicFramePr>
+            <a:graphic xmlns:a="http://schemas.openxmlformats.org/drawingml/2006/main">
+              <a:graphicData uri="http://schemas.openxmlformats.org/drawingml/2006/picture">
+                <pic:pic xmlns:pic="http://schemas.openxmlformats.org/drawingml/2006/picture">
+                  <pic:nvPicPr>
+                    <pic:cNvPr id="1" name=""/>
+                    <pic:cNvPicPr/>
+                  </pic:nvPicPr>
+                  <pic:blipFill>
+                    <a:blip r:embed="rId20"/>
+                    <a:stretch>
+                      <a:fillRect/>
+                    </a:stretch>
+                  </pic:blipFill>
+                  <pic:spPr>
+                    <a:xfrm>
+                      <a:off x="0" y="0"/>
+                      <a:ext cx="3830817" cy="4001996"/>
+                    </a:xfrm>
+                    <a:prstGeom prst="rect">
+                      <a:avLst/>
+                    </a:prstGeom>
+                  </pic:spPr>
+                </pic:pic>
+              </a:graphicData>
+            </a:graphic>
+          </wp:inline>
+        </w:drawing>
       </w:r>
     </w:p>
     <w:p>
@@ -1129,16 +1369,66 @@
         </w:numPr>
         <w:rPr>
           <w:rFonts w:ascii="Arial" w:hAnsi="Arial" w:cs="Arial"/>
-          <w:lang w:val="en-US"/>
-        </w:rPr>
-      </w:pPr>
-      <w:r>
-        <w:rPr>
-          <w:rFonts w:ascii="Arial" w:hAnsi="Arial" w:cs="Arial"/>
-          <w:lang w:val="en-US"/>
-        </w:rPr>
-        <w:lastRenderedPageBreak/>
-        <w:t>S</w:t>
+        </w:rPr>
+      </w:pPr>
+      <w:r>
+        <w:rPr>
+          <w:rFonts w:ascii="Arial" w:hAnsi="Arial" w:cs="Arial"/>
+        </w:rPr>
+        <w:t xml:space="preserve">Muestre las últimas diez líneas de este </w:t>
+      </w:r>
+      <w:r>
+        <w:rPr>
+          <w:rFonts w:ascii="Arial" w:hAnsi="Arial" w:cs="Arial"/>
+        </w:rPr>
+        <w:t>archive</w:t>
+      </w:r>
+    </w:p>
+    <w:p>
+      <w:pPr>
+        <w:rPr>
+          <w:rFonts w:ascii="Arial" w:hAnsi="Arial" w:cs="Arial"/>
+        </w:rPr>
+      </w:pPr>
+      <w:r>
+        <w:rPr>
+          <w:rFonts w:ascii="Arial" w:hAnsi="Arial" w:cs="Arial"/>
+        </w:rPr>
+        <w:drawing>
+          <wp:inline distT="0" distB="0" distL="0" distR="0" wp14:anchorId="7FEE2412" wp14:editId="51354BA7">
+            <wp:extent cx="4356100" cy="1666833"/>
+            <wp:effectExtent l="0" t="0" r="6350" b="0"/>
+            <wp:docPr id="11" name="Picture 11"/>
+            <wp:cNvGraphicFramePr>
+              <a:graphicFrameLocks xmlns:a="http://schemas.openxmlformats.org/drawingml/2006/main" noChangeAspect="1"/>
+            </wp:cNvGraphicFramePr>
+            <a:graphic xmlns:a="http://schemas.openxmlformats.org/drawingml/2006/main">
+              <a:graphicData uri="http://schemas.openxmlformats.org/drawingml/2006/picture">
+                <pic:pic xmlns:pic="http://schemas.openxmlformats.org/drawingml/2006/picture">
+                  <pic:nvPicPr>
+                    <pic:cNvPr id="1" name=""/>
+                    <pic:cNvPicPr/>
+                  </pic:nvPicPr>
+                  <pic:blipFill>
+                    <a:blip r:embed="rId21"/>
+                    <a:stretch>
+                      <a:fillRect/>
+                    </a:stretch>
+                  </pic:blipFill>
+                  <pic:spPr>
+                    <a:xfrm>
+                      <a:off x="0" y="0"/>
+                      <a:ext cx="4363885" cy="1669812"/>
+                    </a:xfrm>
+                    <a:prstGeom prst="rect">
+                      <a:avLst/>
+                    </a:prstGeom>
+                  </pic:spPr>
+                </pic:pic>
+              </a:graphicData>
+            </a:graphic>
+          </wp:inline>
+        </w:drawing>
       </w:r>
     </w:p>
     <w:p>
@@ -1150,16 +1440,68 @@
         </w:numPr>
         <w:rPr>
           <w:rFonts w:ascii="Arial" w:hAnsi="Arial" w:cs="Arial"/>
-          <w:lang w:val="en-US"/>
-        </w:rPr>
-      </w:pPr>
-      <w:r>
-        <w:rPr>
-          <w:rFonts w:ascii="Arial" w:hAnsi="Arial" w:cs="Arial"/>
-          <w:lang w:val="en-US"/>
-        </w:rPr>
-        <w:t>D</w:t>
-      </w:r>
+        </w:rPr>
+      </w:pPr>
+      <w:r>
+        <w:rPr>
+          <w:rFonts w:ascii="Arial" w:hAnsi="Arial" w:cs="Arial"/>
+        </w:rPr>
+        <w:t>El archivo SuavePatria.txt ahora se llamara patria.</w:t>
+      </w:r>
+    </w:p>
+    <w:p>
+      <w:pPr>
+        <w:rPr>
+          <w:rFonts w:ascii="Arial" w:hAnsi="Arial" w:cs="Arial"/>
+        </w:rPr>
+      </w:pPr>
+      <w:r>
+        <w:rPr>
+          <w:rFonts w:ascii="Arial" w:hAnsi="Arial" w:cs="Arial"/>
+        </w:rPr>
+        <w:drawing>
+          <wp:inline distT="0" distB="0" distL="0" distR="0" wp14:anchorId="7590BBC9" wp14:editId="3C817357">
+            <wp:extent cx="4093930" cy="1791335"/>
+            <wp:effectExtent l="0" t="0" r="1905" b="0"/>
+            <wp:docPr id="12" name="Picture 12"/>
+            <wp:cNvGraphicFramePr>
+              <a:graphicFrameLocks xmlns:a="http://schemas.openxmlformats.org/drawingml/2006/main" noChangeAspect="1"/>
+            </wp:cNvGraphicFramePr>
+            <a:graphic xmlns:a="http://schemas.openxmlformats.org/drawingml/2006/main">
+              <a:graphicData uri="http://schemas.openxmlformats.org/drawingml/2006/picture">
+                <pic:pic xmlns:pic="http://schemas.openxmlformats.org/drawingml/2006/picture">
+                  <pic:nvPicPr>
+                    <pic:cNvPr id="1" name=""/>
+                    <pic:cNvPicPr/>
+                  </pic:nvPicPr>
+                  <pic:blipFill>
+                    <a:blip r:embed="rId22"/>
+                    <a:stretch>
+                      <a:fillRect/>
+                    </a:stretch>
+                  </pic:blipFill>
+                  <pic:spPr>
+                    <a:xfrm>
+                      <a:off x="0" y="0"/>
+                      <a:ext cx="4101002" cy="1794429"/>
+                    </a:xfrm>
+                    <a:prstGeom prst="rect">
+                      <a:avLst/>
+                    </a:prstGeom>
+                  </pic:spPr>
+                </pic:pic>
+              </a:graphicData>
+            </a:graphic>
+          </wp:inline>
+        </w:drawing>
+      </w:r>
+    </w:p>
+    <w:p>
+      <w:pPr>
+        <w:rPr>
+          <w:rFonts w:ascii="Arial" w:hAnsi="Arial" w:cs="Arial"/>
+        </w:rPr>
+      </w:pPr>
     </w:p>
     <w:p>
       <w:pPr>
@@ -1170,15 +1512,61 @@
         </w:numPr>
         <w:rPr>
           <w:rFonts w:ascii="Arial" w:hAnsi="Arial" w:cs="Arial"/>
-          <w:lang w:val="en-US"/>
-        </w:rPr>
-      </w:pPr>
-      <w:r>
-        <w:rPr>
-          <w:rFonts w:ascii="Arial" w:hAnsi="Arial" w:cs="Arial"/>
-          <w:lang w:val="en-US"/>
-        </w:rPr>
-        <w:t>S</w:t>
+        </w:rPr>
+      </w:pPr>
+      <w:r>
+        <w:rPr>
+          <w:rFonts w:ascii="Arial" w:hAnsi="Arial" w:cs="Arial"/>
+        </w:rPr>
+        <w:lastRenderedPageBreak/>
+        <w:t>Muestre las últimas ocho líneas del archivo amorosos.txt</w:t>
+      </w:r>
+    </w:p>
+    <w:p>
+      <w:pPr>
+        <w:rPr>
+          <w:rFonts w:ascii="Arial" w:hAnsi="Arial" w:cs="Arial"/>
+        </w:rPr>
+      </w:pPr>
+      <w:r>
+        <w:rPr>
+          <w:rFonts w:ascii="Arial" w:hAnsi="Arial" w:cs="Arial"/>
+        </w:rPr>
+        <w:drawing>
+          <wp:inline distT="0" distB="0" distL="0" distR="0" wp14:anchorId="33E678AD" wp14:editId="7A09040B">
+            <wp:extent cx="4695190" cy="1722048"/>
+            <wp:effectExtent l="0" t="0" r="0" b="0"/>
+            <wp:docPr id="13" name="Picture 13"/>
+            <wp:cNvGraphicFramePr>
+              <a:graphicFrameLocks xmlns:a="http://schemas.openxmlformats.org/drawingml/2006/main" noChangeAspect="1"/>
+            </wp:cNvGraphicFramePr>
+            <a:graphic xmlns:a="http://schemas.openxmlformats.org/drawingml/2006/main">
+              <a:graphicData uri="http://schemas.openxmlformats.org/drawingml/2006/picture">
+                <pic:pic xmlns:pic="http://schemas.openxmlformats.org/drawingml/2006/picture">
+                  <pic:nvPicPr>
+                    <pic:cNvPr id="1" name=""/>
+                    <pic:cNvPicPr/>
+                  </pic:nvPicPr>
+                  <pic:blipFill>
+                    <a:blip r:embed="rId23"/>
+                    <a:stretch>
+                      <a:fillRect/>
+                    </a:stretch>
+                  </pic:blipFill>
+                  <pic:spPr>
+                    <a:xfrm>
+                      <a:off x="0" y="0"/>
+                      <a:ext cx="4707892" cy="1726707"/>
+                    </a:xfrm>
+                    <a:prstGeom prst="rect">
+                      <a:avLst/>
+                    </a:prstGeom>
+                  </pic:spPr>
+                </pic:pic>
+              </a:graphicData>
+            </a:graphic>
+          </wp:inline>
+        </w:drawing>
       </w:r>
     </w:p>
     <w:p>
@@ -1190,15 +1578,60 @@
         </w:numPr>
         <w:rPr>
           <w:rFonts w:ascii="Arial" w:hAnsi="Arial" w:cs="Arial"/>
-          <w:lang w:val="en-US"/>
-        </w:rPr>
-      </w:pPr>
-      <w:r>
-        <w:rPr>
-          <w:rFonts w:ascii="Arial" w:hAnsi="Arial" w:cs="Arial"/>
-          <w:lang w:val="en-US"/>
-        </w:rPr>
-        <w:t>D</w:t>
+        </w:rPr>
+      </w:pPr>
+      <w:r>
+        <w:rPr>
+          <w:rFonts w:ascii="Arial" w:hAnsi="Arial" w:cs="Arial"/>
+        </w:rPr>
+        <w:t>¿Cuántas palabras en total contiene el archivo amorosos.txt ?</w:t>
+      </w:r>
+    </w:p>
+    <w:p>
+      <w:pPr>
+        <w:rPr>
+          <w:rFonts w:ascii="Arial" w:hAnsi="Arial" w:cs="Arial"/>
+        </w:rPr>
+      </w:pPr>
+      <w:r>
+        <w:rPr>
+          <w:rFonts w:ascii="Arial" w:hAnsi="Arial" w:cs="Arial"/>
+        </w:rPr>
+        <w:drawing>
+          <wp:inline distT="0" distB="0" distL="0" distR="0" wp14:anchorId="0F34874B" wp14:editId="0152B6BE">
+            <wp:extent cx="3114675" cy="667949"/>
+            <wp:effectExtent l="0" t="0" r="0" b="0"/>
+            <wp:docPr id="14" name="Picture 14"/>
+            <wp:cNvGraphicFramePr>
+              <a:graphicFrameLocks xmlns:a="http://schemas.openxmlformats.org/drawingml/2006/main" noChangeAspect="1"/>
+            </wp:cNvGraphicFramePr>
+            <a:graphic xmlns:a="http://schemas.openxmlformats.org/drawingml/2006/main">
+              <a:graphicData uri="http://schemas.openxmlformats.org/drawingml/2006/picture">
+                <pic:pic xmlns:pic="http://schemas.openxmlformats.org/drawingml/2006/picture">
+                  <pic:nvPicPr>
+                    <pic:cNvPr id="1" name=""/>
+                    <pic:cNvPicPr/>
+                  </pic:nvPicPr>
+                  <pic:blipFill>
+                    <a:blip r:embed="rId24"/>
+                    <a:stretch>
+                      <a:fillRect/>
+                    </a:stretch>
+                  </pic:blipFill>
+                  <pic:spPr>
+                    <a:xfrm>
+                      <a:off x="0" y="0"/>
+                      <a:ext cx="3140619" cy="673513"/>
+                    </a:xfrm>
+                    <a:prstGeom prst="rect">
+                      <a:avLst/>
+                    </a:prstGeom>
+                  </pic:spPr>
+                </pic:pic>
+              </a:graphicData>
+            </a:graphic>
+          </wp:inline>
+        </w:drawing>
       </w:r>
     </w:p>
     <w:p>
@@ -1210,15 +1643,60 @@
         </w:numPr>
         <w:rPr>
           <w:rFonts w:ascii="Arial" w:hAnsi="Arial" w:cs="Arial"/>
-          <w:lang w:val="en-US"/>
-        </w:rPr>
-      </w:pPr>
-      <w:r>
-        <w:rPr>
-          <w:rFonts w:ascii="Arial" w:hAnsi="Arial" w:cs="Arial"/>
-          <w:lang w:val="en-US"/>
-        </w:rPr>
-        <w:t>S</w:t>
+        </w:rPr>
+      </w:pPr>
+      <w:r>
+        <w:rPr>
+          <w:rFonts w:ascii="Arial" w:hAnsi="Arial" w:cs="Arial"/>
+        </w:rPr>
+        <w:t>¿Cuántos caracteres en total contiene el archivo Enpaz.txt ?</w:t>
+      </w:r>
+    </w:p>
+    <w:p>
+      <w:pPr>
+        <w:rPr>
+          <w:rFonts w:ascii="Arial" w:hAnsi="Arial" w:cs="Arial"/>
+        </w:rPr>
+      </w:pPr>
+      <w:r>
+        <w:rPr>
+          <w:rFonts w:ascii="Arial" w:hAnsi="Arial" w:cs="Arial"/>
+        </w:rPr>
+        <w:drawing>
+          <wp:inline distT="0" distB="0" distL="0" distR="0" wp14:anchorId="056AB6E8" wp14:editId="40B05686">
+            <wp:extent cx="2603500" cy="898999"/>
+            <wp:effectExtent l="0" t="0" r="6350" b="0"/>
+            <wp:docPr id="15" name="Picture 15"/>
+            <wp:cNvGraphicFramePr>
+              <a:graphicFrameLocks xmlns:a="http://schemas.openxmlformats.org/drawingml/2006/main" noChangeAspect="1"/>
+            </wp:cNvGraphicFramePr>
+            <a:graphic xmlns:a="http://schemas.openxmlformats.org/drawingml/2006/main">
+              <a:graphicData uri="http://schemas.openxmlformats.org/drawingml/2006/picture">
+                <pic:pic xmlns:pic="http://schemas.openxmlformats.org/drawingml/2006/picture">
+                  <pic:nvPicPr>
+                    <pic:cNvPr id="1" name=""/>
+                    <pic:cNvPicPr/>
+                  </pic:nvPicPr>
+                  <pic:blipFill>
+                    <a:blip r:embed="rId25"/>
+                    <a:stretch>
+                      <a:fillRect/>
+                    </a:stretch>
+                  </pic:blipFill>
+                  <pic:spPr>
+                    <a:xfrm>
+                      <a:off x="0" y="0"/>
+                      <a:ext cx="2617718" cy="903909"/>
+                    </a:xfrm>
+                    <a:prstGeom prst="rect">
+                      <a:avLst/>
+                    </a:prstGeom>
+                  </pic:spPr>
+                </pic:pic>
+              </a:graphicData>
+            </a:graphic>
+          </wp:inline>
+        </w:drawing>
       </w:r>
     </w:p>
     <w:p>
@@ -1236,10 +1714,137 @@
       <w:r>
         <w:rPr>
           <w:rFonts w:ascii="Arial" w:hAnsi="Arial" w:cs="Arial"/>
+        </w:rPr>
+        <w:t xml:space="preserve">. Mostrar los permisos de todos los directorios que están en el directorio home. </w:t>
+      </w:r>
+      <w:r>
+        <w:rPr>
+          <w:rFonts w:ascii="Arial" w:hAnsi="Arial" w:cs="Arial"/>
           <w:lang w:val="en-US"/>
         </w:rPr>
-        <w:t>Ds</w:t>
-      </w:r>
+        <w:t>Observe cómo</w:t>
+      </w:r>
+      <w:r>
+        <w:rPr>
+          <w:rFonts w:ascii="Arial" w:hAnsi="Arial" w:cs="Arial"/>
+          <w:lang w:val="en-US"/>
+        </w:rPr>
+        <w:t xml:space="preserve"> </w:t>
+      </w:r>
+      <w:r>
+        <w:rPr>
+          <w:rFonts w:ascii="Arial" w:hAnsi="Arial" w:cs="Arial"/>
+        </w:rPr>
+        <w:t>están los permisos para grupo y otros usuarios</w:t>
+      </w:r>
+    </w:p>
+    <w:p>
+      <w:pPr>
+        <w:rPr>
+          <w:rFonts w:ascii="Arial" w:hAnsi="Arial" w:cs="Arial"/>
+          <w:lang w:val="en-US"/>
+        </w:rPr>
+      </w:pPr>
+      <w:r>
+        <w:rPr>
+          <w:rFonts w:ascii="Arial" w:hAnsi="Arial" w:cs="Arial"/>
+          <w:lang w:val="en-US"/>
+        </w:rPr>
+        <w:lastRenderedPageBreak/>
+        <w:drawing>
+          <wp:inline distT="0" distB="0" distL="0" distR="0" wp14:anchorId="3D151A31" wp14:editId="5858C5F3">
+            <wp:extent cx="5400040" cy="5532120"/>
+            <wp:effectExtent l="0" t="0" r="0" b="0"/>
+            <wp:docPr id="16" name="Picture 16"/>
+            <wp:cNvGraphicFramePr>
+              <a:graphicFrameLocks xmlns:a="http://schemas.openxmlformats.org/drawingml/2006/main" noChangeAspect="1"/>
+            </wp:cNvGraphicFramePr>
+            <a:graphic xmlns:a="http://schemas.openxmlformats.org/drawingml/2006/main">
+              <a:graphicData uri="http://schemas.openxmlformats.org/drawingml/2006/picture">
+                <pic:pic xmlns:pic="http://schemas.openxmlformats.org/drawingml/2006/picture">
+                  <pic:nvPicPr>
+                    <pic:cNvPr id="1" name=""/>
+                    <pic:cNvPicPr/>
+                  </pic:nvPicPr>
+                  <pic:blipFill>
+                    <a:blip r:embed="rId26"/>
+                    <a:stretch>
+                      <a:fillRect/>
+                    </a:stretch>
+                  </pic:blipFill>
+                  <pic:spPr>
+                    <a:xfrm>
+                      <a:off x="0" y="0"/>
+                      <a:ext cx="5400040" cy="5532120"/>
+                    </a:xfrm>
+                    <a:prstGeom prst="rect">
+                      <a:avLst/>
+                    </a:prstGeom>
+                  </pic:spPr>
+                </pic:pic>
+              </a:graphicData>
+            </a:graphic>
+          </wp:inline>
+        </w:drawing>
+      </w:r>
+    </w:p>
+    <w:p>
+      <w:pPr>
+        <w:rPr>
+          <w:rFonts w:ascii="Arial" w:hAnsi="Arial" w:cs="Arial"/>
+          <w:lang w:val="en-US"/>
+        </w:rPr>
+      </w:pPr>
+      <w:r>
+        <w:rPr>
+          <w:rFonts w:ascii="Arial" w:hAnsi="Arial" w:cs="Arial"/>
+          <w:lang w:val="en-US"/>
+        </w:rPr>
+        <w:lastRenderedPageBreak/>
+        <w:drawing>
+          <wp:inline distT="0" distB="0" distL="0" distR="0" wp14:anchorId="55000596" wp14:editId="25DB88EA">
+            <wp:extent cx="5400040" cy="3566795"/>
+            <wp:effectExtent l="0" t="0" r="0" b="0"/>
+            <wp:docPr id="17" name="Picture 17"/>
+            <wp:cNvGraphicFramePr>
+              <a:graphicFrameLocks xmlns:a="http://schemas.openxmlformats.org/drawingml/2006/main" noChangeAspect="1"/>
+            </wp:cNvGraphicFramePr>
+            <a:graphic xmlns:a="http://schemas.openxmlformats.org/drawingml/2006/main">
+              <a:graphicData uri="http://schemas.openxmlformats.org/drawingml/2006/picture">
+                <pic:pic xmlns:pic="http://schemas.openxmlformats.org/drawingml/2006/picture">
+                  <pic:nvPicPr>
+                    <pic:cNvPr id="1" name=""/>
+                    <pic:cNvPicPr/>
+                  </pic:nvPicPr>
+                  <pic:blipFill>
+                    <a:blip r:embed="rId27"/>
+                    <a:stretch>
+                      <a:fillRect/>
+                    </a:stretch>
+                  </pic:blipFill>
+                  <pic:spPr>
+                    <a:xfrm>
+                      <a:off x="0" y="0"/>
+                      <a:ext cx="5400040" cy="3566795"/>
+                    </a:xfrm>
+                    <a:prstGeom prst="rect">
+                      <a:avLst/>
+                    </a:prstGeom>
+                  </pic:spPr>
+                </pic:pic>
+              </a:graphicData>
+            </a:graphic>
+          </wp:inline>
+        </w:drawing>
+      </w:r>
+    </w:p>
+    <w:p>
+      <w:pPr>
+        <w:rPr>
+          <w:rFonts w:ascii="Arial" w:hAnsi="Arial" w:cs="Arial"/>
+          <w:lang w:val="en-US"/>
+        </w:rPr>
+      </w:pPr>
     </w:p>
     <w:p>
       <w:pPr>
@@ -1250,15 +1855,61 @@
         </w:numPr>
         <w:rPr>
           <w:rFonts w:ascii="Arial" w:hAnsi="Arial" w:cs="Arial"/>
-          <w:lang w:val="en-US"/>
-        </w:rPr>
-      </w:pPr>
-      <w:r>
-        <w:rPr>
-          <w:rFonts w:ascii="Arial" w:hAnsi="Arial" w:cs="Arial"/>
-          <w:lang w:val="en-US"/>
-        </w:rPr>
-        <w:t>D</w:t>
+        </w:rPr>
+      </w:pPr>
+      <w:r>
+        <w:rPr>
+          <w:rFonts w:ascii="Arial" w:hAnsi="Arial" w:cs="Arial"/>
+        </w:rPr>
+        <w:t>Otorgue permiso a su grupo para leer y escribir en su directorio.</w:t>
+      </w:r>
+    </w:p>
+    <w:p>
+      <w:pPr>
+        <w:ind w:left="360"/>
+        <w:rPr>
+          <w:rFonts w:ascii="Arial" w:hAnsi="Arial" w:cs="Arial"/>
+        </w:rPr>
+      </w:pPr>
+      <w:r>
+        <w:rPr>
+          <w:rFonts w:ascii="Arial" w:hAnsi="Arial" w:cs="Arial"/>
+        </w:rPr>
+        <w:drawing>
+          <wp:inline distT="0" distB="0" distL="0" distR="0" wp14:anchorId="64A511DB" wp14:editId="171E088C">
+            <wp:extent cx="5400040" cy="1528445"/>
+            <wp:effectExtent l="0" t="0" r="0" b="0"/>
+            <wp:docPr id="18" name="Picture 18"/>
+            <wp:cNvGraphicFramePr>
+              <a:graphicFrameLocks xmlns:a="http://schemas.openxmlformats.org/drawingml/2006/main" noChangeAspect="1"/>
+            </wp:cNvGraphicFramePr>
+            <a:graphic xmlns:a="http://schemas.openxmlformats.org/drawingml/2006/main">
+              <a:graphicData uri="http://schemas.openxmlformats.org/drawingml/2006/picture">
+                <pic:pic xmlns:pic="http://schemas.openxmlformats.org/drawingml/2006/picture">
+                  <pic:nvPicPr>
+                    <pic:cNvPr id="1" name=""/>
+                    <pic:cNvPicPr/>
+                  </pic:nvPicPr>
+                  <pic:blipFill>
+                    <a:blip r:embed="rId28"/>
+                    <a:stretch>
+                      <a:fillRect/>
+                    </a:stretch>
+                  </pic:blipFill>
+                  <pic:spPr>
+                    <a:xfrm>
+                      <a:off x="0" y="0"/>
+                      <a:ext cx="5400040" cy="1528445"/>
+                    </a:xfrm>
+                    <a:prstGeom prst="rect">
+                      <a:avLst/>
+                    </a:prstGeom>
+                  </pic:spPr>
+                </pic:pic>
+              </a:graphicData>
+            </a:graphic>
+          </wp:inline>
+        </w:drawing>
       </w:r>
     </w:p>
     <w:p>
@@ -1270,15 +1921,92 @@
         </w:numPr>
         <w:rPr>
           <w:rFonts w:ascii="Arial" w:hAnsi="Arial" w:cs="Arial"/>
-          <w:lang w:val="en-US"/>
-        </w:rPr>
-      </w:pPr>
-      <w:r>
-        <w:rPr>
-          <w:rFonts w:ascii="Arial" w:hAnsi="Arial" w:cs="Arial"/>
-          <w:lang w:val="en-US"/>
-        </w:rPr>
-        <w:t>S</w:t>
+        </w:rPr>
+      </w:pPr>
+      <w:r>
+        <w:rPr>
+          <w:rFonts w:ascii="Arial" w:hAnsi="Arial" w:cs="Arial"/>
+        </w:rPr>
+        <w:t>Seleccione a uno sus compañeros, escriba un archivo en su directorio, llamado películas (use el</w:t>
+      </w:r>
+      <w:r>
+        <w:rPr>
+          <w:rFonts w:ascii="Arial" w:hAnsi="Arial" w:cs="Arial"/>
+        </w:rPr>
+        <w:t xml:space="preserve"> </w:t>
+      </w:r>
+      <w:r>
+        <w:rPr>
+          <w:rFonts w:ascii="Arial" w:hAnsi="Arial" w:cs="Arial"/>
+        </w:rPr>
+        <w:t>comando cat). Escriba un párrafo sobre la última película o serie que haya visto, puede ser</w:t>
+      </w:r>
+      <w:r>
+        <w:rPr>
+          <w:rFonts w:ascii="Arial" w:hAnsi="Arial" w:cs="Arial"/>
+        </w:rPr>
+        <w:t xml:space="preserve"> </w:t>
+      </w:r>
+      <w:r>
+        <w:rPr>
+          <w:rFonts w:ascii="Arial" w:hAnsi="Arial" w:cs="Arial"/>
+        </w:rPr>
+        <w:t>una sinopsis o su opinión person</w:t>
+      </w:r>
+      <w:r>
+        <w:rPr>
+          <w:rFonts w:ascii="Arial" w:hAnsi="Arial" w:cs="Arial"/>
+        </w:rPr>
+        <w:t>al</w:t>
+      </w:r>
+    </w:p>
+    <w:p>
+      <w:pPr>
+        <w:ind w:left="360"/>
+        <w:rPr>
+          <w:rFonts w:ascii="Arial" w:hAnsi="Arial" w:cs="Arial"/>
+        </w:rPr>
+      </w:pPr>
+      <w:r>
+        <w:rPr>
+          <w:rFonts w:ascii="Arial" w:hAnsi="Arial" w:cs="Arial"/>
+        </w:rPr>
+        <w:lastRenderedPageBreak/>
+        <w:drawing>
+          <wp:inline distT="0" distB="0" distL="0" distR="0" wp14:anchorId="1EB77DFB" wp14:editId="5AAEE562">
+            <wp:extent cx="5400040" cy="2211070"/>
+            <wp:effectExtent l="0" t="0" r="0" b="0"/>
+            <wp:docPr id="19" name="Picture 19"/>
+            <wp:cNvGraphicFramePr>
+              <a:graphicFrameLocks xmlns:a="http://schemas.openxmlformats.org/drawingml/2006/main" noChangeAspect="1"/>
+            </wp:cNvGraphicFramePr>
+            <a:graphic xmlns:a="http://schemas.openxmlformats.org/drawingml/2006/main">
+              <a:graphicData uri="http://schemas.openxmlformats.org/drawingml/2006/picture">
+                <pic:pic xmlns:pic="http://schemas.openxmlformats.org/drawingml/2006/picture">
+                  <pic:nvPicPr>
+                    <pic:cNvPr id="1" name=""/>
+                    <pic:cNvPicPr/>
+                  </pic:nvPicPr>
+                  <pic:blipFill>
+                    <a:blip r:embed="rId29"/>
+                    <a:stretch>
+                      <a:fillRect/>
+                    </a:stretch>
+                  </pic:blipFill>
+                  <pic:spPr>
+                    <a:xfrm>
+                      <a:off x="0" y="0"/>
+                      <a:ext cx="5400040" cy="2211070"/>
+                    </a:xfrm>
+                    <a:prstGeom prst="rect">
+                      <a:avLst/>
+                    </a:prstGeom>
+                  </pic:spPr>
+                </pic:pic>
+              </a:graphicData>
+            </a:graphic>
+          </wp:inline>
+        </w:drawing>
       </w:r>
     </w:p>
     <w:p>
@@ -1290,15 +2018,61 @@
         </w:numPr>
         <w:rPr>
           <w:rFonts w:ascii="Arial" w:hAnsi="Arial" w:cs="Arial"/>
-          <w:lang w:val="en-US"/>
-        </w:rPr>
-      </w:pPr>
-      <w:r>
-        <w:rPr>
-          <w:rFonts w:ascii="Arial" w:hAnsi="Arial" w:cs="Arial"/>
-          <w:lang w:val="en-US"/>
-        </w:rPr>
-        <w:t>D</w:t>
+        </w:rPr>
+      </w:pPr>
+      <w:r>
+        <w:rPr>
+          <w:rFonts w:ascii="Arial" w:hAnsi="Arial" w:cs="Arial"/>
+        </w:rPr>
+        <w:t>Otorgar permiso de lectura al grupo para este archivo.</w:t>
+      </w:r>
+    </w:p>
+    <w:p>
+      <w:pPr>
+        <w:ind w:left="360"/>
+        <w:rPr>
+          <w:rFonts w:ascii="Arial" w:hAnsi="Arial" w:cs="Arial"/>
+        </w:rPr>
+      </w:pPr>
+      <w:r>
+        <w:rPr>
+          <w:rFonts w:ascii="Arial" w:hAnsi="Arial" w:cs="Arial"/>
+        </w:rPr>
+        <w:drawing>
+          <wp:inline distT="0" distB="0" distL="0" distR="0" wp14:anchorId="5D4BCD56" wp14:editId="1D3FAA04">
+            <wp:extent cx="5400040" cy="2586990"/>
+            <wp:effectExtent l="0" t="0" r="0" b="3810"/>
+            <wp:docPr id="20" name="Picture 20"/>
+            <wp:cNvGraphicFramePr>
+              <a:graphicFrameLocks xmlns:a="http://schemas.openxmlformats.org/drawingml/2006/main" noChangeAspect="1"/>
+            </wp:cNvGraphicFramePr>
+            <a:graphic xmlns:a="http://schemas.openxmlformats.org/drawingml/2006/main">
+              <a:graphicData uri="http://schemas.openxmlformats.org/drawingml/2006/picture">
+                <pic:pic xmlns:pic="http://schemas.openxmlformats.org/drawingml/2006/picture">
+                  <pic:nvPicPr>
+                    <pic:cNvPr id="1" name=""/>
+                    <pic:cNvPicPr/>
+                  </pic:nvPicPr>
+                  <pic:blipFill>
+                    <a:blip r:embed="rId30"/>
+                    <a:stretch>
+                      <a:fillRect/>
+                    </a:stretch>
+                  </pic:blipFill>
+                  <pic:spPr>
+                    <a:xfrm>
+                      <a:off x="0" y="0"/>
+                      <a:ext cx="5400040" cy="2586990"/>
+                    </a:xfrm>
+                    <a:prstGeom prst="rect">
+                      <a:avLst/>
+                    </a:prstGeom>
+                  </pic:spPr>
+                </pic:pic>
+              </a:graphicData>
+            </a:graphic>
+          </wp:inline>
+        </w:drawing>
       </w:r>
     </w:p>
     <w:p>
@@ -1318,7 +2092,7 @@
           <w:rFonts w:ascii="Arial" w:hAnsi="Arial" w:cs="Arial"/>
           <w:lang w:val="en-US"/>
         </w:rPr>
-        <w:t>Sd</w:t>
+        <w:t>D</w:t>
       </w:r>
     </w:p>
     <w:p>
@@ -1333,19 +2107,37 @@
           <w:lang w:val="en-US"/>
         </w:rPr>
       </w:pPr>
-      <w:proofErr w:type="spellStart"/>
       <w:r>
         <w:rPr>
           <w:rFonts w:ascii="Arial" w:hAnsi="Arial" w:cs="Arial"/>
           <w:lang w:val="en-US"/>
         </w:rPr>
+        <w:t>Sd</w:t>
+      </w:r>
+    </w:p>
+    <w:p>
+      <w:pPr>
+        <w:pStyle w:val="ListParagraph"/>
+        <w:numPr>
+          <w:ilvl w:val="0"/>
+          <w:numId w:val="6"/>
+        </w:numPr>
+        <w:rPr>
+          <w:rFonts w:ascii="Arial" w:hAnsi="Arial" w:cs="Arial"/>
+          <w:lang w:val="en-US"/>
+        </w:rPr>
+      </w:pPr>
+      <w:r>
+        <w:rPr>
+          <w:rFonts w:ascii="Arial" w:hAnsi="Arial" w:cs="Arial"/>
+          <w:lang w:val="en-US"/>
+        </w:rPr>
         <w:t>sdsd</w:t>
       </w:r>
-      <w:proofErr w:type="spellEnd"/>
     </w:p>
     <w:sectPr>
-      <w:headerReference w:type="default" r:id="rId16"/>
-      <w:footerReference w:type="default" r:id="rId17"/>
+      <w:headerReference w:type="default" r:id="rId31"/>
+      <w:footerReference w:type="default" r:id="rId32"/>
       <w:pgSz w:w="11906" w:h="16838"/>
       <w:pgMar w:top="1417" w:right="1701" w:bottom="1417" w:left="1701" w:header="708" w:footer="708" w:gutter="0"/>
       <w:cols w:space="708"/>

</xml_diff>

<commit_message>
terminando la P2 y P3 aun no comunica
</commit_message>
<xml_diff>
--- a/sistemas_operativos/unidad_1/actividad2/actividad2.docx
+++ b/sistemas_operativos/unidad_1/actividad2/actividad2.docx
@@ -227,35 +227,33 @@
           <w:sz w:val="36"/>
           <w:szCs w:val="36"/>
         </w:rPr>
-        <w:t>Practica N.1 sistemas de archivos</w:t>
-      </w:r>
-    </w:p>
-    <w:p>
-      <w:pPr>
-        <w:jc w:val="center"/>
+        <w:t>Practica N.</w:t>
+      </w:r>
+      <w:r>
         <w:rPr>
           <w:rFonts w:ascii="Arial" w:eastAsia="Arial" w:hAnsi="Arial" w:cs="Arial"/>
           <w:sz w:val="36"/>
           <w:szCs w:val="36"/>
         </w:rPr>
-      </w:pPr>
-    </w:p>
-    <w:p>
-      <w:pPr>
-        <w:jc w:val="center"/>
+        <w:t xml:space="preserve">2 </w:t>
+      </w:r>
+      <w:proofErr w:type="spellStart"/>
+      <w:r>
         <w:rPr>
           <w:rFonts w:ascii="Arial" w:eastAsia="Arial" w:hAnsi="Arial" w:cs="Arial"/>
           <w:sz w:val="36"/>
           <w:szCs w:val="36"/>
         </w:rPr>
-      </w:pPr>
+        <w:t>filesystem</w:t>
+      </w:r>
+      <w:proofErr w:type="spellEnd"/>
       <w:r>
         <w:rPr>
           <w:rFonts w:ascii="Arial" w:eastAsia="Arial" w:hAnsi="Arial" w:cs="Arial"/>
           <w:sz w:val="36"/>
           <w:szCs w:val="36"/>
         </w:rPr>
-        <w:t>Alma Leticia Palacios Guerreo</w:t>
+        <w:t xml:space="preserve"> - archivos</w:t>
       </w:r>
     </w:p>
     <w:p>
@@ -283,31 +281,35 @@
           <w:sz w:val="36"/>
           <w:szCs w:val="36"/>
         </w:rPr>
-        <w:t xml:space="preserve">Garcia </w:t>
-      </w:r>
-      <w:r>
+        <w:t>Alma Leticia Palacios Guerreo</w:t>
+      </w:r>
+    </w:p>
+    <w:p>
+      <w:pPr>
+        <w:jc w:val="center"/>
         <w:rPr>
           <w:rFonts w:ascii="Arial" w:eastAsia="Arial" w:hAnsi="Arial" w:cs="Arial"/>
           <w:sz w:val="36"/>
           <w:szCs w:val="36"/>
         </w:rPr>
-        <w:t>Chávez</w:t>
-      </w:r>
-      <w:r>
+      </w:pPr>
+    </w:p>
+    <w:p>
+      <w:pPr>
+        <w:jc w:val="center"/>
         <w:rPr>
           <w:rFonts w:ascii="Arial" w:eastAsia="Arial" w:hAnsi="Arial" w:cs="Arial"/>
           <w:sz w:val="36"/>
           <w:szCs w:val="36"/>
         </w:rPr>
-        <w:t xml:space="preserve"> </w:t>
-      </w:r>
+      </w:pPr>
       <w:r>
         <w:rPr>
           <w:rFonts w:ascii="Arial" w:eastAsia="Arial" w:hAnsi="Arial" w:cs="Arial"/>
           <w:sz w:val="36"/>
           <w:szCs w:val="36"/>
         </w:rPr>
-        <w:t>E</w:t>
+        <w:t xml:space="preserve">Garcia </w:t>
       </w:r>
       <w:r>
         <w:rPr>
@@ -315,35 +317,23 @@
           <w:sz w:val="36"/>
           <w:szCs w:val="36"/>
         </w:rPr>
-        <w:t>rik 01275863</w:t>
-      </w:r>
-    </w:p>
-    <w:p>
-      <w:pPr>
-        <w:jc w:val="center"/>
+        <w:t>Chávez</w:t>
+      </w:r>
+      <w:r>
         <w:rPr>
           <w:rFonts w:ascii="Arial" w:eastAsia="Arial" w:hAnsi="Arial" w:cs="Arial"/>
           <w:sz w:val="36"/>
           <w:szCs w:val="36"/>
         </w:rPr>
-      </w:pPr>
-    </w:p>
-    <w:p>
-      <w:pPr>
-        <w:jc w:val="center"/>
-        <w:rPr>
-          <w:rFonts w:ascii="Arial" w:hAnsi="Arial" w:cs="Arial"/>
-          <w:sz w:val="36"/>
-          <w:szCs w:val="36"/>
-        </w:rPr>
-      </w:pPr>
+        <w:t xml:space="preserve"> </w:t>
+      </w:r>
       <w:r>
         <w:rPr>
           <w:rFonts w:ascii="Arial" w:eastAsia="Arial" w:hAnsi="Arial" w:cs="Arial"/>
           <w:sz w:val="36"/>
           <w:szCs w:val="36"/>
         </w:rPr>
-        <w:t xml:space="preserve">Viernes </w:t>
+        <w:t>E</w:t>
       </w:r>
       <w:r>
         <w:rPr>
@@ -351,14 +341,14 @@
           <w:sz w:val="36"/>
           <w:szCs w:val="36"/>
         </w:rPr>
-        <w:t>lunes 8 de septiembre del 2025</w:t>
+        <w:t>rik 01275863</w:t>
       </w:r>
     </w:p>
     <w:p>
       <w:pPr>
         <w:jc w:val="center"/>
         <w:rPr>
-          <w:rFonts w:ascii="Arial" w:hAnsi="Arial" w:cs="Arial"/>
+          <w:rFonts w:ascii="Arial" w:eastAsia="Arial" w:hAnsi="Arial" w:cs="Arial"/>
           <w:sz w:val="36"/>
           <w:szCs w:val="36"/>
         </w:rPr>
@@ -366,46 +356,1191 @@
     </w:p>
     <w:p>
       <w:pPr>
-        <w:rPr>
-          <w:rFonts w:ascii="Arial" w:hAnsi="Arial" w:cs="Arial"/>
-        </w:rPr>
-      </w:pPr>
+        <w:jc w:val="center"/>
+        <w:rPr>
+          <w:rFonts w:ascii="Arial" w:hAnsi="Arial" w:cs="Arial"/>
+          <w:sz w:val="36"/>
+          <w:szCs w:val="36"/>
+        </w:rPr>
+      </w:pPr>
+      <w:r>
+        <w:rPr>
+          <w:rFonts w:ascii="Arial" w:eastAsia="Arial" w:hAnsi="Arial" w:cs="Arial"/>
+          <w:sz w:val="36"/>
+          <w:szCs w:val="36"/>
+        </w:rPr>
+        <w:t xml:space="preserve">lunes </w:t>
+      </w:r>
+      <w:r>
+        <w:rPr>
+          <w:rFonts w:ascii="Arial" w:eastAsia="Arial" w:hAnsi="Arial" w:cs="Arial"/>
+          <w:sz w:val="36"/>
+          <w:szCs w:val="36"/>
+        </w:rPr>
+        <w:t>15</w:t>
+      </w:r>
+      <w:r>
+        <w:rPr>
+          <w:rFonts w:ascii="Arial" w:eastAsia="Arial" w:hAnsi="Arial" w:cs="Arial"/>
+          <w:sz w:val="36"/>
+          <w:szCs w:val="36"/>
+        </w:rPr>
+        <w:t xml:space="preserve"> de septiembre del 2025</w:t>
+      </w:r>
+    </w:p>
+    <w:p>
+      <w:pPr>
+        <w:jc w:val="center"/>
+        <w:rPr>
+          <w:rFonts w:ascii="Arial" w:hAnsi="Arial" w:cs="Arial"/>
+          <w:sz w:val="36"/>
+          <w:szCs w:val="36"/>
+        </w:rPr>
+      </w:pPr>
+    </w:p>
+    <w:p>
+      <w:pPr>
+        <w:rPr>
+          <w:rFonts w:ascii="Arial" w:hAnsi="Arial" w:cs="Arial"/>
+        </w:rPr>
+      </w:pPr>
+    </w:p>
+    <w:p>
+      <w:pPr>
+        <w:rPr>
+          <w:rFonts w:ascii="Arial" w:hAnsi="Arial" w:cs="Arial"/>
+          <w:b/>
+          <w:bCs/>
+        </w:rPr>
+      </w:pPr>
+      <w:r>
+        <w:rPr>
+          <w:rFonts w:ascii="Arial" w:hAnsi="Arial" w:cs="Arial"/>
+          <w:b/>
+          <w:bCs/>
+        </w:rPr>
+        <w:lastRenderedPageBreak/>
+        <w:t>comandos</w:t>
+      </w:r>
     </w:p>
     <w:p>
       <w:pPr>
         <w:pStyle w:val="ListParagraph"/>
         <w:numPr>
           <w:ilvl w:val="0"/>
-          <w:numId w:val="6"/>
+          <w:numId w:val="7"/>
         </w:numPr>
         <w:rPr>
           <w:rFonts w:ascii="Arial" w:hAnsi="Arial" w:cs="Arial"/>
         </w:rPr>
       </w:pPr>
-      <w:r>
-        <w:rPr>
-          <w:rFonts w:ascii="Arial" w:hAnsi="Arial" w:cs="Arial"/>
-        </w:rPr>
-        <w:lastRenderedPageBreak/>
-        <w:t>Copie el archivo primero que está dentro de /home/sist20232/lety/filtros a su home directory</w:t>
-      </w:r>
-    </w:p>
-    <w:p>
-      <w:pPr>
-        <w:rPr>
-          <w:rFonts w:ascii="Arial" w:hAnsi="Arial" w:cs="Arial"/>
-        </w:rPr>
-      </w:pPr>
-      <w:r>
-        <w:rPr>
-          <w:rFonts w:ascii="Arial" w:hAnsi="Arial" w:cs="Arial"/>
-          <w:noProof/>
+      <w:proofErr w:type="spellStart"/>
+      <w:r>
+        <w:rPr>
+          <w:rFonts w:ascii="Arial" w:hAnsi="Arial" w:cs="Arial"/>
+          <w:b/>
+          <w:bCs/>
+        </w:rPr>
+        <w:t>cat</w:t>
+      </w:r>
+      <w:proofErr w:type="spellEnd"/>
+      <w:r>
+        <w:rPr>
+          <w:rFonts w:ascii="Arial" w:hAnsi="Arial" w:cs="Arial"/>
+          <w:b/>
+          <w:bCs/>
+        </w:rPr>
+        <w:t xml:space="preserve"> &lt;archivo</w:t>
+      </w:r>
+      <w:r>
+        <w:rPr>
+          <w:rFonts w:ascii="Arial" w:hAnsi="Arial" w:cs="Arial"/>
+          <w:b/>
+          <w:bCs/>
+        </w:rPr>
+        <w:t>&gt;:</w:t>
+      </w:r>
+      <w:r>
+        <w:rPr>
+          <w:rFonts w:ascii="Arial" w:hAnsi="Arial" w:cs="Arial"/>
+          <w:b/>
+          <w:bCs/>
+        </w:rPr>
+        <w:t xml:space="preserve"> </w:t>
+      </w:r>
+      <w:r>
+        <w:rPr>
+          <w:rFonts w:ascii="Arial" w:hAnsi="Arial" w:cs="Arial"/>
+        </w:rPr>
+        <w:t>lista</w:t>
+      </w:r>
+      <w:r>
+        <w:rPr>
+          <w:rFonts w:ascii="Arial" w:hAnsi="Arial" w:cs="Arial"/>
+        </w:rPr>
+        <w:t xml:space="preserve"> el contenido de </w:t>
+      </w:r>
+      <w:r>
+        <w:rPr>
+          <w:rFonts w:ascii="Arial" w:hAnsi="Arial" w:cs="Arial"/>
+        </w:rPr>
+        <w:t>un archivo</w:t>
+      </w:r>
+      <w:r>
+        <w:rPr>
+          <w:rFonts w:ascii="Arial" w:hAnsi="Arial" w:cs="Arial"/>
+        </w:rPr>
+        <w:t xml:space="preserve"> o varios</w:t>
+      </w:r>
+      <w:r>
+        <w:rPr>
+          <w:rFonts w:ascii="Arial" w:hAnsi="Arial" w:cs="Arial"/>
+        </w:rPr>
+        <w:t xml:space="preserve"> sin hacer pausas, </w:t>
+      </w:r>
+    </w:p>
+    <w:p>
+      <w:pPr>
+        <w:pStyle w:val="ListParagraph"/>
+        <w:numPr>
+          <w:ilvl w:val="0"/>
+          <w:numId w:val="7"/>
+        </w:numPr>
+        <w:rPr>
+          <w:rFonts w:ascii="Arial" w:hAnsi="Arial" w:cs="Arial"/>
+        </w:rPr>
+      </w:pPr>
+      <w:r>
+        <w:rPr>
+          <w:rFonts w:ascii="Arial" w:hAnsi="Arial" w:cs="Arial"/>
+          <w:b/>
+          <w:bCs/>
+        </w:rPr>
+        <w:t>more &lt;archivo1, archivo</w:t>
+      </w:r>
+      <w:proofErr w:type="gramStart"/>
+      <w:r>
+        <w:rPr>
+          <w:rFonts w:ascii="Arial" w:hAnsi="Arial" w:cs="Arial"/>
+          <w:b/>
+          <w:bCs/>
+        </w:rPr>
+        <w:t>2</w:t>
+      </w:r>
+      <w:r>
+        <w:rPr>
+          <w:rFonts w:ascii="Arial" w:hAnsi="Arial" w:cs="Arial"/>
+          <w:b/>
+          <w:bCs/>
+        </w:rPr>
+        <w:t>,</w:t>
+      </w:r>
+      <w:r>
+        <w:rPr>
+          <w:rFonts w:ascii="Arial" w:hAnsi="Arial" w:cs="Arial"/>
+          <w:b/>
+          <w:bCs/>
+        </w:rPr>
+        <w:t>...</w:t>
+      </w:r>
+      <w:proofErr w:type="gramEnd"/>
+      <w:r>
+        <w:rPr>
+          <w:rFonts w:ascii="Arial" w:hAnsi="Arial" w:cs="Arial"/>
+          <w:b/>
+          <w:bCs/>
+        </w:rPr>
+        <w:t>,</w:t>
+      </w:r>
+      <w:r>
+        <w:rPr>
+          <w:rFonts w:ascii="Arial" w:hAnsi="Arial" w:cs="Arial"/>
+          <w:b/>
+          <w:bCs/>
+        </w:rPr>
+        <w:t xml:space="preserve"> </w:t>
+      </w:r>
+      <w:proofErr w:type="spellStart"/>
+      <w:r>
+        <w:rPr>
+          <w:rFonts w:ascii="Arial" w:hAnsi="Arial" w:cs="Arial"/>
+          <w:b/>
+          <w:bCs/>
+        </w:rPr>
+        <w:t>archivo</w:t>
+      </w:r>
+      <w:r>
+        <w:rPr>
+          <w:rFonts w:ascii="Arial" w:hAnsi="Arial" w:cs="Arial"/>
+          <w:b/>
+          <w:bCs/>
+        </w:rPr>
+        <w:t>_n</w:t>
+      </w:r>
+      <w:proofErr w:type="spellEnd"/>
+      <w:r>
+        <w:rPr>
+          <w:rFonts w:ascii="Arial" w:hAnsi="Arial" w:cs="Arial"/>
+          <w:b/>
+          <w:bCs/>
+        </w:rPr>
+        <w:t xml:space="preserve">&gt;: </w:t>
+      </w:r>
+      <w:r>
+        <w:rPr>
+          <w:rFonts w:ascii="Arial" w:hAnsi="Arial" w:cs="Arial"/>
+        </w:rPr>
+        <w:t xml:space="preserve">muestra el contenido de un archivo o archivos, pero este no muestra todo el contenido si no que nos presenta en “paginas”, un comando mucho mas amigable </w:t>
+      </w:r>
+    </w:p>
+    <w:p>
+      <w:pPr>
+        <w:pStyle w:val="ListParagraph"/>
+        <w:numPr>
+          <w:ilvl w:val="0"/>
+          <w:numId w:val="7"/>
+        </w:numPr>
+        <w:rPr>
+          <w:rFonts w:ascii="Arial" w:hAnsi="Arial" w:cs="Arial"/>
+        </w:rPr>
+      </w:pPr>
+      <w:proofErr w:type="spellStart"/>
+      <w:r>
+        <w:rPr>
+          <w:rFonts w:ascii="Arial" w:hAnsi="Arial" w:cs="Arial"/>
+          <w:b/>
+          <w:bCs/>
+        </w:rPr>
+        <w:t>touch</w:t>
+      </w:r>
+      <w:proofErr w:type="spellEnd"/>
+      <w:r>
+        <w:rPr>
+          <w:rFonts w:ascii="Arial" w:hAnsi="Arial" w:cs="Arial"/>
+          <w:b/>
+          <w:bCs/>
+        </w:rPr>
+        <w:t xml:space="preserve"> &lt;archivo&gt;: </w:t>
+      </w:r>
+      <w:r>
+        <w:rPr>
+          <w:rFonts w:ascii="Arial" w:hAnsi="Arial" w:cs="Arial"/>
+        </w:rPr>
+        <w:t xml:space="preserve">comando utilizado para crear archivos </w:t>
+      </w:r>
+    </w:p>
+    <w:p>
+      <w:pPr>
+        <w:pStyle w:val="ListParagraph"/>
+        <w:numPr>
+          <w:ilvl w:val="0"/>
+          <w:numId w:val="7"/>
+        </w:numPr>
+        <w:rPr>
+          <w:rFonts w:ascii="Arial" w:hAnsi="Arial" w:cs="Arial"/>
+        </w:rPr>
+      </w:pPr>
+      <w:proofErr w:type="spellStart"/>
+      <w:r>
+        <w:rPr>
+          <w:rFonts w:ascii="Arial" w:hAnsi="Arial" w:cs="Arial"/>
+          <w:b/>
+          <w:bCs/>
+        </w:rPr>
+        <w:t>mv</w:t>
+      </w:r>
+      <w:proofErr w:type="spellEnd"/>
+      <w:r>
+        <w:rPr>
+          <w:rFonts w:ascii="Arial" w:hAnsi="Arial" w:cs="Arial"/>
+          <w:b/>
+          <w:bCs/>
+        </w:rPr>
+        <w:t xml:space="preserve"> &lt;</w:t>
+      </w:r>
+      <w:proofErr w:type="spellStart"/>
+      <w:r>
+        <w:rPr>
+          <w:rFonts w:ascii="Arial" w:hAnsi="Arial" w:cs="Arial"/>
+          <w:b/>
+          <w:bCs/>
+        </w:rPr>
+        <w:t>archivo_fuente</w:t>
+      </w:r>
+      <w:proofErr w:type="spellEnd"/>
+      <w:r>
+        <w:rPr>
+          <w:rFonts w:ascii="Arial" w:hAnsi="Arial" w:cs="Arial"/>
+          <w:b/>
+          <w:bCs/>
+        </w:rPr>
+        <w:t>&gt; &lt;</w:t>
+      </w:r>
+      <w:proofErr w:type="spellStart"/>
+      <w:r>
+        <w:rPr>
+          <w:rFonts w:ascii="Arial" w:hAnsi="Arial" w:cs="Arial"/>
+          <w:b/>
+          <w:bCs/>
+        </w:rPr>
+        <w:t>dirección_destino</w:t>
+      </w:r>
+      <w:proofErr w:type="spellEnd"/>
+      <w:r>
+        <w:rPr>
+          <w:rFonts w:ascii="Arial" w:hAnsi="Arial" w:cs="Arial"/>
+          <w:b/>
+          <w:bCs/>
+        </w:rPr>
+        <w:t>&gt;:</w:t>
+      </w:r>
+      <w:r>
+        <w:rPr>
+          <w:rFonts w:ascii="Arial" w:hAnsi="Arial" w:cs="Arial"/>
+          <w:b/>
+          <w:bCs/>
+        </w:rPr>
+        <w:t xml:space="preserve"> </w:t>
+      </w:r>
+      <w:r>
+        <w:rPr>
+          <w:rFonts w:ascii="Arial" w:hAnsi="Arial" w:cs="Arial"/>
+        </w:rPr>
+        <w:t xml:space="preserve">usado para mover archivos de un </w:t>
+      </w:r>
+      <w:r>
+        <w:rPr>
+          <w:rFonts w:ascii="Arial" w:hAnsi="Arial" w:cs="Arial"/>
+        </w:rPr>
+        <w:t>directorio</w:t>
+      </w:r>
+      <w:r>
+        <w:rPr>
+          <w:rFonts w:ascii="Arial" w:hAnsi="Arial" w:cs="Arial"/>
+        </w:rPr>
+        <w:t xml:space="preserve"> a otor </w:t>
+      </w:r>
+    </w:p>
+    <w:p>
+      <w:pPr>
+        <w:pStyle w:val="ListParagraph"/>
+        <w:numPr>
+          <w:ilvl w:val="1"/>
+          <w:numId w:val="7"/>
+        </w:numPr>
+        <w:rPr>
+          <w:rFonts w:ascii="Arial" w:hAnsi="Arial" w:cs="Arial"/>
+        </w:rPr>
+      </w:pPr>
+      <w:proofErr w:type="spellStart"/>
+      <w:r>
+        <w:rPr>
+          <w:rFonts w:ascii="Arial" w:hAnsi="Arial" w:cs="Arial"/>
+          <w:b/>
+          <w:bCs/>
+        </w:rPr>
+        <w:t>mv</w:t>
+      </w:r>
+      <w:proofErr w:type="spellEnd"/>
+      <w:r>
+        <w:rPr>
+          <w:rFonts w:ascii="Arial" w:hAnsi="Arial" w:cs="Arial"/>
+          <w:b/>
+          <w:bCs/>
+        </w:rPr>
+        <w:t xml:space="preserve"> &lt;</w:t>
+      </w:r>
+      <w:proofErr w:type="spellStart"/>
+      <w:r>
+        <w:rPr>
+          <w:rFonts w:ascii="Arial" w:hAnsi="Arial" w:cs="Arial"/>
+          <w:b/>
+          <w:bCs/>
+        </w:rPr>
+        <w:t>nombre_viejo</w:t>
+      </w:r>
+      <w:proofErr w:type="spellEnd"/>
+      <w:r>
+        <w:rPr>
+          <w:rFonts w:ascii="Arial" w:hAnsi="Arial" w:cs="Arial"/>
+          <w:b/>
+          <w:bCs/>
+        </w:rPr>
+        <w:t>&gt; &lt;</w:t>
+      </w:r>
+      <w:proofErr w:type="spellStart"/>
+      <w:r>
+        <w:rPr>
+          <w:rFonts w:ascii="Arial" w:hAnsi="Arial" w:cs="Arial"/>
+          <w:b/>
+          <w:bCs/>
+        </w:rPr>
+        <w:t>nombre_nuevo</w:t>
+      </w:r>
+      <w:proofErr w:type="spellEnd"/>
+      <w:r>
+        <w:rPr>
+          <w:rFonts w:ascii="Arial" w:hAnsi="Arial" w:cs="Arial"/>
+          <w:b/>
+          <w:bCs/>
+        </w:rPr>
+        <w:t>&gt;:</w:t>
+      </w:r>
+      <w:r>
+        <w:rPr>
+          <w:rFonts w:ascii="Arial" w:hAnsi="Arial" w:cs="Arial"/>
+        </w:rPr>
+        <w:t xml:space="preserve"> también funciona para renombrar </w:t>
+      </w:r>
+      <w:r>
+        <w:rPr>
+          <w:rFonts w:ascii="Arial" w:hAnsi="Arial" w:cs="Arial"/>
+        </w:rPr>
+        <w:t>archivos</w:t>
+      </w:r>
+      <w:r>
+        <w:rPr>
+          <w:rFonts w:ascii="Arial" w:hAnsi="Arial" w:cs="Arial"/>
+        </w:rPr>
+        <w:t xml:space="preserve"> </w:t>
+      </w:r>
+    </w:p>
+    <w:p>
+      <w:pPr>
+        <w:pStyle w:val="ListParagraph"/>
+        <w:numPr>
+          <w:ilvl w:val="0"/>
+          <w:numId w:val="7"/>
+        </w:numPr>
+        <w:rPr>
+          <w:rFonts w:ascii="Arial" w:hAnsi="Arial" w:cs="Arial"/>
+        </w:rPr>
+      </w:pPr>
+      <w:proofErr w:type="spellStart"/>
+      <w:r>
+        <w:rPr>
+          <w:rFonts w:ascii="Arial" w:hAnsi="Arial" w:cs="Arial"/>
+          <w:b/>
+          <w:bCs/>
+        </w:rPr>
+        <w:t>cp</w:t>
+      </w:r>
+      <w:proofErr w:type="spellEnd"/>
+      <w:r>
+        <w:rPr>
+          <w:rFonts w:ascii="Arial" w:hAnsi="Arial" w:cs="Arial"/>
+          <w:b/>
+          <w:bCs/>
+        </w:rPr>
+        <w:t xml:space="preserve"> &lt;fuente&gt; &lt;destino&gt;:</w:t>
+      </w:r>
+      <w:r>
+        <w:rPr>
+          <w:rFonts w:ascii="Arial" w:hAnsi="Arial" w:cs="Arial"/>
+        </w:rPr>
+        <w:t xml:space="preserve"> </w:t>
+      </w:r>
+      <w:r>
+        <w:rPr>
+          <w:rFonts w:ascii="Arial" w:hAnsi="Arial" w:cs="Arial"/>
+        </w:rPr>
+        <w:t xml:space="preserve">copia el archivo fuente al destino, puede ser 1 o mas </w:t>
+      </w:r>
+      <w:r>
+        <w:rPr>
+          <w:rFonts w:ascii="Arial" w:hAnsi="Arial" w:cs="Arial"/>
+        </w:rPr>
+        <w:t>archivos,</w:t>
+      </w:r>
+      <w:r>
+        <w:rPr>
+          <w:rFonts w:ascii="Arial" w:hAnsi="Arial" w:cs="Arial"/>
+        </w:rPr>
+        <w:t xml:space="preserve"> pero solo 1 desino, tiene la opción de agregar </w:t>
+      </w:r>
+      <w:r>
+        <w:rPr>
+          <w:rFonts w:ascii="Arial" w:hAnsi="Arial" w:cs="Arial"/>
+          <w:b/>
+          <w:bCs/>
+        </w:rPr>
+        <w:t xml:space="preserve">-i </w:t>
+      </w:r>
+      <w:r>
+        <w:rPr>
+          <w:rFonts w:ascii="Arial" w:hAnsi="Arial" w:cs="Arial"/>
+        </w:rPr>
+        <w:t xml:space="preserve">que pregunta antes de </w:t>
+      </w:r>
+      <w:r>
+        <w:rPr>
+          <w:rFonts w:ascii="Arial" w:hAnsi="Arial" w:cs="Arial"/>
+        </w:rPr>
+        <w:t>sobre escribir</w:t>
+      </w:r>
+      <w:r>
+        <w:rPr>
+          <w:rFonts w:ascii="Arial" w:hAnsi="Arial" w:cs="Arial"/>
+        </w:rPr>
+        <w:t xml:space="preserve"> un archivo </w:t>
+      </w:r>
+    </w:p>
+    <w:p>
+      <w:pPr>
+        <w:pStyle w:val="ListParagraph"/>
+        <w:numPr>
+          <w:ilvl w:val="0"/>
+          <w:numId w:val="7"/>
+        </w:numPr>
+        <w:rPr>
+          <w:rFonts w:ascii="Arial" w:hAnsi="Arial" w:cs="Arial"/>
+        </w:rPr>
+      </w:pPr>
+      <w:proofErr w:type="spellStart"/>
+      <w:r>
+        <w:rPr>
+          <w:rFonts w:ascii="Arial" w:hAnsi="Arial" w:cs="Arial"/>
+          <w:b/>
+          <w:bCs/>
+        </w:rPr>
+        <w:t>tail</w:t>
+      </w:r>
+      <w:proofErr w:type="spellEnd"/>
+      <w:r>
+        <w:rPr>
+          <w:rFonts w:ascii="Arial" w:hAnsi="Arial" w:cs="Arial"/>
+          <w:b/>
+          <w:bCs/>
+        </w:rPr>
+        <w:t xml:space="preserve"> &lt;archivo</w:t>
+      </w:r>
+      <w:r>
+        <w:rPr>
+          <w:rFonts w:ascii="Arial" w:hAnsi="Arial" w:cs="Arial"/>
+          <w:b/>
+          <w:bCs/>
+        </w:rPr>
+        <w:t>&gt;:</w:t>
+      </w:r>
+      <w:r>
+        <w:rPr>
+          <w:rFonts w:ascii="Arial" w:hAnsi="Arial" w:cs="Arial"/>
+        </w:rPr>
+        <w:t xml:space="preserve"> </w:t>
+      </w:r>
+      <w:r>
+        <w:rPr>
+          <w:rFonts w:ascii="Arial" w:hAnsi="Arial" w:cs="Arial"/>
+        </w:rPr>
+        <w:t xml:space="preserve">muestra las ultimas 10 </w:t>
+      </w:r>
+      <w:r>
+        <w:rPr>
+          <w:rFonts w:ascii="Arial" w:hAnsi="Arial" w:cs="Arial"/>
+        </w:rPr>
+        <w:t>líneas</w:t>
+      </w:r>
+      <w:r>
+        <w:rPr>
+          <w:rFonts w:ascii="Arial" w:hAnsi="Arial" w:cs="Arial"/>
+        </w:rPr>
+        <w:t xml:space="preserve"> de un archivo</w:t>
+      </w:r>
+    </w:p>
+    <w:p>
+      <w:pPr>
+        <w:pStyle w:val="ListParagraph"/>
+        <w:numPr>
+          <w:ilvl w:val="1"/>
+          <w:numId w:val="7"/>
+        </w:numPr>
+        <w:rPr>
+          <w:rFonts w:ascii="Arial" w:hAnsi="Arial" w:cs="Arial"/>
+        </w:rPr>
+      </w:pPr>
+      <w:proofErr w:type="spellStart"/>
+      <w:r>
+        <w:rPr>
+          <w:rFonts w:ascii="Arial" w:hAnsi="Arial" w:cs="Arial"/>
+          <w:b/>
+          <w:bCs/>
+        </w:rPr>
+        <w:t>tail</w:t>
+      </w:r>
+      <w:proofErr w:type="spellEnd"/>
+      <w:r>
+        <w:rPr>
+          <w:rFonts w:ascii="Arial" w:hAnsi="Arial" w:cs="Arial"/>
+          <w:b/>
+          <w:bCs/>
+        </w:rPr>
+        <w:t xml:space="preserve"> -n &lt;archivo&gt;: </w:t>
+      </w:r>
+      <w:r>
+        <w:rPr>
+          <w:rFonts w:ascii="Arial" w:hAnsi="Arial" w:cs="Arial"/>
+        </w:rPr>
+        <w:t>remplazamos</w:t>
+      </w:r>
+      <w:r>
+        <w:rPr>
+          <w:rFonts w:ascii="Arial" w:hAnsi="Arial" w:cs="Arial"/>
+        </w:rPr>
+        <w:t xml:space="preserve"> </w:t>
+      </w:r>
+      <w:r>
+        <w:rPr>
+          <w:rFonts w:ascii="Arial" w:hAnsi="Arial" w:cs="Arial"/>
+          <w:b/>
+          <w:bCs/>
+        </w:rPr>
+        <w:t xml:space="preserve">n </w:t>
+      </w:r>
+      <w:r>
+        <w:rPr>
+          <w:rFonts w:ascii="Arial" w:hAnsi="Arial" w:cs="Arial"/>
+        </w:rPr>
+        <w:t xml:space="preserve">con las </w:t>
+      </w:r>
+      <w:proofErr w:type="spellStart"/>
+      <w:r>
+        <w:rPr>
+          <w:rFonts w:ascii="Arial" w:hAnsi="Arial" w:cs="Arial"/>
+        </w:rPr>
+        <w:t>linas</w:t>
+      </w:r>
+      <w:proofErr w:type="spellEnd"/>
+      <w:r>
+        <w:rPr>
+          <w:rFonts w:ascii="Arial" w:hAnsi="Arial" w:cs="Arial"/>
+        </w:rPr>
+        <w:t xml:space="preserve"> que </w:t>
+      </w:r>
+      <w:r>
+        <w:rPr>
+          <w:rFonts w:ascii="Arial" w:hAnsi="Arial" w:cs="Arial"/>
+        </w:rPr>
+        <w:t>queremos</w:t>
+      </w:r>
+      <w:r>
+        <w:rPr>
+          <w:rFonts w:ascii="Arial" w:hAnsi="Arial" w:cs="Arial"/>
+        </w:rPr>
+        <w:t xml:space="preserve"> que muestre</w:t>
+      </w:r>
+    </w:p>
+    <w:p>
+      <w:pPr>
+        <w:pStyle w:val="ListParagraph"/>
+        <w:numPr>
+          <w:ilvl w:val="0"/>
+          <w:numId w:val="7"/>
+        </w:numPr>
+        <w:rPr>
+          <w:rFonts w:ascii="Arial" w:hAnsi="Arial" w:cs="Arial"/>
+        </w:rPr>
+      </w:pPr>
+      <w:r>
+        <w:rPr>
+          <w:rFonts w:ascii="Arial" w:hAnsi="Arial" w:cs="Arial"/>
+          <w:b/>
+          <w:bCs/>
+        </w:rPr>
+        <w:t>head &lt;archivo</w:t>
+      </w:r>
+      <w:r>
+        <w:rPr>
+          <w:rFonts w:ascii="Arial" w:hAnsi="Arial" w:cs="Arial"/>
+          <w:b/>
+          <w:bCs/>
+        </w:rPr>
+        <w:t>&gt;:</w:t>
+      </w:r>
+      <w:r>
+        <w:rPr>
+          <w:rFonts w:ascii="Arial" w:hAnsi="Arial" w:cs="Arial"/>
+          <w:b/>
+          <w:bCs/>
+        </w:rPr>
+        <w:t xml:space="preserve"> </w:t>
+      </w:r>
+      <w:r>
+        <w:rPr>
+          <w:rFonts w:ascii="Arial" w:hAnsi="Arial" w:cs="Arial"/>
+        </w:rPr>
+        <w:t xml:space="preserve">muestra las </w:t>
+      </w:r>
+      <w:r>
+        <w:rPr>
+          <w:rFonts w:ascii="Arial" w:hAnsi="Arial" w:cs="Arial"/>
+        </w:rPr>
+        <w:t>primeras</w:t>
+      </w:r>
+      <w:r>
+        <w:rPr>
+          <w:rFonts w:ascii="Arial" w:hAnsi="Arial" w:cs="Arial"/>
+        </w:rPr>
+        <w:t xml:space="preserve"> 10 </w:t>
+      </w:r>
+      <w:r>
+        <w:rPr>
+          <w:rFonts w:ascii="Arial" w:hAnsi="Arial" w:cs="Arial"/>
+        </w:rPr>
+        <w:t>líneas</w:t>
+      </w:r>
+      <w:r>
+        <w:rPr>
+          <w:rFonts w:ascii="Arial" w:hAnsi="Arial" w:cs="Arial"/>
+        </w:rPr>
+        <w:t xml:space="preserve"> de un archivo, igual tiene el parámetro </w:t>
+      </w:r>
+      <w:r>
+        <w:rPr>
+          <w:rFonts w:ascii="Arial" w:hAnsi="Arial" w:cs="Arial"/>
+          <w:b/>
+          <w:bCs/>
+        </w:rPr>
+        <w:t xml:space="preserve">-n </w:t>
+      </w:r>
+      <w:r>
+        <w:rPr>
+          <w:rFonts w:ascii="Arial" w:hAnsi="Arial" w:cs="Arial"/>
+        </w:rPr>
+        <w:t xml:space="preserve">que muestra las n líneas que queremos </w:t>
+      </w:r>
+    </w:p>
+    <w:p>
+      <w:pPr>
+        <w:pStyle w:val="ListParagraph"/>
+        <w:numPr>
+          <w:ilvl w:val="0"/>
+          <w:numId w:val="7"/>
+        </w:numPr>
+        <w:rPr>
+          <w:rFonts w:ascii="Arial" w:hAnsi="Arial" w:cs="Arial"/>
+        </w:rPr>
+      </w:pPr>
+      <w:proofErr w:type="spellStart"/>
+      <w:r>
+        <w:rPr>
+          <w:rFonts w:ascii="Arial" w:hAnsi="Arial" w:cs="Arial"/>
+          <w:b/>
+          <w:bCs/>
+        </w:rPr>
+        <w:t>wc</w:t>
+      </w:r>
+      <w:proofErr w:type="spellEnd"/>
+      <w:r>
+        <w:rPr>
+          <w:rFonts w:ascii="Arial" w:hAnsi="Arial" w:cs="Arial"/>
+          <w:b/>
+          <w:bCs/>
+        </w:rPr>
+        <w:t xml:space="preserve"> &lt;archivo</w:t>
+      </w:r>
+      <w:r>
+        <w:rPr>
+          <w:rFonts w:ascii="Arial" w:hAnsi="Arial" w:cs="Arial"/>
+          <w:b/>
+          <w:bCs/>
+        </w:rPr>
+        <w:t>&gt;:</w:t>
+      </w:r>
+      <w:r>
+        <w:rPr>
+          <w:rFonts w:ascii="Arial" w:hAnsi="Arial" w:cs="Arial"/>
+        </w:rPr>
+        <w:t xml:space="preserve"> </w:t>
+      </w:r>
+      <w:r>
+        <w:rPr>
+          <w:rFonts w:ascii="Arial" w:hAnsi="Arial" w:cs="Arial"/>
+        </w:rPr>
+        <w:t xml:space="preserve">muestra cuantos caracteres, </w:t>
+      </w:r>
+      <w:r>
+        <w:rPr>
+          <w:rFonts w:ascii="Arial" w:hAnsi="Arial" w:cs="Arial"/>
+        </w:rPr>
+        <w:t>líneas</w:t>
+      </w:r>
+      <w:r>
+        <w:rPr>
+          <w:rFonts w:ascii="Arial" w:hAnsi="Arial" w:cs="Arial"/>
+        </w:rPr>
+        <w:t xml:space="preserve"> y palabras tiene un archivo </w:t>
+      </w:r>
+    </w:p>
+    <w:p>
+      <w:pPr>
+        <w:pStyle w:val="ListParagraph"/>
+        <w:numPr>
+          <w:ilvl w:val="1"/>
+          <w:numId w:val="7"/>
+        </w:numPr>
+        <w:rPr>
+          <w:rFonts w:ascii="Arial" w:hAnsi="Arial" w:cs="Arial"/>
+        </w:rPr>
+      </w:pPr>
+      <w:proofErr w:type="spellStart"/>
+      <w:r>
+        <w:rPr>
+          <w:rFonts w:ascii="Arial" w:hAnsi="Arial" w:cs="Arial"/>
+          <w:b/>
+          <w:bCs/>
+        </w:rPr>
+        <w:t>wc</w:t>
+      </w:r>
+      <w:proofErr w:type="spellEnd"/>
+      <w:r>
+        <w:rPr>
+          <w:rFonts w:ascii="Arial" w:hAnsi="Arial" w:cs="Arial"/>
+          <w:b/>
+          <w:bCs/>
+        </w:rPr>
+        <w:t xml:space="preserve"> </w:t>
+      </w:r>
+      <w:r>
+        <w:rPr>
+          <w:rFonts w:ascii="Arial" w:hAnsi="Arial" w:cs="Arial"/>
+          <w:b/>
+          <w:bCs/>
+        </w:rPr>
+        <w:t>-c &lt;archivo&gt;</w:t>
+      </w:r>
+      <w:r>
+        <w:rPr>
+          <w:rFonts w:ascii="Arial" w:hAnsi="Arial" w:cs="Arial"/>
+        </w:rPr>
+        <w:t xml:space="preserve">: </w:t>
+      </w:r>
+      <w:r>
+        <w:rPr>
+          <w:rFonts w:ascii="Arial" w:hAnsi="Arial" w:cs="Arial"/>
+        </w:rPr>
+        <w:t>muestra</w:t>
+      </w:r>
+      <w:r>
+        <w:rPr>
+          <w:rFonts w:ascii="Arial" w:hAnsi="Arial" w:cs="Arial"/>
+        </w:rPr>
+        <w:t xml:space="preserve"> el total de caracteres</w:t>
+      </w:r>
+    </w:p>
+    <w:p>
+      <w:pPr>
+        <w:pStyle w:val="ListParagraph"/>
+        <w:numPr>
+          <w:ilvl w:val="1"/>
+          <w:numId w:val="7"/>
+        </w:numPr>
+        <w:rPr>
+          <w:rFonts w:ascii="Arial" w:hAnsi="Arial" w:cs="Arial"/>
+        </w:rPr>
+      </w:pPr>
+      <w:proofErr w:type="spellStart"/>
+      <w:r>
+        <w:rPr>
+          <w:rFonts w:ascii="Arial" w:hAnsi="Arial" w:cs="Arial"/>
+          <w:b/>
+          <w:bCs/>
+        </w:rPr>
+        <w:t>wc</w:t>
+      </w:r>
+      <w:proofErr w:type="spellEnd"/>
+      <w:r>
+        <w:rPr>
+          <w:rFonts w:ascii="Arial" w:hAnsi="Arial" w:cs="Arial"/>
+          <w:b/>
+          <w:bCs/>
+        </w:rPr>
+        <w:t xml:space="preserve"> -</w:t>
+      </w:r>
+      <w:r>
+        <w:rPr>
+          <w:rFonts w:ascii="Arial" w:hAnsi="Arial" w:cs="Arial"/>
+          <w:b/>
+          <w:bCs/>
+        </w:rPr>
+        <w:t>w</w:t>
+      </w:r>
+      <w:r>
+        <w:rPr>
+          <w:rFonts w:ascii="Arial" w:hAnsi="Arial" w:cs="Arial"/>
+          <w:b/>
+          <w:bCs/>
+        </w:rPr>
+        <w:t xml:space="preserve"> &lt;archivo&gt;</w:t>
+      </w:r>
+      <w:r>
+        <w:rPr>
+          <w:rFonts w:ascii="Arial" w:hAnsi="Arial" w:cs="Arial"/>
+        </w:rPr>
+        <w:t>:</w:t>
+      </w:r>
+      <w:r>
+        <w:rPr>
+          <w:rFonts w:ascii="Arial" w:hAnsi="Arial" w:cs="Arial"/>
+        </w:rPr>
+        <w:t xml:space="preserve"> </w:t>
+      </w:r>
+      <w:r>
+        <w:rPr>
+          <w:rFonts w:ascii="Arial" w:hAnsi="Arial" w:cs="Arial"/>
+        </w:rPr>
+        <w:t>muestra</w:t>
+      </w:r>
+      <w:r>
+        <w:rPr>
+          <w:rFonts w:ascii="Arial" w:hAnsi="Arial" w:cs="Arial"/>
+        </w:rPr>
+        <w:t xml:space="preserve"> el total de palabras del archivo</w:t>
+      </w:r>
+    </w:p>
+    <w:p>
+      <w:pPr>
+        <w:pStyle w:val="ListParagraph"/>
+        <w:numPr>
+          <w:ilvl w:val="1"/>
+          <w:numId w:val="7"/>
+        </w:numPr>
+        <w:rPr>
+          <w:rFonts w:ascii="Arial" w:hAnsi="Arial" w:cs="Arial"/>
+        </w:rPr>
+      </w:pPr>
+      <w:proofErr w:type="spellStart"/>
+      <w:r>
+        <w:rPr>
+          <w:rFonts w:ascii="Arial" w:hAnsi="Arial" w:cs="Arial"/>
+          <w:b/>
+          <w:bCs/>
+        </w:rPr>
+        <w:t>wc</w:t>
+      </w:r>
+      <w:proofErr w:type="spellEnd"/>
+      <w:r>
+        <w:rPr>
+          <w:rFonts w:ascii="Arial" w:hAnsi="Arial" w:cs="Arial"/>
+          <w:b/>
+          <w:bCs/>
+        </w:rPr>
+        <w:t xml:space="preserve"> -l &lt;archivo&gt;: </w:t>
+      </w:r>
+      <w:r>
+        <w:rPr>
+          <w:rFonts w:ascii="Arial" w:hAnsi="Arial" w:cs="Arial"/>
+        </w:rPr>
+        <w:t>muestra el total de líneas del archivo</w:t>
+      </w:r>
+    </w:p>
+    <w:p>
+      <w:pPr>
+        <w:pStyle w:val="ListParagraph"/>
+        <w:numPr>
+          <w:ilvl w:val="0"/>
+          <w:numId w:val="7"/>
+        </w:numPr>
+        <w:rPr>
+          <w:rFonts w:ascii="Arial" w:hAnsi="Arial" w:cs="Arial"/>
+        </w:rPr>
+      </w:pPr>
+      <w:r>
+        <w:rPr>
+          <w:rFonts w:ascii="Arial" w:hAnsi="Arial" w:cs="Arial"/>
+          <w:b/>
+          <w:bCs/>
+        </w:rPr>
+        <w:t xml:space="preserve">permisos de directorios </w:t>
+      </w:r>
+    </w:p>
+    <w:p>
+      <w:pPr>
+        <w:pStyle w:val="ListParagraph"/>
+        <w:numPr>
+          <w:ilvl w:val="1"/>
+          <w:numId w:val="7"/>
+        </w:numPr>
+        <w:rPr>
+          <w:rFonts w:ascii="Arial" w:hAnsi="Arial" w:cs="Arial"/>
+        </w:rPr>
+      </w:pPr>
+      <w:r>
+        <w:rPr>
+          <w:rFonts w:ascii="Arial" w:hAnsi="Arial" w:cs="Arial"/>
+        </w:rPr>
+        <w:t xml:space="preserve"> </w:t>
+      </w:r>
+      <w:r>
+        <w:rPr>
+          <w:rFonts w:ascii="Arial" w:hAnsi="Arial" w:cs="Arial"/>
+        </w:rPr>
+        <w:t xml:space="preserve">en </w:t>
+      </w:r>
+      <w:r>
+        <w:rPr>
+          <w:rFonts w:ascii="Arial" w:hAnsi="Arial" w:cs="Arial"/>
+        </w:rPr>
+        <w:t>Unix</w:t>
+      </w:r>
+      <w:r>
+        <w:rPr>
+          <w:rFonts w:ascii="Arial" w:hAnsi="Arial" w:cs="Arial"/>
+        </w:rPr>
+        <w:t xml:space="preserve"> el </w:t>
+      </w:r>
+      <w:r>
+        <w:rPr>
+          <w:rFonts w:ascii="Arial" w:hAnsi="Arial" w:cs="Arial"/>
+        </w:rPr>
+        <w:t>dueño</w:t>
+      </w:r>
+      <w:r>
+        <w:rPr>
+          <w:rFonts w:ascii="Arial" w:hAnsi="Arial" w:cs="Arial"/>
+        </w:rPr>
+        <w:t xml:space="preserve"> de un archivo o directorio puede restringir el acceso a ellos</w:t>
+      </w:r>
+      <w:r>
+        <w:rPr>
+          <w:rFonts w:ascii="Arial" w:hAnsi="Arial" w:cs="Arial"/>
+        </w:rPr>
+        <w:t xml:space="preserve">, donde puede limitar el acceso a lectura, escritura o ejecución </w:t>
+      </w:r>
+      <w:r>
+        <w:rPr>
+          <w:rFonts w:ascii="Arial" w:hAnsi="Arial" w:cs="Arial"/>
+        </w:rPr>
+        <w:t xml:space="preserve">para un archivo, y para un directorio limita quien puede cambiarse a x director, listar su </w:t>
+      </w:r>
+      <w:r>
+        <w:rPr>
+          <w:rFonts w:ascii="Arial" w:hAnsi="Arial" w:cs="Arial"/>
+        </w:rPr>
+        <w:t>contendió</w:t>
+      </w:r>
+      <w:r>
+        <w:rPr>
+          <w:rFonts w:ascii="Arial" w:hAnsi="Arial" w:cs="Arial"/>
+        </w:rPr>
+        <w:t xml:space="preserve">, crear o borrar archivos </w:t>
+      </w:r>
+      <w:r>
+        <w:rPr>
+          <w:rFonts w:ascii="Arial" w:hAnsi="Arial" w:cs="Arial"/>
+        </w:rPr>
+        <w:t>dentro</w:t>
+      </w:r>
+      <w:r>
+        <w:rPr>
+          <w:rFonts w:ascii="Arial" w:hAnsi="Arial" w:cs="Arial"/>
+        </w:rPr>
+        <w:t xml:space="preserve">. </w:t>
+      </w:r>
+      <w:r>
+        <w:rPr>
+          <w:rFonts w:ascii="Arial" w:hAnsi="Arial" w:cs="Arial"/>
+        </w:rPr>
+        <w:t>¿Esto como funciona?</w:t>
+      </w:r>
+    </w:p>
+    <w:p>
+      <w:pPr>
+        <w:pStyle w:val="ListParagraph"/>
+        <w:ind w:left="1440"/>
+        <w:rPr>
+          <w:rFonts w:ascii="Arial" w:hAnsi="Arial" w:cs="Arial"/>
+        </w:rPr>
+      </w:pPr>
+    </w:p>
+    <w:p>
+      <w:pPr>
+        <w:pStyle w:val="ListParagraph"/>
+        <w:ind w:left="1440"/>
+        <w:rPr>
+          <w:rFonts w:ascii="Arial" w:hAnsi="Arial" w:cs="Arial"/>
+        </w:rPr>
+      </w:pPr>
+      <w:r>
+        <w:rPr>
+          <w:rFonts w:ascii="Arial" w:hAnsi="Arial" w:cs="Arial"/>
+        </w:rPr>
+        <w:t xml:space="preserve">Con la ayuda de nuestro comando </w:t>
+      </w:r>
+      <w:proofErr w:type="spellStart"/>
+      <w:r>
+        <w:rPr>
+          <w:rFonts w:ascii="Arial" w:hAnsi="Arial" w:cs="Arial"/>
+          <w:b/>
+          <w:bCs/>
+        </w:rPr>
+        <w:t>ls</w:t>
+      </w:r>
+      <w:proofErr w:type="spellEnd"/>
+      <w:r>
+        <w:rPr>
+          <w:rFonts w:ascii="Arial" w:hAnsi="Arial" w:cs="Arial"/>
+          <w:b/>
+          <w:bCs/>
+        </w:rPr>
+        <w:t xml:space="preserve"> -l </w:t>
+      </w:r>
+      <w:r>
+        <w:rPr>
+          <w:rFonts w:ascii="Arial" w:hAnsi="Arial" w:cs="Arial"/>
+        </w:rPr>
+        <w:t xml:space="preserve">podemos ver los </w:t>
+      </w:r>
+      <w:r>
+        <w:rPr>
+          <w:rFonts w:ascii="Arial" w:hAnsi="Arial" w:cs="Arial"/>
+        </w:rPr>
+        <w:t>permisos</w:t>
+      </w:r>
+      <w:r>
+        <w:rPr>
+          <w:rFonts w:ascii="Arial" w:hAnsi="Arial" w:cs="Arial"/>
+        </w:rPr>
+        <w:t xml:space="preserve"> de cada archivo los cuales </w:t>
+      </w:r>
+      <w:r>
+        <w:rPr>
+          <w:rFonts w:ascii="Arial" w:hAnsi="Arial" w:cs="Arial"/>
+        </w:rPr>
+        <w:t>pueden</w:t>
+      </w:r>
+      <w:r>
+        <w:rPr>
+          <w:rFonts w:ascii="Arial" w:hAnsi="Arial" w:cs="Arial"/>
+        </w:rPr>
+        <w:t xml:space="preserve"> verse como: </w:t>
+      </w:r>
+    </w:p>
+    <w:p>
+      <w:pPr>
+        <w:pStyle w:val="ListParagraph"/>
+        <w:ind w:left="1440"/>
+        <w:rPr>
+          <w:rFonts w:ascii="Arial" w:hAnsi="Arial" w:cs="Arial"/>
+        </w:rPr>
+      </w:pPr>
+    </w:p>
+    <w:p>
+      <w:pPr>
+        <w:pStyle w:val="ListParagraph"/>
+        <w:ind w:left="1440"/>
+        <w:rPr>
+          <w:rFonts w:ascii="Arial" w:hAnsi="Arial" w:cs="Arial"/>
+        </w:rPr>
+      </w:pPr>
+      <w:r>
+        <w:rPr>
+          <w:rFonts w:ascii="Arial" w:hAnsi="Arial" w:cs="Arial"/>
         </w:rPr>
         <w:drawing>
-          <wp:inline distT="0" distB="0" distL="0" distR="0" wp14:anchorId="12CB68DC" wp14:editId="452A2E3D">
-            <wp:extent cx="4415790" cy="2568262"/>
-            <wp:effectExtent l="0" t="0" r="3810" b="3810"/>
-            <wp:docPr id="1" name="Picture 1"/>
+          <wp:inline distT="0" distB="0" distL="0" distR="0" wp14:anchorId="042EAD54" wp14:editId="29282544">
+            <wp:extent cx="4574540" cy="817113"/>
+            <wp:effectExtent l="0" t="0" r="0" b="2540"/>
+            <wp:docPr id="28" name="Picture 28"/>
             <wp:cNvGraphicFramePr>
               <a:graphicFrameLocks xmlns:a="http://schemas.openxmlformats.org/drawingml/2006/main" noChangeAspect="1"/>
             </wp:cNvGraphicFramePr>
@@ -425,7 +1560,7 @@
                   <pic:spPr>
                     <a:xfrm>
                       <a:off x="0" y="0"/>
-                      <a:ext cx="4432221" cy="2577818"/>
+                      <a:ext cx="4616845" cy="824670"/>
                     </a:xfrm>
                     <a:prstGeom prst="rect">
                       <a:avLst/>
@@ -441,37 +1576,312 @@
     <w:p>
       <w:pPr>
         <w:pStyle w:val="ListParagraph"/>
+        <w:ind w:left="1440"/>
+        <w:rPr>
+          <w:rFonts w:ascii="Arial" w:hAnsi="Arial" w:cs="Arial"/>
+        </w:rPr>
+      </w:pPr>
+    </w:p>
+    <w:p>
+      <w:pPr>
+        <w:pStyle w:val="ListParagraph"/>
+        <w:ind w:left="1440"/>
+        <w:rPr>
+          <w:rFonts w:ascii="Arial" w:hAnsi="Arial" w:cs="Arial"/>
+        </w:rPr>
+      </w:pPr>
+      <w:r>
+        <w:rPr>
+          <w:rFonts w:ascii="Arial" w:hAnsi="Arial" w:cs="Arial"/>
+        </w:rPr>
+        <w:t>Donde:</w:t>
+      </w:r>
+    </w:p>
+    <w:p>
+      <w:pPr>
+        <w:pStyle w:val="ListParagraph"/>
+        <w:ind w:left="1440"/>
+        <w:rPr>
+          <w:rFonts w:ascii="Arial" w:hAnsi="Arial" w:cs="Arial"/>
+        </w:rPr>
+      </w:pPr>
+      <w:r>
+        <w:rPr>
+          <w:rFonts w:ascii="Arial" w:hAnsi="Arial" w:cs="Arial"/>
+          <w:b/>
+          <w:bCs/>
+        </w:rPr>
+        <w:t xml:space="preserve">R: </w:t>
+      </w:r>
+      <w:r>
+        <w:rPr>
+          <w:rFonts w:ascii="Arial" w:hAnsi="Arial" w:cs="Arial"/>
+        </w:rPr>
+        <w:t>permiso</w:t>
+      </w:r>
+      <w:r>
+        <w:rPr>
+          <w:rFonts w:ascii="Arial" w:hAnsi="Arial" w:cs="Arial"/>
+        </w:rPr>
+        <w:t xml:space="preserve"> para lect</w:t>
+      </w:r>
+      <w:r>
+        <w:rPr>
+          <w:rFonts w:ascii="Arial" w:hAnsi="Arial" w:cs="Arial"/>
+        </w:rPr>
+        <w:t>ura</w:t>
+      </w:r>
+    </w:p>
+    <w:p>
+      <w:pPr>
+        <w:pStyle w:val="ListParagraph"/>
+        <w:ind w:left="1440"/>
+        <w:rPr>
+          <w:rFonts w:ascii="Arial" w:hAnsi="Arial" w:cs="Arial"/>
+        </w:rPr>
+      </w:pPr>
+      <w:r>
+        <w:rPr>
+          <w:rFonts w:ascii="Arial" w:hAnsi="Arial" w:cs="Arial"/>
+          <w:b/>
+          <w:bCs/>
+        </w:rPr>
+        <w:t xml:space="preserve">W: </w:t>
+      </w:r>
+      <w:r>
+        <w:rPr>
+          <w:rFonts w:ascii="Arial" w:hAnsi="Arial" w:cs="Arial"/>
+        </w:rPr>
+        <w:t>permiso</w:t>
+      </w:r>
+      <w:r>
+        <w:rPr>
+          <w:rFonts w:ascii="Arial" w:hAnsi="Arial" w:cs="Arial"/>
+        </w:rPr>
+        <w:t xml:space="preserve"> para escritura</w:t>
+      </w:r>
+    </w:p>
+    <w:p>
+      <w:pPr>
+        <w:pStyle w:val="ListParagraph"/>
+        <w:ind w:left="1440"/>
+        <w:rPr>
+          <w:rFonts w:ascii="Arial" w:hAnsi="Arial" w:cs="Arial"/>
+        </w:rPr>
+      </w:pPr>
+      <w:r>
+        <w:rPr>
+          <w:rFonts w:ascii="Arial" w:hAnsi="Arial" w:cs="Arial"/>
+          <w:b/>
+          <w:bCs/>
+        </w:rPr>
+        <w:t xml:space="preserve">X: </w:t>
+      </w:r>
+      <w:r>
+        <w:rPr>
+          <w:rFonts w:ascii="Arial" w:hAnsi="Arial" w:cs="Arial"/>
+        </w:rPr>
+        <w:t>permiso</w:t>
+      </w:r>
+      <w:r>
+        <w:rPr>
+          <w:rFonts w:ascii="Arial" w:hAnsi="Arial" w:cs="Arial"/>
+        </w:rPr>
+        <w:t xml:space="preserve"> para ejecución</w:t>
+      </w:r>
+    </w:p>
+    <w:p>
+      <w:pPr>
+        <w:pStyle w:val="ListParagraph"/>
+        <w:ind w:left="1440"/>
+        <w:rPr>
+          <w:rFonts w:ascii="Arial" w:hAnsi="Arial" w:cs="Arial"/>
+        </w:rPr>
+      </w:pPr>
+      <w:r>
+        <w:rPr>
+          <w:rFonts w:ascii="Arial" w:hAnsi="Arial" w:cs="Arial"/>
+          <w:b/>
+          <w:bCs/>
+        </w:rPr>
+        <w:lastRenderedPageBreak/>
+        <w:t>-:</w:t>
+      </w:r>
+      <w:r>
+        <w:rPr>
+          <w:rFonts w:ascii="Arial" w:hAnsi="Arial" w:cs="Arial"/>
+          <w:b/>
+          <w:bCs/>
+        </w:rPr>
+        <w:t xml:space="preserve"> </w:t>
+      </w:r>
+      <w:r>
+        <w:rPr>
+          <w:rFonts w:ascii="Arial" w:hAnsi="Arial" w:cs="Arial"/>
+        </w:rPr>
+        <w:t xml:space="preserve">permiso denegado </w:t>
+      </w:r>
+    </w:p>
+    <w:p>
+      <w:pPr>
+        <w:rPr>
+          <w:rFonts w:ascii="Arial" w:hAnsi="Arial" w:cs="Arial"/>
+          <w:b/>
+          <w:bCs/>
+        </w:rPr>
+      </w:pPr>
+    </w:p>
+    <w:p>
+      <w:pPr>
+        <w:pStyle w:val="ListParagraph"/>
         <w:numPr>
           <w:ilvl w:val="0"/>
-          <w:numId w:val="6"/>
+          <w:numId w:val="7"/>
         </w:numPr>
         <w:rPr>
           <w:rFonts w:ascii="Arial" w:hAnsi="Arial" w:cs="Arial"/>
-        </w:rPr>
-      </w:pPr>
-      <w:r>
-        <w:rPr>
-          <w:rFonts w:ascii="Arial" w:hAnsi="Arial" w:cs="Arial"/>
-        </w:rPr>
-        <w:t>Copie el archivo segundo (está en el mismo directorio) home directory.</w:t>
-      </w:r>
-    </w:p>
-    <w:p>
-      <w:pPr>
-        <w:rPr>
-          <w:rFonts w:ascii="Arial" w:hAnsi="Arial" w:cs="Arial"/>
-        </w:rPr>
-      </w:pPr>
-      <w:r>
-        <w:rPr>
-          <w:rFonts w:ascii="Arial" w:hAnsi="Arial" w:cs="Arial"/>
-          <w:noProof/>
+          <w:b/>
+          <w:bCs/>
+        </w:rPr>
+      </w:pPr>
+      <w:proofErr w:type="spellStart"/>
+      <w:r>
+        <w:rPr>
+          <w:rFonts w:ascii="Arial" w:hAnsi="Arial" w:cs="Arial"/>
+          <w:b/>
+          <w:bCs/>
+        </w:rPr>
+        <w:t>Chmod</w:t>
+      </w:r>
+      <w:proofErr w:type="spellEnd"/>
+      <w:r>
+        <w:rPr>
+          <w:rFonts w:ascii="Arial" w:hAnsi="Arial" w:cs="Arial"/>
+          <w:b/>
+          <w:bCs/>
+        </w:rPr>
+        <w:t xml:space="preserve"> &lt;modo&gt; &lt;archivo</w:t>
+      </w:r>
+      <w:r>
+        <w:rPr>
+          <w:rFonts w:ascii="Arial" w:hAnsi="Arial" w:cs="Arial"/>
+          <w:b/>
+          <w:bCs/>
+        </w:rPr>
+        <w:t>&gt;:</w:t>
+      </w:r>
+      <w:r>
+        <w:rPr>
+          <w:rFonts w:ascii="Arial" w:hAnsi="Arial" w:cs="Arial"/>
+          <w:b/>
+          <w:bCs/>
+        </w:rPr>
+        <w:t xml:space="preserve"> </w:t>
+      </w:r>
+      <w:r>
+        <w:rPr>
+          <w:rFonts w:ascii="Arial" w:hAnsi="Arial" w:cs="Arial"/>
+          <w:b/>
+          <w:bCs/>
+        </w:rPr>
+        <w:t xml:space="preserve"> </w:t>
+      </w:r>
+      <w:r>
+        <w:rPr>
+          <w:rFonts w:ascii="Arial" w:hAnsi="Arial" w:cs="Arial"/>
+        </w:rPr>
+        <w:t xml:space="preserve">comando que cambia los permisos den los archivos puede ser mediante el </w:t>
+      </w:r>
+      <w:r>
+        <w:rPr>
+          <w:rFonts w:ascii="Arial" w:hAnsi="Arial" w:cs="Arial"/>
+          <w:b/>
+          <w:bCs/>
+        </w:rPr>
+        <w:t xml:space="preserve">método absoluto </w:t>
+      </w:r>
+      <w:r>
+        <w:rPr>
+          <w:rFonts w:ascii="Arial" w:hAnsi="Arial" w:cs="Arial"/>
+        </w:rPr>
+        <w:t xml:space="preserve">o el </w:t>
+      </w:r>
+      <w:r>
+        <w:rPr>
+          <w:rFonts w:ascii="Arial" w:hAnsi="Arial" w:cs="Arial"/>
+          <w:b/>
+          <w:bCs/>
+        </w:rPr>
+        <w:t>método simbólico</w:t>
+      </w:r>
+    </w:p>
+    <w:p>
+      <w:pPr>
+        <w:pStyle w:val="ListParagraph"/>
+        <w:numPr>
+          <w:ilvl w:val="1"/>
+          <w:numId w:val="7"/>
+        </w:numPr>
+        <w:rPr>
+          <w:rFonts w:ascii="Arial" w:hAnsi="Arial" w:cs="Arial"/>
+          <w:b/>
+          <w:bCs/>
+        </w:rPr>
+      </w:pPr>
+      <w:r>
+        <w:rPr>
+          <w:rFonts w:ascii="Arial" w:hAnsi="Arial" w:cs="Arial"/>
+          <w:b/>
+          <w:bCs/>
+        </w:rPr>
+        <w:t xml:space="preserve">Método absoluto: </w:t>
+      </w:r>
+      <w:r>
+        <w:rPr>
+          <w:rFonts w:ascii="Arial" w:hAnsi="Arial" w:cs="Arial"/>
+        </w:rPr>
+        <w:t xml:space="preserve">es el método donde se usa un numero octal de 3 </w:t>
+      </w:r>
+      <w:r>
+        <w:rPr>
+          <w:rFonts w:ascii="Arial" w:hAnsi="Arial" w:cs="Arial"/>
+        </w:rPr>
+        <w:t>dígitos</w:t>
+      </w:r>
+      <w:r>
+        <w:rPr>
+          <w:rFonts w:ascii="Arial" w:hAnsi="Arial" w:cs="Arial"/>
+        </w:rPr>
+        <w:t xml:space="preserve"> para almacenar los permisos </w:t>
+      </w:r>
+      <w:r>
+        <w:rPr>
+          <w:rFonts w:ascii="Arial" w:hAnsi="Arial" w:cs="Arial"/>
+        </w:rPr>
+        <w:t>donde cada permiso recibe el siguiente valor:</w:t>
+      </w:r>
+    </w:p>
+    <w:p>
+      <w:pPr>
+        <w:pStyle w:val="ListParagraph"/>
+        <w:ind w:left="1440"/>
+        <w:rPr>
+          <w:rFonts w:ascii="Arial" w:hAnsi="Arial" w:cs="Arial"/>
+          <w:b/>
+          <w:bCs/>
+        </w:rPr>
+      </w:pPr>
+      <w:r>
+        <w:rPr>
+          <w:rFonts w:ascii="Arial" w:hAnsi="Arial" w:cs="Arial"/>
+          <w:b/>
+          <w:bCs/>
         </w:rPr>
         <w:drawing>
-          <wp:inline distT="0" distB="0" distL="0" distR="0" wp14:anchorId="55823754" wp14:editId="169CE1A7">
-            <wp:extent cx="5400040" cy="3140710"/>
-            <wp:effectExtent l="0" t="0" r="0" b="2540"/>
-            <wp:docPr id="5" name="Picture 5"/>
+          <wp:inline distT="0" distB="0" distL="0" distR="0" wp14:anchorId="488C61D9" wp14:editId="4C928F02">
+            <wp:extent cx="2715004" cy="771633"/>
+            <wp:effectExtent l="0" t="0" r="0" b="9525"/>
+            <wp:docPr id="29" name="Picture 29"/>
             <wp:cNvGraphicFramePr>
               <a:graphicFrameLocks xmlns:a="http://schemas.openxmlformats.org/drawingml/2006/main" noChangeAspect="1"/>
             </wp:cNvGraphicFramePr>
@@ -491,7 +1901,7 @@
                   <pic:spPr>
                     <a:xfrm>
                       <a:off x="0" y="0"/>
-                      <a:ext cx="5400040" cy="3140710"/>
+                      <a:ext cx="2715004" cy="771633"/>
                     </a:xfrm>
                     <a:prstGeom prst="rect">
                       <a:avLst/>
@@ -506,45 +1916,171 @@
     </w:p>
     <w:p>
       <w:pPr>
-        <w:rPr>
-          <w:rFonts w:ascii="Arial" w:hAnsi="Arial" w:cs="Arial"/>
-        </w:rPr>
-      </w:pPr>
-    </w:p>
-    <w:p>
-      <w:pPr>
-        <w:rPr>
-          <w:rFonts w:ascii="Arial" w:hAnsi="Arial" w:cs="Arial"/>
-        </w:rPr>
-      </w:pPr>
-    </w:p>
-    <w:p>
-      <w:pPr>
-        <w:rPr>
-          <w:rFonts w:ascii="Arial" w:hAnsi="Arial" w:cs="Arial"/>
-        </w:rPr>
-      </w:pPr>
-    </w:p>
-    <w:p>
-      <w:pPr>
-        <w:rPr>
-          <w:rFonts w:ascii="Arial" w:hAnsi="Arial" w:cs="Arial"/>
-        </w:rPr>
-      </w:pPr>
-    </w:p>
-    <w:p>
-      <w:pPr>
-        <w:rPr>
-          <w:rFonts w:ascii="Arial" w:hAnsi="Arial" w:cs="Arial"/>
-        </w:rPr>
-      </w:pPr>
-    </w:p>
-    <w:p>
-      <w:pPr>
-        <w:rPr>
-          <w:rFonts w:ascii="Arial" w:hAnsi="Arial" w:cs="Arial"/>
-        </w:rPr>
-      </w:pPr>
+        <w:pStyle w:val="ListParagraph"/>
+        <w:ind w:left="1440"/>
+        <w:rPr>
+          <w:rFonts w:ascii="Arial" w:hAnsi="Arial" w:cs="Arial"/>
+          <w:b/>
+          <w:bCs/>
+        </w:rPr>
+      </w:pPr>
+    </w:p>
+    <w:p>
+      <w:pPr>
+        <w:pStyle w:val="ListParagraph"/>
+        <w:ind w:left="1440"/>
+        <w:rPr>
+          <w:rFonts w:ascii="Arial" w:hAnsi="Arial" w:cs="Arial"/>
+        </w:rPr>
+      </w:pPr>
+      <w:r>
+        <w:rPr>
+          <w:rFonts w:ascii="Arial" w:hAnsi="Arial" w:cs="Arial"/>
+        </w:rPr>
+        <w:t>para usar este método tiene un orden donde de izquierda a derecha &lt;</w:t>
+      </w:r>
+      <w:r>
+        <w:rPr>
+          <w:rFonts w:ascii="Arial" w:hAnsi="Arial" w:cs="Arial"/>
+          <w:b/>
+          <w:bCs/>
+        </w:rPr>
+        <w:t>dueño</w:t>
+      </w:r>
+      <w:r>
+        <w:rPr>
+          <w:rFonts w:ascii="Arial" w:hAnsi="Arial" w:cs="Arial"/>
+          <w:b/>
+          <w:bCs/>
+        </w:rPr>
+        <w:t xml:space="preserve"> – grupo - otros</w:t>
+      </w:r>
+      <w:r>
+        <w:rPr>
+          <w:rFonts w:ascii="Arial" w:hAnsi="Arial" w:cs="Arial"/>
+        </w:rPr>
+        <w:t>&gt;</w:t>
+      </w:r>
+      <w:r>
+        <w:rPr>
+          <w:rFonts w:ascii="Arial" w:hAnsi="Arial" w:cs="Arial"/>
+        </w:rPr>
+        <w:t xml:space="preserve"> </w:t>
+      </w:r>
+      <w:r>
+        <w:rPr>
+          <w:rFonts w:ascii="Arial" w:hAnsi="Arial" w:cs="Arial"/>
+        </w:rPr>
+        <w:t xml:space="preserve">se suman los pesos a los permisos que se </w:t>
+      </w:r>
+      <w:r>
+        <w:rPr>
+          <w:rFonts w:ascii="Arial" w:hAnsi="Arial" w:cs="Arial"/>
+        </w:rPr>
+        <w:t>desea</w:t>
+      </w:r>
+      <w:r>
+        <w:rPr>
+          <w:rFonts w:ascii="Arial" w:hAnsi="Arial" w:cs="Arial"/>
+        </w:rPr>
+        <w:t xml:space="preserve"> dar a cada grupo </w:t>
+      </w:r>
+    </w:p>
+    <w:p>
+      <w:pPr>
+        <w:pStyle w:val="ListParagraph"/>
+        <w:numPr>
+          <w:ilvl w:val="1"/>
+          <w:numId w:val="7"/>
+        </w:numPr>
+        <w:rPr>
+          <w:rFonts w:ascii="Arial" w:hAnsi="Arial" w:cs="Arial"/>
+        </w:rPr>
+      </w:pPr>
+      <w:r>
+        <w:rPr>
+          <w:rFonts w:ascii="Arial" w:hAnsi="Arial" w:cs="Arial"/>
+          <w:b/>
+          <w:bCs/>
+        </w:rPr>
+        <w:t xml:space="preserve">Método simbólico: </w:t>
+      </w:r>
+      <w:r>
+        <w:rPr>
+          <w:rFonts w:ascii="Arial" w:hAnsi="Arial" w:cs="Arial"/>
+        </w:rPr>
+        <w:t xml:space="preserve">es este método se utilizan símbolos para </w:t>
+      </w:r>
+      <w:r>
+        <w:rPr>
+          <w:rFonts w:ascii="Arial" w:hAnsi="Arial" w:cs="Arial"/>
+        </w:rPr>
+        <w:t xml:space="preserve">establecer categoría y permisos, usando &lt; </w:t>
+      </w:r>
+      <w:r>
+        <w:rPr>
+          <w:rFonts w:ascii="Arial" w:hAnsi="Arial" w:cs="Arial"/>
+          <w:b/>
+          <w:bCs/>
+        </w:rPr>
+        <w:t xml:space="preserve">+ &gt; </w:t>
+      </w:r>
+      <w:r>
+        <w:rPr>
+          <w:rFonts w:ascii="Arial" w:hAnsi="Arial" w:cs="Arial"/>
+        </w:rPr>
+        <w:t xml:space="preserve">para dar permisos y </w:t>
+      </w:r>
+      <w:r>
+        <w:rPr>
+          <w:rFonts w:ascii="Arial" w:hAnsi="Arial" w:cs="Arial"/>
+        </w:rPr>
+        <w:softHyphen/>
+      </w:r>
+      <w:r>
+        <w:rPr>
+          <w:rFonts w:ascii="Arial" w:hAnsi="Arial" w:cs="Arial"/>
+        </w:rPr>
+        <w:t xml:space="preserve">&lt; </w:t>
+      </w:r>
+      <w:r>
+        <w:rPr>
+          <w:rFonts w:ascii="Arial" w:hAnsi="Arial" w:cs="Arial"/>
+          <w:b/>
+          <w:bCs/>
+        </w:rPr>
+        <w:t xml:space="preserve">- </w:t>
+      </w:r>
+      <w:r>
+        <w:rPr>
+          <w:rFonts w:ascii="Arial" w:hAnsi="Arial" w:cs="Arial"/>
+        </w:rPr>
+        <w:t>&gt;</w:t>
+      </w:r>
+      <w:r>
+        <w:rPr>
+          <w:rFonts w:ascii="Arial" w:hAnsi="Arial" w:cs="Arial"/>
+        </w:rPr>
+        <w:t xml:space="preserve"> para quitar </w:t>
+      </w:r>
+      <w:r>
+        <w:rPr>
+          <w:rFonts w:ascii="Arial" w:hAnsi="Arial" w:cs="Arial"/>
+        </w:rPr>
+        <w:t>permisos</w:t>
+      </w:r>
+      <w:r>
+        <w:rPr>
+          <w:rFonts w:ascii="Arial" w:hAnsi="Arial" w:cs="Arial"/>
+        </w:rPr>
+        <w:t xml:space="preserve">. </w:t>
+      </w:r>
+      <w:r>
+        <w:rPr>
+          <w:rFonts w:ascii="Arial" w:hAnsi="Arial" w:cs="Arial"/>
+        </w:rPr>
+        <w:t xml:space="preserve"> </w:t>
+      </w:r>
     </w:p>
     <w:p>
       <w:pPr>
@@ -561,22 +2097,30 @@
         <w:rPr>
           <w:rFonts w:ascii="Arial" w:hAnsi="Arial" w:cs="Arial"/>
         </w:rPr>
-        <w:lastRenderedPageBreak/>
-        <w:t>Copie el archivo intermedio de /home/sist20232/lety/filtros</w:t>
-      </w:r>
-      <w:r>
-        <w:rPr>
-          <w:rFonts w:ascii="Arial" w:hAnsi="Arial" w:cs="Arial"/>
-        </w:rPr>
-        <w:t xml:space="preserve"> </w:t>
-      </w:r>
-      <w:r>
-        <w:rPr>
-          <w:rFonts w:ascii="Arial" w:hAnsi="Arial" w:cs="Arial"/>
-          <w:lang w:val="en-US"/>
-        </w:rPr>
-        <w:t>a home directory</w:t>
-      </w:r>
+        <w:t>Copie el archivo primero que está dentro de /home/sist20232/</w:t>
+      </w:r>
+      <w:proofErr w:type="spellStart"/>
+      <w:r>
+        <w:rPr>
+          <w:rFonts w:ascii="Arial" w:hAnsi="Arial" w:cs="Arial"/>
+        </w:rPr>
+        <w:t>lety</w:t>
+      </w:r>
+      <w:proofErr w:type="spellEnd"/>
+      <w:r>
+        <w:rPr>
+          <w:rFonts w:ascii="Arial" w:hAnsi="Arial" w:cs="Arial"/>
+        </w:rPr>
+        <w:t xml:space="preserve">/filtros a su home </w:t>
+      </w:r>
+      <w:proofErr w:type="spellStart"/>
+      <w:r>
+        <w:rPr>
+          <w:rFonts w:ascii="Arial" w:hAnsi="Arial" w:cs="Arial"/>
+        </w:rPr>
+        <w:t>directory</w:t>
+      </w:r>
+      <w:proofErr w:type="spellEnd"/>
     </w:p>
     <w:p>
       <w:pPr>
@@ -590,10 +2134,10 @@
           <w:noProof/>
         </w:rPr>
         <w:drawing>
-          <wp:inline distT="0" distB="0" distL="0" distR="0" wp14:anchorId="29329ED1" wp14:editId="4FADC3C8">
-            <wp:extent cx="5400040" cy="3140710"/>
-            <wp:effectExtent l="0" t="0" r="0" b="2540"/>
-            <wp:docPr id="9" name="Picture 9"/>
+          <wp:inline distT="0" distB="0" distL="0" distR="0" wp14:anchorId="12CB68DC" wp14:editId="452A2E3D">
+            <wp:extent cx="4415790" cy="2568262"/>
+            <wp:effectExtent l="0" t="0" r="3810" b="3810"/>
+            <wp:docPr id="1" name="Picture 1"/>
             <wp:cNvGraphicFramePr>
               <a:graphicFrameLocks xmlns:a="http://schemas.openxmlformats.org/drawingml/2006/main" noChangeAspect="1"/>
             </wp:cNvGraphicFramePr>
@@ -613,7 +2157,7 @@
                   <pic:spPr>
                     <a:xfrm>
                       <a:off x="0" y="0"/>
-                      <a:ext cx="5400040" cy="3140710"/>
+                      <a:ext cx="4432221" cy="2577818"/>
                     </a:xfrm>
                     <a:prstGeom prst="rect">
                       <a:avLst/>
@@ -641,7 +2185,21 @@
         <w:rPr>
           <w:rFonts w:ascii="Arial" w:hAnsi="Arial" w:cs="Arial"/>
         </w:rPr>
-        <w:t>Verifique el contenido de los tres archivos.</w:t>
+        <w:t xml:space="preserve">Copie el archivo segundo (está en el mismo directorio) home </w:t>
+      </w:r>
+      <w:proofErr w:type="spellStart"/>
+      <w:r>
+        <w:rPr>
+          <w:rFonts w:ascii="Arial" w:hAnsi="Arial" w:cs="Arial"/>
+        </w:rPr>
+        <w:t>directory</w:t>
+      </w:r>
+      <w:proofErr w:type="spellEnd"/>
+      <w:r>
+        <w:rPr>
+          <w:rFonts w:ascii="Arial" w:hAnsi="Arial" w:cs="Arial"/>
+        </w:rPr>
+        <w:t>.</w:t>
       </w:r>
     </w:p>
     <w:p>
@@ -655,11 +2213,12 @@
           <w:rFonts w:ascii="Arial" w:hAnsi="Arial" w:cs="Arial"/>
           <w:noProof/>
         </w:rPr>
+        <w:lastRenderedPageBreak/>
         <w:drawing>
-          <wp:inline distT="0" distB="0" distL="0" distR="0" wp14:anchorId="6CAF3030" wp14:editId="2CDD0AF8">
+          <wp:inline distT="0" distB="0" distL="0" distR="0" wp14:anchorId="55823754" wp14:editId="169CE1A7">
             <wp:extent cx="5400040" cy="3140710"/>
             <wp:effectExtent l="0" t="0" r="0" b="2540"/>
-            <wp:docPr id="21" name="Picture 21"/>
+            <wp:docPr id="5" name="Picture 5"/>
             <wp:cNvGraphicFramePr>
               <a:graphicFrameLocks xmlns:a="http://schemas.openxmlformats.org/drawingml/2006/main" noChangeAspect="1"/>
             </wp:cNvGraphicFramePr>
@@ -729,6 +2288,13 @@
     </w:p>
     <w:p>
       <w:pPr>
+        <w:rPr>
+          <w:rFonts w:ascii="Arial" w:hAnsi="Arial" w:cs="Arial"/>
+        </w:rPr>
+      </w:pPr>
+    </w:p>
+    <w:p>
+      <w:pPr>
         <w:pStyle w:val="ListParagraph"/>
         <w:numPr>
           <w:ilvl w:val="0"/>
@@ -742,8 +2308,34 @@
         <w:rPr>
           <w:rFonts w:ascii="Arial" w:hAnsi="Arial" w:cs="Arial"/>
         </w:rPr>
-        <w:lastRenderedPageBreak/>
-        <w:t>Borre los tres archivos copiados en los pasos 2, 3 y 4.</w:t>
+        <w:t>Copie el archivo intermedio de /home/sist20232/</w:t>
+      </w:r>
+      <w:proofErr w:type="spellStart"/>
+      <w:r>
+        <w:rPr>
+          <w:rFonts w:ascii="Arial" w:hAnsi="Arial" w:cs="Arial"/>
+        </w:rPr>
+        <w:t>lety</w:t>
+      </w:r>
+      <w:proofErr w:type="spellEnd"/>
+      <w:r>
+        <w:rPr>
+          <w:rFonts w:ascii="Arial" w:hAnsi="Arial" w:cs="Arial"/>
+        </w:rPr>
+        <w:t>/filtros</w:t>
+      </w:r>
+      <w:r>
+        <w:rPr>
+          <w:rFonts w:ascii="Arial" w:hAnsi="Arial" w:cs="Arial"/>
+        </w:rPr>
+        <w:t xml:space="preserve"> </w:t>
+      </w:r>
+      <w:r>
+        <w:rPr>
+          <w:rFonts w:ascii="Arial" w:hAnsi="Arial" w:cs="Arial"/>
+          <w:lang w:val="en-US"/>
+        </w:rPr>
+        <w:t>a home directory</w:t>
       </w:r>
     </w:p>
     <w:p>
@@ -758,10 +2350,10 @@
           <w:noProof/>
         </w:rPr>
         <w:drawing>
-          <wp:inline distT="0" distB="0" distL="0" distR="0" wp14:anchorId="2C5FF15D" wp14:editId="37484283">
+          <wp:inline distT="0" distB="0" distL="0" distR="0" wp14:anchorId="29329ED1" wp14:editId="4FADC3C8">
             <wp:extent cx="5400040" cy="3140710"/>
             <wp:effectExtent l="0" t="0" r="0" b="2540"/>
-            <wp:docPr id="22" name="Picture 22"/>
+            <wp:docPr id="9" name="Picture 9"/>
             <wp:cNvGraphicFramePr>
               <a:graphicFrameLocks xmlns:a="http://schemas.openxmlformats.org/drawingml/2006/main" noChangeAspect="1"/>
             </wp:cNvGraphicFramePr>
@@ -809,7 +2401,8 @@
         <w:rPr>
           <w:rFonts w:ascii="Arial" w:hAnsi="Arial" w:cs="Arial"/>
         </w:rPr>
-        <w:t>Copie los tres archivos (primero,segundo e intermedio) utilizando una sola instrucción</w:t>
+        <w:lastRenderedPageBreak/>
+        <w:t>Verifique el contenido de los tres archivos.</w:t>
       </w:r>
     </w:p>
     <w:p>
@@ -824,10 +2417,10 @@
           <w:noProof/>
         </w:rPr>
         <w:drawing>
-          <wp:inline distT="0" distB="0" distL="0" distR="0" wp14:anchorId="0A1B9897" wp14:editId="19EAB5AA">
+          <wp:inline distT="0" distB="0" distL="0" distR="0" wp14:anchorId="6CAF3030" wp14:editId="2CDD0AF8">
             <wp:extent cx="5400040" cy="3140710"/>
             <wp:effectExtent l="0" t="0" r="0" b="2540"/>
-            <wp:docPr id="23" name="Picture 23"/>
+            <wp:docPr id="21" name="Picture 21"/>
             <wp:cNvGraphicFramePr>
               <a:graphicFrameLocks xmlns:a="http://schemas.openxmlformats.org/drawingml/2006/main" noChangeAspect="1"/>
             </wp:cNvGraphicFramePr>
@@ -862,6 +2455,41 @@
     </w:p>
     <w:p>
       <w:pPr>
+        <w:rPr>
+          <w:rFonts w:ascii="Arial" w:hAnsi="Arial" w:cs="Arial"/>
+        </w:rPr>
+      </w:pPr>
+    </w:p>
+    <w:p>
+      <w:pPr>
+        <w:rPr>
+          <w:rFonts w:ascii="Arial" w:hAnsi="Arial" w:cs="Arial"/>
+        </w:rPr>
+      </w:pPr>
+    </w:p>
+    <w:p>
+      <w:pPr>
+        <w:rPr>
+          <w:rFonts w:ascii="Arial" w:hAnsi="Arial" w:cs="Arial"/>
+        </w:rPr>
+      </w:pPr>
+    </w:p>
+    <w:p>
+      <w:pPr>
+        <w:rPr>
+          <w:rFonts w:ascii="Arial" w:hAnsi="Arial" w:cs="Arial"/>
+        </w:rPr>
+      </w:pPr>
+    </w:p>
+    <w:p>
+      <w:pPr>
+        <w:rPr>
+          <w:rFonts w:ascii="Arial" w:hAnsi="Arial" w:cs="Arial"/>
+        </w:rPr>
+      </w:pPr>
+    </w:p>
+    <w:p>
+      <w:pPr>
         <w:pStyle w:val="ListParagraph"/>
         <w:numPr>
           <w:ilvl w:val="0"/>
@@ -875,12 +2503,11 @@
         <w:rPr>
           <w:rFonts w:ascii="Arial" w:hAnsi="Arial" w:cs="Arial"/>
         </w:rPr>
-        <w:t>Muestre en pantalla el contenido de segundo e intermedio usando una sola línea.</w:t>
-      </w:r>
-    </w:p>
-    <w:p>
-      <w:pPr>
-        <w:ind w:left="360"/>
+        <w:t>Borre los tres archivos copiados en los pasos 2, 3 y 4.</w:t>
+      </w:r>
+    </w:p>
+    <w:p>
+      <w:pPr>
         <w:rPr>
           <w:rFonts w:ascii="Arial" w:hAnsi="Arial" w:cs="Arial"/>
         </w:rPr>
@@ -890,12 +2517,11 @@
           <w:rFonts w:ascii="Arial" w:hAnsi="Arial" w:cs="Arial"/>
           <w:noProof/>
         </w:rPr>
-        <w:lastRenderedPageBreak/>
         <w:drawing>
-          <wp:inline distT="0" distB="0" distL="0" distR="0" wp14:anchorId="577F7FFF" wp14:editId="61E43732">
-            <wp:extent cx="5400040" cy="3686175"/>
-            <wp:effectExtent l="0" t="0" r="0" b="9525"/>
-            <wp:docPr id="24" name="Picture 24"/>
+          <wp:inline distT="0" distB="0" distL="0" distR="0" wp14:anchorId="2C5FF15D" wp14:editId="37484283">
+            <wp:extent cx="5400040" cy="3140710"/>
+            <wp:effectExtent l="0" t="0" r="0" b="2540"/>
+            <wp:docPr id="22" name="Picture 22"/>
             <wp:cNvGraphicFramePr>
               <a:graphicFrameLocks xmlns:a="http://schemas.openxmlformats.org/drawingml/2006/main" noChangeAspect="1"/>
             </wp:cNvGraphicFramePr>
@@ -915,7 +2541,7 @@
                   <pic:spPr>
                     <a:xfrm>
                       <a:off x="0" y="0"/>
-                      <a:ext cx="5400040" cy="3686175"/>
+                      <a:ext cx="5400040" cy="3140710"/>
                     </a:xfrm>
                     <a:prstGeom prst="rect">
                       <a:avLst/>
@@ -930,7 +2556,41 @@
     </w:p>
     <w:p>
       <w:pPr>
-        <w:ind w:left="360"/>
+        <w:pStyle w:val="ListParagraph"/>
+        <w:numPr>
+          <w:ilvl w:val="0"/>
+          <w:numId w:val="6"/>
+        </w:numPr>
+        <w:rPr>
+          <w:rFonts w:ascii="Arial" w:hAnsi="Arial" w:cs="Arial"/>
+        </w:rPr>
+      </w:pPr>
+      <w:r>
+        <w:rPr>
+          <w:rFonts w:ascii="Arial" w:hAnsi="Arial" w:cs="Arial"/>
+        </w:rPr>
+        <w:lastRenderedPageBreak/>
+        <w:t>Copie los tres archivos (</w:t>
+      </w:r>
+      <w:proofErr w:type="spellStart"/>
+      <w:proofErr w:type="gramStart"/>
+      <w:r>
+        <w:rPr>
+          <w:rFonts w:ascii="Arial" w:hAnsi="Arial" w:cs="Arial"/>
+        </w:rPr>
+        <w:t>primero,segundo</w:t>
+      </w:r>
+      <w:proofErr w:type="spellEnd"/>
+      <w:proofErr w:type="gramEnd"/>
+      <w:r>
+        <w:rPr>
+          <w:rFonts w:ascii="Arial" w:hAnsi="Arial" w:cs="Arial"/>
+        </w:rPr>
+        <w:t xml:space="preserve"> e intermedio) utilizando una sola instrucción</w:t>
+      </w:r>
+    </w:p>
+    <w:p>
+      <w:pPr>
         <w:rPr>
           <w:rFonts w:ascii="Arial" w:hAnsi="Arial" w:cs="Arial"/>
         </w:rPr>
@@ -941,10 +2601,10 @@
           <w:noProof/>
         </w:rPr>
         <w:drawing>
-          <wp:inline distT="0" distB="0" distL="0" distR="0" wp14:anchorId="0AA03E4B" wp14:editId="0210249C">
-            <wp:extent cx="5400040" cy="3686175"/>
-            <wp:effectExtent l="0" t="0" r="0" b="9525"/>
-            <wp:docPr id="25" name="Picture 25"/>
+          <wp:inline distT="0" distB="0" distL="0" distR="0" wp14:anchorId="0A1B9897" wp14:editId="19EAB5AA">
+            <wp:extent cx="5400040" cy="3140710"/>
+            <wp:effectExtent l="0" t="0" r="0" b="2540"/>
+            <wp:docPr id="23" name="Picture 23"/>
             <wp:cNvGraphicFramePr>
               <a:graphicFrameLocks xmlns:a="http://schemas.openxmlformats.org/drawingml/2006/main" noChangeAspect="1"/>
             </wp:cNvGraphicFramePr>
@@ -964,7 +2624,7 @@
                   <pic:spPr>
                     <a:xfrm>
                       <a:off x="0" y="0"/>
-                      <a:ext cx="5400040" cy="3686175"/>
+                      <a:ext cx="5400040" cy="3140710"/>
                     </a:xfrm>
                     <a:prstGeom prst="rect">
                       <a:avLst/>
@@ -979,31 +2639,27 @@
     </w:p>
     <w:p>
       <w:pPr>
-        <w:ind w:left="360"/>
-        <w:rPr>
-          <w:rFonts w:ascii="Arial" w:hAnsi="Arial" w:cs="Arial"/>
-        </w:rPr>
-      </w:pPr>
-    </w:p>
-    <w:p>
-      <w:pPr>
-        <w:ind w:left="360"/>
-        <w:rPr>
-          <w:rFonts w:ascii="Arial" w:hAnsi="Arial" w:cs="Arial"/>
-        </w:rPr>
-      </w:pPr>
-    </w:p>
-    <w:p>
-      <w:pPr>
-        <w:ind w:left="360"/>
-        <w:rPr>
-          <w:rFonts w:ascii="Arial" w:hAnsi="Arial" w:cs="Arial"/>
-        </w:rPr>
-      </w:pPr>
-    </w:p>
-    <w:p>
-      <w:pPr>
-        <w:ind w:left="360"/>
+        <w:rPr>
+          <w:rFonts w:ascii="Arial" w:hAnsi="Arial" w:cs="Arial"/>
+        </w:rPr>
+      </w:pPr>
+    </w:p>
+    <w:p>
+      <w:pPr>
+        <w:rPr>
+          <w:rFonts w:ascii="Arial" w:hAnsi="Arial" w:cs="Arial"/>
+        </w:rPr>
+      </w:pPr>
+    </w:p>
+    <w:p>
+      <w:pPr>
+        <w:rPr>
+          <w:rFonts w:ascii="Arial" w:hAnsi="Arial" w:cs="Arial"/>
+        </w:rPr>
+      </w:pPr>
+    </w:p>
+    <w:p>
+      <w:pPr>
         <w:rPr>
           <w:rFonts w:ascii="Arial" w:hAnsi="Arial" w:cs="Arial"/>
         </w:rPr>
@@ -1024,25 +2680,27 @@
         <w:rPr>
           <w:rFonts w:ascii="Arial" w:hAnsi="Arial" w:cs="Arial"/>
         </w:rPr>
+        <w:t>Muestre en pantalla el contenido de segundo e intermedio usando una sola línea.</w:t>
+      </w:r>
+    </w:p>
+    <w:p>
+      <w:pPr>
+        <w:ind w:left="360"/>
+        <w:rPr>
+          <w:rFonts w:ascii="Arial" w:hAnsi="Arial" w:cs="Arial"/>
+        </w:rPr>
+      </w:pPr>
+      <w:r>
+        <w:rPr>
+          <w:rFonts w:ascii="Arial" w:hAnsi="Arial" w:cs="Arial"/>
+          <w:noProof/>
+        </w:rPr>
         <w:lastRenderedPageBreak/>
-        <w:t>Muestre en pantalla el contenido de Enpaz.txt, numerando cada línea.</w:t>
-      </w:r>
-    </w:p>
-    <w:p>
-      <w:pPr>
-        <w:rPr>
-          <w:rFonts w:ascii="Arial" w:hAnsi="Arial" w:cs="Arial"/>
-        </w:rPr>
-      </w:pPr>
-      <w:r>
-        <w:rPr>
-          <w:rFonts w:ascii="Arial" w:hAnsi="Arial" w:cs="Arial"/>
-        </w:rPr>
         <w:drawing>
-          <wp:inline distT="0" distB="0" distL="0" distR="0" wp14:anchorId="15F99E0D" wp14:editId="5DF071CB">
-            <wp:extent cx="5400040" cy="2808605"/>
-            <wp:effectExtent l="0" t="0" r="0" b="0"/>
-            <wp:docPr id="2" name="Picture 2"/>
+          <wp:inline distT="0" distB="0" distL="0" distR="0" wp14:anchorId="577F7FFF" wp14:editId="61E43732">
+            <wp:extent cx="5400040" cy="3686175"/>
+            <wp:effectExtent l="0" t="0" r="0" b="9525"/>
+            <wp:docPr id="24" name="Picture 24"/>
             <wp:cNvGraphicFramePr>
               <a:graphicFrameLocks xmlns:a="http://schemas.openxmlformats.org/drawingml/2006/main" noChangeAspect="1"/>
             </wp:cNvGraphicFramePr>
@@ -1062,7 +2720,7 @@
                   <pic:spPr>
                     <a:xfrm>
                       <a:off x="0" y="0"/>
-                      <a:ext cx="5400040" cy="2808605"/>
+                      <a:ext cx="5400040" cy="3686175"/>
                     </a:xfrm>
                     <a:prstGeom prst="rect">
                       <a:avLst/>
@@ -1077,36 +2735,6 @@
     </w:p>
     <w:p>
       <w:pPr>
-        <w:pStyle w:val="ListParagraph"/>
-        <w:numPr>
-          <w:ilvl w:val="0"/>
-          <w:numId w:val="6"/>
-        </w:numPr>
-        <w:rPr>
-          <w:rFonts w:ascii="Arial" w:hAnsi="Arial" w:cs="Arial"/>
-        </w:rPr>
-      </w:pPr>
-      <w:r>
-        <w:rPr>
-          <w:rFonts w:ascii="Arial" w:hAnsi="Arial" w:cs="Arial"/>
-        </w:rPr>
-        <w:t>Copie el archivo SuavePatria.txt de /home/sist20232/lety/filtros</w:t>
-      </w:r>
-      <w:r>
-        <w:rPr>
-          <w:rFonts w:ascii="Arial" w:hAnsi="Arial" w:cs="Arial"/>
-        </w:rPr>
-        <w:t xml:space="preserve"> </w:t>
-      </w:r>
-      <w:r>
-        <w:rPr>
-          <w:rFonts w:ascii="Arial" w:hAnsi="Arial" w:cs="Arial"/>
-        </w:rPr>
-        <w:t>a su directorio</w:t>
-      </w:r>
-    </w:p>
-    <w:p>
-      <w:pPr>
         <w:ind w:left="360"/>
         <w:rPr>
           <w:rFonts w:ascii="Arial" w:hAnsi="Arial" w:cs="Arial"/>
@@ -1115,12 +2743,13 @@
       <w:r>
         <w:rPr>
           <w:rFonts w:ascii="Arial" w:hAnsi="Arial" w:cs="Arial"/>
+          <w:noProof/>
         </w:rPr>
         <w:drawing>
-          <wp:inline distT="0" distB="0" distL="0" distR="0" wp14:anchorId="75364F93" wp14:editId="0982DBC4">
-            <wp:extent cx="6123302" cy="1610751"/>
-            <wp:effectExtent l="0" t="0" r="0" b="8890"/>
-            <wp:docPr id="4" name="Picture 4"/>
+          <wp:inline distT="0" distB="0" distL="0" distR="0" wp14:anchorId="0AA03E4B" wp14:editId="0210249C">
+            <wp:extent cx="5400040" cy="3686175"/>
+            <wp:effectExtent l="0" t="0" r="0" b="9525"/>
+            <wp:docPr id="25" name="Picture 25"/>
             <wp:cNvGraphicFramePr>
               <a:graphicFrameLocks xmlns:a="http://schemas.openxmlformats.org/drawingml/2006/main" noChangeAspect="1"/>
             </wp:cNvGraphicFramePr>
@@ -1140,7 +2769,7 @@
                   <pic:spPr>
                     <a:xfrm>
                       <a:off x="0" y="0"/>
-                      <a:ext cx="6156334" cy="1619440"/>
+                      <a:ext cx="5400040" cy="3686175"/>
                     </a:xfrm>
                     <a:prstGeom prst="rect">
                       <a:avLst/>
@@ -1155,6 +2784,38 @@
     </w:p>
     <w:p>
       <w:pPr>
+        <w:ind w:left="360"/>
+        <w:rPr>
+          <w:rFonts w:ascii="Arial" w:hAnsi="Arial" w:cs="Arial"/>
+        </w:rPr>
+      </w:pPr>
+    </w:p>
+    <w:p>
+      <w:pPr>
+        <w:ind w:left="360"/>
+        <w:rPr>
+          <w:rFonts w:ascii="Arial" w:hAnsi="Arial" w:cs="Arial"/>
+        </w:rPr>
+      </w:pPr>
+    </w:p>
+    <w:p>
+      <w:pPr>
+        <w:ind w:left="360"/>
+        <w:rPr>
+          <w:rFonts w:ascii="Arial" w:hAnsi="Arial" w:cs="Arial"/>
+        </w:rPr>
+      </w:pPr>
+    </w:p>
+    <w:p>
+      <w:pPr>
+        <w:ind w:left="360"/>
+        <w:rPr>
+          <w:rFonts w:ascii="Arial" w:hAnsi="Arial" w:cs="Arial"/>
+        </w:rPr>
+      </w:pPr>
+    </w:p>
+    <w:p>
+      <w:pPr>
         <w:pStyle w:val="ListParagraph"/>
         <w:numPr>
           <w:ilvl w:val="0"/>
@@ -1168,25 +2829,26 @@
         <w:rPr>
           <w:rFonts w:ascii="Arial" w:hAnsi="Arial" w:cs="Arial"/>
         </w:rPr>
-        <w:t>Muestre en pantalla el contenido del archivo amorosos.txt en el monitor</w:t>
-      </w:r>
-    </w:p>
-    <w:p>
-      <w:pPr>
-        <w:rPr>
-          <w:rFonts w:ascii="Arial" w:hAnsi="Arial" w:cs="Arial"/>
-        </w:rPr>
-      </w:pPr>
-      <w:r>
-        <w:rPr>
-          <w:rFonts w:ascii="Arial" w:hAnsi="Arial" w:cs="Arial"/>
-        </w:rPr>
         <w:lastRenderedPageBreak/>
+        <w:t>Muestre en pantalla el contenido de Enpaz.txt, numerando cada línea.</w:t>
+      </w:r>
+    </w:p>
+    <w:p>
+      <w:pPr>
+        <w:rPr>
+          <w:rFonts w:ascii="Arial" w:hAnsi="Arial" w:cs="Arial"/>
+        </w:rPr>
+      </w:pPr>
+      <w:r>
+        <w:rPr>
+          <w:rFonts w:ascii="Arial" w:hAnsi="Arial" w:cs="Arial"/>
+          <w:noProof/>
+        </w:rPr>
         <w:drawing>
-          <wp:inline distT="0" distB="0" distL="0" distR="0" wp14:anchorId="7F12C7F2" wp14:editId="1540CD2A">
-            <wp:extent cx="4260850" cy="3394551"/>
-            <wp:effectExtent l="0" t="0" r="6350" b="0"/>
-            <wp:docPr id="6" name="Picture 6"/>
+          <wp:inline distT="0" distB="0" distL="0" distR="0" wp14:anchorId="15F99E0D" wp14:editId="5DF071CB">
+            <wp:extent cx="5400040" cy="2808605"/>
+            <wp:effectExtent l="0" t="0" r="0" b="0"/>
+            <wp:docPr id="2" name="Picture 2"/>
             <wp:cNvGraphicFramePr>
               <a:graphicFrameLocks xmlns:a="http://schemas.openxmlformats.org/drawingml/2006/main" noChangeAspect="1"/>
             </wp:cNvGraphicFramePr>
@@ -1206,7 +2868,7 @@
                   <pic:spPr>
                     <a:xfrm>
                       <a:off x="0" y="0"/>
-                      <a:ext cx="4271425" cy="3402976"/>
+                      <a:ext cx="5400040" cy="2808605"/>
                     </a:xfrm>
                     <a:prstGeom prst="rect">
                       <a:avLst/>
@@ -1234,24 +2896,52 @@
         <w:rPr>
           <w:rFonts w:ascii="Arial" w:hAnsi="Arial" w:cs="Arial"/>
         </w:rPr>
-        <w:t>Vuelva a mostrar el archivo amorosos.txt, pero por páginas.</w:t>
-      </w:r>
-    </w:p>
-    <w:p>
-      <w:pPr>
-        <w:rPr>
-          <w:rFonts w:ascii="Arial" w:hAnsi="Arial" w:cs="Arial"/>
-        </w:rPr>
-      </w:pPr>
-      <w:r>
-        <w:rPr>
-          <w:rFonts w:ascii="Arial" w:hAnsi="Arial" w:cs="Arial"/>
+        <w:t>Copie el archivo SuavePatria.txt de /home/sist20232/</w:t>
+      </w:r>
+      <w:proofErr w:type="spellStart"/>
+      <w:r>
+        <w:rPr>
+          <w:rFonts w:ascii="Arial" w:hAnsi="Arial" w:cs="Arial"/>
+        </w:rPr>
+        <w:t>lety</w:t>
+      </w:r>
+      <w:proofErr w:type="spellEnd"/>
+      <w:r>
+        <w:rPr>
+          <w:rFonts w:ascii="Arial" w:hAnsi="Arial" w:cs="Arial"/>
+        </w:rPr>
+        <w:t>/filtros</w:t>
+      </w:r>
+      <w:r>
+        <w:rPr>
+          <w:rFonts w:ascii="Arial" w:hAnsi="Arial" w:cs="Arial"/>
+        </w:rPr>
+        <w:t xml:space="preserve"> </w:t>
+      </w:r>
+      <w:r>
+        <w:rPr>
+          <w:rFonts w:ascii="Arial" w:hAnsi="Arial" w:cs="Arial"/>
+        </w:rPr>
+        <w:t>a su directorio</w:t>
+      </w:r>
+    </w:p>
+    <w:p>
+      <w:pPr>
+        <w:ind w:left="360"/>
+        <w:rPr>
+          <w:rFonts w:ascii="Arial" w:hAnsi="Arial" w:cs="Arial"/>
+        </w:rPr>
+      </w:pPr>
+      <w:r>
+        <w:rPr>
+          <w:rFonts w:ascii="Arial" w:hAnsi="Arial" w:cs="Arial"/>
+          <w:noProof/>
         </w:rPr>
         <w:drawing>
-          <wp:inline distT="0" distB="0" distL="0" distR="0" wp14:anchorId="67E8287F" wp14:editId="2969809A">
-            <wp:extent cx="3348990" cy="3636868"/>
-            <wp:effectExtent l="0" t="0" r="3810" b="1905"/>
-            <wp:docPr id="7" name="Picture 7"/>
+          <wp:inline distT="0" distB="0" distL="0" distR="0" wp14:anchorId="75364F93" wp14:editId="0982DBC4">
+            <wp:extent cx="6123302" cy="1610751"/>
+            <wp:effectExtent l="0" t="0" r="0" b="8890"/>
+            <wp:docPr id="4" name="Picture 4"/>
             <wp:cNvGraphicFramePr>
               <a:graphicFrameLocks xmlns:a="http://schemas.openxmlformats.org/drawingml/2006/main" noChangeAspect="1"/>
             </wp:cNvGraphicFramePr>
@@ -1271,7 +2961,7 @@
                   <pic:spPr>
                     <a:xfrm>
                       <a:off x="0" y="0"/>
-                      <a:ext cx="3355427" cy="3643858"/>
+                      <a:ext cx="6156334" cy="1619440"/>
                     </a:xfrm>
                     <a:prstGeom prst="rect">
                       <a:avLst/>
@@ -1318,16 +3008,70 @@
           <w:rFonts w:ascii="Arial" w:hAnsi="Arial" w:cs="Arial"/>
         </w:rPr>
       </w:pPr>
-      <w:r>
-        <w:rPr>
-          <w:rFonts w:ascii="Arial" w:hAnsi="Arial" w:cs="Arial"/>
+    </w:p>
+    <w:p>
+      <w:pPr>
+        <w:rPr>
+          <w:rFonts w:ascii="Arial" w:hAnsi="Arial" w:cs="Arial"/>
+        </w:rPr>
+      </w:pPr>
+    </w:p>
+    <w:p>
+      <w:pPr>
+        <w:rPr>
+          <w:rFonts w:ascii="Arial" w:hAnsi="Arial" w:cs="Arial"/>
+        </w:rPr>
+      </w:pPr>
+    </w:p>
+    <w:p>
+      <w:pPr>
+        <w:rPr>
+          <w:rFonts w:ascii="Arial" w:hAnsi="Arial" w:cs="Arial"/>
+        </w:rPr>
+      </w:pPr>
+    </w:p>
+    <w:p>
+      <w:pPr>
+        <w:rPr>
+          <w:rFonts w:ascii="Arial" w:hAnsi="Arial" w:cs="Arial"/>
+        </w:rPr>
+      </w:pPr>
+    </w:p>
+    <w:p>
+      <w:pPr>
+        <w:pStyle w:val="ListParagraph"/>
+        <w:numPr>
+          <w:ilvl w:val="0"/>
+          <w:numId w:val="6"/>
+        </w:numPr>
+        <w:rPr>
+          <w:rFonts w:ascii="Arial" w:hAnsi="Arial" w:cs="Arial"/>
+        </w:rPr>
+      </w:pPr>
+      <w:r>
+        <w:rPr>
+          <w:rFonts w:ascii="Arial" w:hAnsi="Arial" w:cs="Arial"/>
+        </w:rPr>
+        <w:t>Muestre en pantalla el contenido del archivo amorosos.txt en el monitor</w:t>
+      </w:r>
+    </w:p>
+    <w:p>
+      <w:pPr>
+        <w:rPr>
+          <w:rFonts w:ascii="Arial" w:hAnsi="Arial" w:cs="Arial"/>
+        </w:rPr>
+      </w:pPr>
+      <w:r>
+        <w:rPr>
+          <w:rFonts w:ascii="Arial" w:hAnsi="Arial" w:cs="Arial"/>
+          <w:noProof/>
         </w:rPr>
         <w:lastRenderedPageBreak/>
         <w:drawing>
-          <wp:inline distT="0" distB="0" distL="0" distR="0" wp14:anchorId="5F09925E" wp14:editId="10E4E6E8">
-            <wp:extent cx="3818890" cy="3989537"/>
-            <wp:effectExtent l="0" t="0" r="0" b="0"/>
-            <wp:docPr id="10" name="Picture 10"/>
+          <wp:inline distT="0" distB="0" distL="0" distR="0" wp14:anchorId="7F12C7F2" wp14:editId="1540CD2A">
+            <wp:extent cx="4260850" cy="3394551"/>
+            <wp:effectExtent l="0" t="0" r="6350" b="0"/>
+            <wp:docPr id="6" name="Picture 6"/>
             <wp:cNvGraphicFramePr>
               <a:graphicFrameLocks xmlns:a="http://schemas.openxmlformats.org/drawingml/2006/main" noChangeAspect="1"/>
             </wp:cNvGraphicFramePr>
@@ -1347,7 +3091,7 @@
                   <pic:spPr>
                     <a:xfrm>
                       <a:off x="0" y="0"/>
-                      <a:ext cx="3830817" cy="4001996"/>
+                      <a:ext cx="4271425" cy="3402976"/>
                     </a:xfrm>
                     <a:prstGeom prst="rect">
                       <a:avLst/>
@@ -1375,30 +3119,25 @@
         <w:rPr>
           <w:rFonts w:ascii="Arial" w:hAnsi="Arial" w:cs="Arial"/>
         </w:rPr>
-        <w:t xml:space="preserve">Muestre las últimas diez líneas de este </w:t>
-      </w:r>
-      <w:r>
-        <w:rPr>
-          <w:rFonts w:ascii="Arial" w:hAnsi="Arial" w:cs="Arial"/>
-        </w:rPr>
-        <w:t>archive</w:t>
-      </w:r>
-    </w:p>
-    <w:p>
-      <w:pPr>
-        <w:rPr>
-          <w:rFonts w:ascii="Arial" w:hAnsi="Arial" w:cs="Arial"/>
-        </w:rPr>
-      </w:pPr>
-      <w:r>
-        <w:rPr>
-          <w:rFonts w:ascii="Arial" w:hAnsi="Arial" w:cs="Arial"/>
+        <w:t>Vuelva a mostrar el archivo amorosos.txt, pero por páginas.</w:t>
+      </w:r>
+    </w:p>
+    <w:p>
+      <w:pPr>
+        <w:rPr>
+          <w:rFonts w:ascii="Arial" w:hAnsi="Arial" w:cs="Arial"/>
+        </w:rPr>
+      </w:pPr>
+      <w:r>
+        <w:rPr>
+          <w:rFonts w:ascii="Arial" w:hAnsi="Arial" w:cs="Arial"/>
+          <w:noProof/>
         </w:rPr>
         <w:drawing>
-          <wp:inline distT="0" distB="0" distL="0" distR="0" wp14:anchorId="7FEE2412" wp14:editId="51354BA7">
-            <wp:extent cx="4356100" cy="1666833"/>
-            <wp:effectExtent l="0" t="0" r="6350" b="0"/>
-            <wp:docPr id="11" name="Picture 11"/>
+          <wp:inline distT="0" distB="0" distL="0" distR="0" wp14:anchorId="67E8287F" wp14:editId="2969809A">
+            <wp:extent cx="3348990" cy="3636868"/>
+            <wp:effectExtent l="0" t="0" r="3810" b="1905"/>
+            <wp:docPr id="7" name="Picture 7"/>
             <wp:cNvGraphicFramePr>
               <a:graphicFrameLocks xmlns:a="http://schemas.openxmlformats.org/drawingml/2006/main" noChangeAspect="1"/>
             </wp:cNvGraphicFramePr>
@@ -1418,7 +3157,7 @@
                   <pic:spPr>
                     <a:xfrm>
                       <a:off x="0" y="0"/>
-                      <a:ext cx="4363885" cy="1669812"/>
+                      <a:ext cx="3355427" cy="3643858"/>
                     </a:xfrm>
                     <a:prstGeom prst="rect">
                       <a:avLst/>
@@ -1433,37 +3172,49 @@
     </w:p>
     <w:p>
       <w:pPr>
-        <w:pStyle w:val="ListParagraph"/>
-        <w:numPr>
-          <w:ilvl w:val="0"/>
-          <w:numId w:val="6"/>
-        </w:numPr>
-        <w:rPr>
-          <w:rFonts w:ascii="Arial" w:hAnsi="Arial" w:cs="Arial"/>
-        </w:rPr>
-      </w:pPr>
-      <w:r>
-        <w:rPr>
-          <w:rFonts w:ascii="Arial" w:hAnsi="Arial" w:cs="Arial"/>
-        </w:rPr>
-        <w:t>El archivo SuavePatria.txt ahora se llamara patria.</w:t>
-      </w:r>
-    </w:p>
-    <w:p>
-      <w:pPr>
-        <w:rPr>
-          <w:rFonts w:ascii="Arial" w:hAnsi="Arial" w:cs="Arial"/>
-        </w:rPr>
-      </w:pPr>
-      <w:r>
-        <w:rPr>
-          <w:rFonts w:ascii="Arial" w:hAnsi="Arial" w:cs="Arial"/>
-        </w:rPr>
+        <w:rPr>
+          <w:rFonts w:ascii="Arial" w:hAnsi="Arial" w:cs="Arial"/>
+        </w:rPr>
+      </w:pPr>
+    </w:p>
+    <w:p>
+      <w:pPr>
+        <w:rPr>
+          <w:rFonts w:ascii="Arial" w:hAnsi="Arial" w:cs="Arial"/>
+        </w:rPr>
+      </w:pPr>
+    </w:p>
+    <w:p>
+      <w:pPr>
+        <w:rPr>
+          <w:rFonts w:ascii="Arial" w:hAnsi="Arial" w:cs="Arial"/>
+        </w:rPr>
+      </w:pPr>
+    </w:p>
+    <w:p>
+      <w:pPr>
+        <w:rPr>
+          <w:rFonts w:ascii="Arial" w:hAnsi="Arial" w:cs="Arial"/>
+        </w:rPr>
+      </w:pPr>
+    </w:p>
+    <w:p>
+      <w:pPr>
+        <w:rPr>
+          <w:rFonts w:ascii="Arial" w:hAnsi="Arial" w:cs="Arial"/>
+        </w:rPr>
+      </w:pPr>
+      <w:r>
+        <w:rPr>
+          <w:rFonts w:ascii="Arial" w:hAnsi="Arial" w:cs="Arial"/>
+          <w:noProof/>
+        </w:rPr>
+        <w:lastRenderedPageBreak/>
         <w:drawing>
-          <wp:inline distT="0" distB="0" distL="0" distR="0" wp14:anchorId="7590BBC9" wp14:editId="3C817357">
-            <wp:extent cx="4093930" cy="1791335"/>
-            <wp:effectExtent l="0" t="0" r="1905" b="0"/>
-            <wp:docPr id="12" name="Picture 12"/>
+          <wp:inline distT="0" distB="0" distL="0" distR="0" wp14:anchorId="5F09925E" wp14:editId="10E4E6E8">
+            <wp:extent cx="3818890" cy="3989537"/>
+            <wp:effectExtent l="0" t="0" r="0" b="0"/>
+            <wp:docPr id="10" name="Picture 10"/>
             <wp:cNvGraphicFramePr>
               <a:graphicFrameLocks xmlns:a="http://schemas.openxmlformats.org/drawingml/2006/main" noChangeAspect="1"/>
             </wp:cNvGraphicFramePr>
@@ -1483,7 +3234,7 @@
                   <pic:spPr>
                     <a:xfrm>
                       <a:off x="0" y="0"/>
-                      <a:ext cx="4101002" cy="1794429"/>
+                      <a:ext cx="3830817" cy="4001996"/>
                     </a:xfrm>
                     <a:prstGeom prst="rect">
                       <a:avLst/>
@@ -1498,13 +3249,6 @@
     </w:p>
     <w:p>
       <w:pPr>
-        <w:rPr>
-          <w:rFonts w:ascii="Arial" w:hAnsi="Arial" w:cs="Arial"/>
-        </w:rPr>
-      </w:pPr>
-    </w:p>
-    <w:p>
-      <w:pPr>
         <w:pStyle w:val="ListParagraph"/>
         <w:numPr>
           <w:ilvl w:val="0"/>
@@ -1518,25 +3262,31 @@
         <w:rPr>
           <w:rFonts w:ascii="Arial" w:hAnsi="Arial" w:cs="Arial"/>
         </w:rPr>
-        <w:lastRenderedPageBreak/>
-        <w:t>Muestre las últimas ocho líneas del archivo amorosos.txt</w:t>
-      </w:r>
-    </w:p>
-    <w:p>
-      <w:pPr>
-        <w:rPr>
-          <w:rFonts w:ascii="Arial" w:hAnsi="Arial" w:cs="Arial"/>
-        </w:rPr>
-      </w:pPr>
-      <w:r>
-        <w:rPr>
-          <w:rFonts w:ascii="Arial" w:hAnsi="Arial" w:cs="Arial"/>
+        <w:t xml:space="preserve">Muestre las últimas diez líneas de este </w:t>
+      </w:r>
+      <w:r>
+        <w:rPr>
+          <w:rFonts w:ascii="Arial" w:hAnsi="Arial" w:cs="Arial"/>
+        </w:rPr>
+        <w:t>archive</w:t>
+      </w:r>
+    </w:p>
+    <w:p>
+      <w:pPr>
+        <w:rPr>
+          <w:rFonts w:ascii="Arial" w:hAnsi="Arial" w:cs="Arial"/>
+        </w:rPr>
+      </w:pPr>
+      <w:r>
+        <w:rPr>
+          <w:rFonts w:ascii="Arial" w:hAnsi="Arial" w:cs="Arial"/>
+          <w:noProof/>
         </w:rPr>
         <w:drawing>
-          <wp:inline distT="0" distB="0" distL="0" distR="0" wp14:anchorId="33E678AD" wp14:editId="7A09040B">
-            <wp:extent cx="4695190" cy="1722048"/>
-            <wp:effectExtent l="0" t="0" r="0" b="0"/>
-            <wp:docPr id="13" name="Picture 13"/>
+          <wp:inline distT="0" distB="0" distL="0" distR="0" wp14:anchorId="7FEE2412" wp14:editId="51354BA7">
+            <wp:extent cx="4356100" cy="1666833"/>
+            <wp:effectExtent l="0" t="0" r="6350" b="0"/>
+            <wp:docPr id="11" name="Picture 11"/>
             <wp:cNvGraphicFramePr>
               <a:graphicFrameLocks xmlns:a="http://schemas.openxmlformats.org/drawingml/2006/main" noChangeAspect="1"/>
             </wp:cNvGraphicFramePr>
@@ -1556,7 +3306,7 @@
                   <pic:spPr>
                     <a:xfrm>
                       <a:off x="0" y="0"/>
-                      <a:ext cx="4707892" cy="1726707"/>
+                      <a:ext cx="4363885" cy="1669812"/>
                     </a:xfrm>
                     <a:prstGeom prst="rect">
                       <a:avLst/>
@@ -1571,6 +3321,62 @@
     </w:p>
     <w:p>
       <w:pPr>
+        <w:rPr>
+          <w:rFonts w:ascii="Arial" w:hAnsi="Arial" w:cs="Arial"/>
+        </w:rPr>
+      </w:pPr>
+    </w:p>
+    <w:p>
+      <w:pPr>
+        <w:rPr>
+          <w:rFonts w:ascii="Arial" w:hAnsi="Arial" w:cs="Arial"/>
+        </w:rPr>
+      </w:pPr>
+    </w:p>
+    <w:p>
+      <w:pPr>
+        <w:rPr>
+          <w:rFonts w:ascii="Arial" w:hAnsi="Arial" w:cs="Arial"/>
+        </w:rPr>
+      </w:pPr>
+    </w:p>
+    <w:p>
+      <w:pPr>
+        <w:rPr>
+          <w:rFonts w:ascii="Arial" w:hAnsi="Arial" w:cs="Arial"/>
+        </w:rPr>
+      </w:pPr>
+    </w:p>
+    <w:p>
+      <w:pPr>
+        <w:rPr>
+          <w:rFonts w:ascii="Arial" w:hAnsi="Arial" w:cs="Arial"/>
+        </w:rPr>
+      </w:pPr>
+    </w:p>
+    <w:p>
+      <w:pPr>
+        <w:rPr>
+          <w:rFonts w:ascii="Arial" w:hAnsi="Arial" w:cs="Arial"/>
+        </w:rPr>
+      </w:pPr>
+    </w:p>
+    <w:p>
+      <w:pPr>
+        <w:rPr>
+          <w:rFonts w:ascii="Arial" w:hAnsi="Arial" w:cs="Arial"/>
+        </w:rPr>
+      </w:pPr>
+    </w:p>
+    <w:p>
+      <w:pPr>
+        <w:rPr>
+          <w:rFonts w:ascii="Arial" w:hAnsi="Arial" w:cs="Arial"/>
+        </w:rPr>
+      </w:pPr>
+    </w:p>
+    <w:p>
+      <w:pPr>
         <w:pStyle w:val="ListParagraph"/>
         <w:numPr>
           <w:ilvl w:val="0"/>
@@ -1584,24 +3390,40 @@
         <w:rPr>
           <w:rFonts w:ascii="Arial" w:hAnsi="Arial" w:cs="Arial"/>
         </w:rPr>
-        <w:t>¿Cuántas palabras en total contiene el archivo amorosos.txt ?</w:t>
-      </w:r>
-    </w:p>
-    <w:p>
-      <w:pPr>
-        <w:rPr>
-          <w:rFonts w:ascii="Arial" w:hAnsi="Arial" w:cs="Arial"/>
-        </w:rPr>
-      </w:pPr>
-      <w:r>
-        <w:rPr>
-          <w:rFonts w:ascii="Arial" w:hAnsi="Arial" w:cs="Arial"/>
-        </w:rPr>
+        <w:t xml:space="preserve">El archivo SuavePatria.txt ahora se </w:t>
+      </w:r>
+      <w:proofErr w:type="gramStart"/>
+      <w:r>
+        <w:rPr>
+          <w:rFonts w:ascii="Arial" w:hAnsi="Arial" w:cs="Arial"/>
+        </w:rPr>
+        <w:t>llamara</w:t>
+      </w:r>
+      <w:proofErr w:type="gramEnd"/>
+      <w:r>
+        <w:rPr>
+          <w:rFonts w:ascii="Arial" w:hAnsi="Arial" w:cs="Arial"/>
+        </w:rPr>
+        <w:t xml:space="preserve"> patria.</w:t>
+      </w:r>
+    </w:p>
+    <w:p>
+      <w:pPr>
+        <w:rPr>
+          <w:rFonts w:ascii="Arial" w:hAnsi="Arial" w:cs="Arial"/>
+        </w:rPr>
+      </w:pPr>
+      <w:r>
+        <w:rPr>
+          <w:rFonts w:ascii="Arial" w:hAnsi="Arial" w:cs="Arial"/>
+          <w:noProof/>
+        </w:rPr>
+        <w:lastRenderedPageBreak/>
         <w:drawing>
-          <wp:inline distT="0" distB="0" distL="0" distR="0" wp14:anchorId="0F34874B" wp14:editId="0152B6BE">
-            <wp:extent cx="3114675" cy="667949"/>
-            <wp:effectExtent l="0" t="0" r="0" b="0"/>
-            <wp:docPr id="14" name="Picture 14"/>
+          <wp:inline distT="0" distB="0" distL="0" distR="0" wp14:anchorId="7590BBC9" wp14:editId="3C817357">
+            <wp:extent cx="4093930" cy="1791335"/>
+            <wp:effectExtent l="0" t="0" r="1905" b="0"/>
+            <wp:docPr id="12" name="Picture 12"/>
             <wp:cNvGraphicFramePr>
               <a:graphicFrameLocks xmlns:a="http://schemas.openxmlformats.org/drawingml/2006/main" noChangeAspect="1"/>
             </wp:cNvGraphicFramePr>
@@ -1621,7 +3443,7 @@
                   <pic:spPr>
                     <a:xfrm>
                       <a:off x="0" y="0"/>
-                      <a:ext cx="3140619" cy="673513"/>
+                      <a:ext cx="4101002" cy="1794429"/>
                     </a:xfrm>
                     <a:prstGeom prst="rect">
                       <a:avLst/>
@@ -1636,6 +3458,13 @@
     </w:p>
     <w:p>
       <w:pPr>
+        <w:rPr>
+          <w:rFonts w:ascii="Arial" w:hAnsi="Arial" w:cs="Arial"/>
+        </w:rPr>
+      </w:pPr>
+    </w:p>
+    <w:p>
+      <w:pPr>
         <w:pStyle w:val="ListParagraph"/>
         <w:numPr>
           <w:ilvl w:val="0"/>
@@ -1649,24 +3478,25 @@
         <w:rPr>
           <w:rFonts w:ascii="Arial" w:hAnsi="Arial" w:cs="Arial"/>
         </w:rPr>
-        <w:t>¿Cuántos caracteres en total contiene el archivo Enpaz.txt ?</w:t>
-      </w:r>
-    </w:p>
-    <w:p>
-      <w:pPr>
-        <w:rPr>
-          <w:rFonts w:ascii="Arial" w:hAnsi="Arial" w:cs="Arial"/>
-        </w:rPr>
-      </w:pPr>
-      <w:r>
-        <w:rPr>
-          <w:rFonts w:ascii="Arial" w:hAnsi="Arial" w:cs="Arial"/>
+        <w:t>Muestre las últimas ocho líneas del archivo amorosos.txt</w:t>
+      </w:r>
+    </w:p>
+    <w:p>
+      <w:pPr>
+        <w:rPr>
+          <w:rFonts w:ascii="Arial" w:hAnsi="Arial" w:cs="Arial"/>
+        </w:rPr>
+      </w:pPr>
+      <w:r>
+        <w:rPr>
+          <w:rFonts w:ascii="Arial" w:hAnsi="Arial" w:cs="Arial"/>
+          <w:noProof/>
         </w:rPr>
         <w:drawing>
-          <wp:inline distT="0" distB="0" distL="0" distR="0" wp14:anchorId="056AB6E8" wp14:editId="40B05686">
-            <wp:extent cx="2603500" cy="898999"/>
-            <wp:effectExtent l="0" t="0" r="6350" b="0"/>
-            <wp:docPr id="15" name="Picture 15"/>
+          <wp:inline distT="0" distB="0" distL="0" distR="0" wp14:anchorId="33E678AD" wp14:editId="7A09040B">
+            <wp:extent cx="4695190" cy="1722048"/>
+            <wp:effectExtent l="0" t="0" r="0" b="0"/>
+            <wp:docPr id="13" name="Picture 13"/>
             <wp:cNvGraphicFramePr>
               <a:graphicFrameLocks xmlns:a="http://schemas.openxmlformats.org/drawingml/2006/main" noChangeAspect="1"/>
             </wp:cNvGraphicFramePr>
@@ -1686,7 +3516,7 @@
                   <pic:spPr>
                     <a:xfrm>
                       <a:off x="0" y="0"/>
-                      <a:ext cx="2617718" cy="903909"/>
+                      <a:ext cx="4707892" cy="1726707"/>
                     </a:xfrm>
                     <a:prstGeom prst="rect">
                       <a:avLst/>
@@ -1708,54 +3538,39 @@
         </w:numPr>
         <w:rPr>
           <w:rFonts w:ascii="Arial" w:hAnsi="Arial" w:cs="Arial"/>
-          <w:lang w:val="en-US"/>
-        </w:rPr>
-      </w:pPr>
-      <w:r>
-        <w:rPr>
-          <w:rFonts w:ascii="Arial" w:hAnsi="Arial" w:cs="Arial"/>
-        </w:rPr>
-        <w:t xml:space="preserve">. Mostrar los permisos de todos los directorios que están en el directorio home. </w:t>
-      </w:r>
-      <w:r>
-        <w:rPr>
-          <w:rFonts w:ascii="Arial" w:hAnsi="Arial" w:cs="Arial"/>
-          <w:lang w:val="en-US"/>
-        </w:rPr>
-        <w:t>Observe cómo</w:t>
-      </w:r>
-      <w:r>
-        <w:rPr>
-          <w:rFonts w:ascii="Arial" w:hAnsi="Arial" w:cs="Arial"/>
-          <w:lang w:val="en-US"/>
-        </w:rPr>
-        <w:t xml:space="preserve"> </w:t>
-      </w:r>
-      <w:r>
-        <w:rPr>
-          <w:rFonts w:ascii="Arial" w:hAnsi="Arial" w:cs="Arial"/>
-        </w:rPr>
-        <w:t>están los permisos para grupo y otros usuarios</w:t>
-      </w:r>
-    </w:p>
-    <w:p>
-      <w:pPr>
-        <w:rPr>
-          <w:rFonts w:ascii="Arial" w:hAnsi="Arial" w:cs="Arial"/>
-          <w:lang w:val="en-US"/>
-        </w:rPr>
-      </w:pPr>
-      <w:r>
-        <w:rPr>
-          <w:rFonts w:ascii="Arial" w:hAnsi="Arial" w:cs="Arial"/>
-          <w:lang w:val="en-US"/>
-        </w:rPr>
-        <w:lastRenderedPageBreak/>
+        </w:rPr>
+      </w:pPr>
+      <w:r>
+        <w:rPr>
+          <w:rFonts w:ascii="Arial" w:hAnsi="Arial" w:cs="Arial"/>
+        </w:rPr>
+        <w:t xml:space="preserve">¿Cuántas palabras en total contiene el archivo </w:t>
+      </w:r>
+      <w:proofErr w:type="gramStart"/>
+      <w:r>
+        <w:rPr>
+          <w:rFonts w:ascii="Arial" w:hAnsi="Arial" w:cs="Arial"/>
+        </w:rPr>
+        <w:t>amorosos.txt ?</w:t>
+      </w:r>
+      <w:proofErr w:type="gramEnd"/>
+    </w:p>
+    <w:p>
+      <w:pPr>
+        <w:rPr>
+          <w:rFonts w:ascii="Arial" w:hAnsi="Arial" w:cs="Arial"/>
+        </w:rPr>
+      </w:pPr>
+      <w:r>
+        <w:rPr>
+          <w:rFonts w:ascii="Arial" w:hAnsi="Arial" w:cs="Arial"/>
+          <w:noProof/>
+        </w:rPr>
         <w:drawing>
-          <wp:inline distT="0" distB="0" distL="0" distR="0" wp14:anchorId="3D151A31" wp14:editId="5858C5F3">
-            <wp:extent cx="5400040" cy="5532120"/>
+          <wp:inline distT="0" distB="0" distL="0" distR="0" wp14:anchorId="0F34874B" wp14:editId="0152B6BE">
+            <wp:extent cx="3114675" cy="667949"/>
             <wp:effectExtent l="0" t="0" r="0" b="0"/>
-            <wp:docPr id="16" name="Picture 16"/>
+            <wp:docPr id="14" name="Picture 14"/>
             <wp:cNvGraphicFramePr>
               <a:graphicFrameLocks xmlns:a="http://schemas.openxmlformats.org/drawingml/2006/main" noChangeAspect="1"/>
             </wp:cNvGraphicFramePr>
@@ -1775,7 +3590,7 @@
                   <pic:spPr>
                     <a:xfrm>
                       <a:off x="0" y="0"/>
-                      <a:ext cx="5400040" cy="5532120"/>
+                      <a:ext cx="3140619" cy="673513"/>
                     </a:xfrm>
                     <a:prstGeom prst="rect">
                       <a:avLst/>
@@ -1790,22 +3605,46 @@
     </w:p>
     <w:p>
       <w:pPr>
-        <w:rPr>
-          <w:rFonts w:ascii="Arial" w:hAnsi="Arial" w:cs="Arial"/>
-          <w:lang w:val="en-US"/>
-        </w:rPr>
-      </w:pPr>
-      <w:r>
-        <w:rPr>
-          <w:rFonts w:ascii="Arial" w:hAnsi="Arial" w:cs="Arial"/>
-          <w:lang w:val="en-US"/>
-        </w:rPr>
-        <w:lastRenderedPageBreak/>
+        <w:pStyle w:val="ListParagraph"/>
+        <w:numPr>
+          <w:ilvl w:val="0"/>
+          <w:numId w:val="6"/>
+        </w:numPr>
+        <w:rPr>
+          <w:rFonts w:ascii="Arial" w:hAnsi="Arial" w:cs="Arial"/>
+        </w:rPr>
+      </w:pPr>
+      <w:r>
+        <w:rPr>
+          <w:rFonts w:ascii="Arial" w:hAnsi="Arial" w:cs="Arial"/>
+        </w:rPr>
+        <w:t xml:space="preserve">¿Cuántos caracteres en total contiene el archivo </w:t>
+      </w:r>
+      <w:proofErr w:type="gramStart"/>
+      <w:r>
+        <w:rPr>
+          <w:rFonts w:ascii="Arial" w:hAnsi="Arial" w:cs="Arial"/>
+        </w:rPr>
+        <w:t>Enpaz.txt ?</w:t>
+      </w:r>
+      <w:proofErr w:type="gramEnd"/>
+    </w:p>
+    <w:p>
+      <w:pPr>
+        <w:rPr>
+          <w:rFonts w:ascii="Arial" w:hAnsi="Arial" w:cs="Arial"/>
+        </w:rPr>
+      </w:pPr>
+      <w:r>
+        <w:rPr>
+          <w:rFonts w:ascii="Arial" w:hAnsi="Arial" w:cs="Arial"/>
+          <w:noProof/>
+        </w:rPr>
         <w:drawing>
-          <wp:inline distT="0" distB="0" distL="0" distR="0" wp14:anchorId="55000596" wp14:editId="25DB88EA">
-            <wp:extent cx="5400040" cy="3566795"/>
-            <wp:effectExtent l="0" t="0" r="0" b="0"/>
-            <wp:docPr id="17" name="Picture 17"/>
+          <wp:inline distT="0" distB="0" distL="0" distR="0" wp14:anchorId="056AB6E8" wp14:editId="40B05686">
+            <wp:extent cx="2603500" cy="898999"/>
+            <wp:effectExtent l="0" t="0" r="6350" b="0"/>
+            <wp:docPr id="15" name="Picture 15"/>
             <wp:cNvGraphicFramePr>
               <a:graphicFrameLocks xmlns:a="http://schemas.openxmlformats.org/drawingml/2006/main" noChangeAspect="1"/>
             </wp:cNvGraphicFramePr>
@@ -1825,7 +3664,7 @@
                   <pic:spPr>
                     <a:xfrm>
                       <a:off x="0" y="0"/>
-                      <a:ext cx="5400040" cy="3566795"/>
+                      <a:ext cx="2617718" cy="903909"/>
                     </a:xfrm>
                     <a:prstGeom prst="rect">
                       <a:avLst/>
@@ -1842,7 +3681,34 @@
       <w:pPr>
         <w:rPr>
           <w:rFonts w:ascii="Arial" w:hAnsi="Arial" w:cs="Arial"/>
-          <w:lang w:val="en-US"/>
+        </w:rPr>
+      </w:pPr>
+    </w:p>
+    <w:p>
+      <w:pPr>
+        <w:rPr>
+          <w:rFonts w:ascii="Arial" w:hAnsi="Arial" w:cs="Arial"/>
+        </w:rPr>
+      </w:pPr>
+    </w:p>
+    <w:p>
+      <w:pPr>
+        <w:rPr>
+          <w:rFonts w:ascii="Arial" w:hAnsi="Arial" w:cs="Arial"/>
+        </w:rPr>
+      </w:pPr>
+    </w:p>
+    <w:p>
+      <w:pPr>
+        <w:rPr>
+          <w:rFonts w:ascii="Arial" w:hAnsi="Arial" w:cs="Arial"/>
+        </w:rPr>
+      </w:pPr>
+    </w:p>
+    <w:p>
+      <w:pPr>
+        <w:rPr>
+          <w:rFonts w:ascii="Arial" w:hAnsi="Arial" w:cs="Arial"/>
         </w:rPr>
       </w:pPr>
     </w:p>
@@ -1855,31 +3721,64 @@
         </w:numPr>
         <w:rPr>
           <w:rFonts w:ascii="Arial" w:hAnsi="Arial" w:cs="Arial"/>
-        </w:rPr>
-      </w:pPr>
-      <w:r>
-        <w:rPr>
-          <w:rFonts w:ascii="Arial" w:hAnsi="Arial" w:cs="Arial"/>
-        </w:rPr>
-        <w:t>Otorgue permiso a su grupo para leer y escribir en su directorio.</w:t>
-      </w:r>
-    </w:p>
-    <w:p>
-      <w:pPr>
-        <w:ind w:left="360"/>
-        <w:rPr>
-          <w:rFonts w:ascii="Arial" w:hAnsi="Arial" w:cs="Arial"/>
-        </w:rPr>
-      </w:pPr>
-      <w:r>
-        <w:rPr>
-          <w:rFonts w:ascii="Arial" w:hAnsi="Arial" w:cs="Arial"/>
-        </w:rPr>
+          <w:lang w:val="en-US"/>
+        </w:rPr>
+      </w:pPr>
+      <w:r>
+        <w:rPr>
+          <w:rFonts w:ascii="Arial" w:hAnsi="Arial" w:cs="Arial"/>
+        </w:rPr>
+        <w:t xml:space="preserve">. Mostrar los permisos de todos los directorios que están en el directorio home. </w:t>
+      </w:r>
+      <w:r>
+        <w:rPr>
+          <w:rFonts w:ascii="Arial" w:hAnsi="Arial" w:cs="Arial"/>
+          <w:lang w:val="en-US"/>
+        </w:rPr>
+        <w:t xml:space="preserve">Observe </w:t>
+      </w:r>
+      <w:proofErr w:type="spellStart"/>
+      <w:r>
+        <w:rPr>
+          <w:rFonts w:ascii="Arial" w:hAnsi="Arial" w:cs="Arial"/>
+          <w:lang w:val="en-US"/>
+        </w:rPr>
+        <w:t>cómo</w:t>
+      </w:r>
+      <w:proofErr w:type="spellEnd"/>
+      <w:r>
+        <w:rPr>
+          <w:rFonts w:ascii="Arial" w:hAnsi="Arial" w:cs="Arial"/>
+          <w:lang w:val="en-US"/>
+        </w:rPr>
+        <w:t xml:space="preserve"> </w:t>
+      </w:r>
+      <w:r>
+        <w:rPr>
+          <w:rFonts w:ascii="Arial" w:hAnsi="Arial" w:cs="Arial"/>
+        </w:rPr>
+        <w:t>están los permisos para grupo y otros usuarios</w:t>
+      </w:r>
+    </w:p>
+    <w:p>
+      <w:pPr>
+        <w:rPr>
+          <w:rFonts w:ascii="Arial" w:hAnsi="Arial" w:cs="Arial"/>
+          <w:lang w:val="en-US"/>
+        </w:rPr>
+      </w:pPr>
+      <w:r>
+        <w:rPr>
+          <w:rFonts w:ascii="Arial" w:hAnsi="Arial" w:cs="Arial"/>
+          <w:noProof/>
+          <w:lang w:val="en-US"/>
+        </w:rPr>
+        <w:lastRenderedPageBreak/>
         <w:drawing>
-          <wp:inline distT="0" distB="0" distL="0" distR="0" wp14:anchorId="64A511DB" wp14:editId="171E088C">
-            <wp:extent cx="5400040" cy="1528445"/>
+          <wp:inline distT="0" distB="0" distL="0" distR="0" wp14:anchorId="3D151A31" wp14:editId="5858C5F3">
+            <wp:extent cx="5400040" cy="5532120"/>
             <wp:effectExtent l="0" t="0" r="0" b="0"/>
-            <wp:docPr id="18" name="Picture 18"/>
+            <wp:docPr id="16" name="Picture 16"/>
             <wp:cNvGraphicFramePr>
               <a:graphicFrameLocks xmlns:a="http://schemas.openxmlformats.org/drawingml/2006/main" noChangeAspect="1"/>
             </wp:cNvGraphicFramePr>
@@ -1899,7 +3798,7 @@
                   <pic:spPr>
                     <a:xfrm>
                       <a:off x="0" y="0"/>
-                      <a:ext cx="5400040" cy="1528445"/>
+                      <a:ext cx="5400040" cy="5532120"/>
                     </a:xfrm>
                     <a:prstGeom prst="rect">
                       <a:avLst/>
@@ -1914,69 +3813,23 @@
     </w:p>
     <w:p>
       <w:pPr>
-        <w:pStyle w:val="ListParagraph"/>
-        <w:numPr>
-          <w:ilvl w:val="0"/>
-          <w:numId w:val="6"/>
-        </w:numPr>
-        <w:rPr>
-          <w:rFonts w:ascii="Arial" w:hAnsi="Arial" w:cs="Arial"/>
-        </w:rPr>
-      </w:pPr>
-      <w:r>
-        <w:rPr>
-          <w:rFonts w:ascii="Arial" w:hAnsi="Arial" w:cs="Arial"/>
-        </w:rPr>
-        <w:t>Seleccione a uno sus compañeros, escriba un archivo en su directorio, llamado películas (use el</w:t>
-      </w:r>
-      <w:r>
-        <w:rPr>
-          <w:rFonts w:ascii="Arial" w:hAnsi="Arial" w:cs="Arial"/>
-        </w:rPr>
-        <w:t xml:space="preserve"> </w:t>
-      </w:r>
-      <w:r>
-        <w:rPr>
-          <w:rFonts w:ascii="Arial" w:hAnsi="Arial" w:cs="Arial"/>
-        </w:rPr>
-        <w:t>comando cat). Escriba un párrafo sobre la última película o serie que haya visto, puede ser</w:t>
-      </w:r>
-      <w:r>
-        <w:rPr>
-          <w:rFonts w:ascii="Arial" w:hAnsi="Arial" w:cs="Arial"/>
-        </w:rPr>
-        <w:t xml:space="preserve"> </w:t>
-      </w:r>
-      <w:r>
-        <w:rPr>
-          <w:rFonts w:ascii="Arial" w:hAnsi="Arial" w:cs="Arial"/>
-        </w:rPr>
-        <w:t>una sinopsis o su opinión person</w:t>
-      </w:r>
-      <w:r>
-        <w:rPr>
-          <w:rFonts w:ascii="Arial" w:hAnsi="Arial" w:cs="Arial"/>
-        </w:rPr>
-        <w:t>al</w:t>
-      </w:r>
-    </w:p>
-    <w:p>
-      <w:pPr>
-        <w:ind w:left="360"/>
-        <w:rPr>
-          <w:rFonts w:ascii="Arial" w:hAnsi="Arial" w:cs="Arial"/>
-        </w:rPr>
-      </w:pPr>
-      <w:r>
-        <w:rPr>
-          <w:rFonts w:ascii="Arial" w:hAnsi="Arial" w:cs="Arial"/>
+        <w:rPr>
+          <w:rFonts w:ascii="Arial" w:hAnsi="Arial" w:cs="Arial"/>
+          <w:lang w:val="en-US"/>
+        </w:rPr>
+      </w:pPr>
+      <w:r>
+        <w:rPr>
+          <w:rFonts w:ascii="Arial" w:hAnsi="Arial" w:cs="Arial"/>
+          <w:noProof/>
+          <w:lang w:val="en-US"/>
         </w:rPr>
         <w:lastRenderedPageBreak/>
         <w:drawing>
-          <wp:inline distT="0" distB="0" distL="0" distR="0" wp14:anchorId="1EB77DFB" wp14:editId="5AAEE562">
-            <wp:extent cx="5400040" cy="2211070"/>
+          <wp:inline distT="0" distB="0" distL="0" distR="0" wp14:anchorId="55000596" wp14:editId="25DB88EA">
+            <wp:extent cx="5400040" cy="3566795"/>
             <wp:effectExtent l="0" t="0" r="0" b="0"/>
-            <wp:docPr id="19" name="Picture 19"/>
+            <wp:docPr id="17" name="Picture 17"/>
             <wp:cNvGraphicFramePr>
               <a:graphicFrameLocks xmlns:a="http://schemas.openxmlformats.org/drawingml/2006/main" noChangeAspect="1"/>
             </wp:cNvGraphicFramePr>
@@ -1996,7 +3849,7 @@
                   <pic:spPr>
                     <a:xfrm>
                       <a:off x="0" y="0"/>
-                      <a:ext cx="5400040" cy="2211070"/>
+                      <a:ext cx="5400040" cy="3566795"/>
                     </a:xfrm>
                     <a:prstGeom prst="rect">
                       <a:avLst/>
@@ -2011,6 +3864,14 @@
     </w:p>
     <w:p>
       <w:pPr>
+        <w:rPr>
+          <w:rFonts w:ascii="Arial" w:hAnsi="Arial" w:cs="Arial"/>
+          <w:lang w:val="en-US"/>
+        </w:rPr>
+      </w:pPr>
+    </w:p>
+    <w:p>
+      <w:pPr>
         <w:pStyle w:val="ListParagraph"/>
         <w:numPr>
           <w:ilvl w:val="0"/>
@@ -2024,7 +3885,7 @@
         <w:rPr>
           <w:rFonts w:ascii="Arial" w:hAnsi="Arial" w:cs="Arial"/>
         </w:rPr>
-        <w:t>Otorgar permiso de lectura al grupo para este archivo.</w:t>
+        <w:t>Otorgue permiso a su grupo para leer y escribir en su directorio.</w:t>
       </w:r>
     </w:p>
     <w:p>
@@ -2037,12 +3898,13 @@
       <w:r>
         <w:rPr>
           <w:rFonts w:ascii="Arial" w:hAnsi="Arial" w:cs="Arial"/>
+          <w:noProof/>
         </w:rPr>
         <w:drawing>
-          <wp:inline distT="0" distB="0" distL="0" distR="0" wp14:anchorId="5D4BCD56" wp14:editId="1D3FAA04">
-            <wp:extent cx="5400040" cy="2586990"/>
-            <wp:effectExtent l="0" t="0" r="0" b="3810"/>
-            <wp:docPr id="20" name="Picture 20"/>
+          <wp:inline distT="0" distB="0" distL="0" distR="0" wp14:anchorId="64A511DB" wp14:editId="171E088C">
+            <wp:extent cx="5400040" cy="1528445"/>
+            <wp:effectExtent l="0" t="0" r="0" b="0"/>
+            <wp:docPr id="18" name="Picture 18"/>
             <wp:cNvGraphicFramePr>
               <a:graphicFrameLocks xmlns:a="http://schemas.openxmlformats.org/drawingml/2006/main" noChangeAspect="1"/>
             </wp:cNvGraphicFramePr>
@@ -2062,6 +3924,257 @@
                   <pic:spPr>
                     <a:xfrm>
                       <a:off x="0" y="0"/>
+                      <a:ext cx="5400040" cy="1528445"/>
+                    </a:xfrm>
+                    <a:prstGeom prst="rect">
+                      <a:avLst/>
+                    </a:prstGeom>
+                  </pic:spPr>
+                </pic:pic>
+              </a:graphicData>
+            </a:graphic>
+          </wp:inline>
+        </w:drawing>
+      </w:r>
+    </w:p>
+    <w:p>
+      <w:pPr>
+        <w:ind w:left="360"/>
+        <w:rPr>
+          <w:rFonts w:ascii="Arial" w:hAnsi="Arial" w:cs="Arial"/>
+        </w:rPr>
+      </w:pPr>
+    </w:p>
+    <w:p>
+      <w:pPr>
+        <w:ind w:left="360"/>
+        <w:rPr>
+          <w:rFonts w:ascii="Arial" w:hAnsi="Arial" w:cs="Arial"/>
+        </w:rPr>
+      </w:pPr>
+    </w:p>
+    <w:p>
+      <w:pPr>
+        <w:ind w:left="360"/>
+        <w:rPr>
+          <w:rFonts w:ascii="Arial" w:hAnsi="Arial" w:cs="Arial"/>
+        </w:rPr>
+      </w:pPr>
+    </w:p>
+    <w:p>
+      <w:pPr>
+        <w:ind w:left="360"/>
+        <w:rPr>
+          <w:rFonts w:ascii="Arial" w:hAnsi="Arial" w:cs="Arial"/>
+        </w:rPr>
+      </w:pPr>
+    </w:p>
+    <w:p>
+      <w:pPr>
+        <w:ind w:left="360"/>
+        <w:rPr>
+          <w:rFonts w:ascii="Arial" w:hAnsi="Arial" w:cs="Arial"/>
+        </w:rPr>
+      </w:pPr>
+    </w:p>
+    <w:p>
+      <w:pPr>
+        <w:ind w:left="360"/>
+        <w:rPr>
+          <w:rFonts w:ascii="Arial" w:hAnsi="Arial" w:cs="Arial"/>
+        </w:rPr>
+      </w:pPr>
+    </w:p>
+    <w:p>
+      <w:pPr>
+        <w:ind w:left="360"/>
+        <w:rPr>
+          <w:rFonts w:ascii="Arial" w:hAnsi="Arial" w:cs="Arial"/>
+        </w:rPr>
+      </w:pPr>
+    </w:p>
+    <w:p>
+      <w:pPr>
+        <w:ind w:left="360"/>
+        <w:rPr>
+          <w:rFonts w:ascii="Arial" w:hAnsi="Arial" w:cs="Arial"/>
+        </w:rPr>
+      </w:pPr>
+    </w:p>
+    <w:p>
+      <w:pPr>
+        <w:ind w:left="360"/>
+        <w:rPr>
+          <w:rFonts w:ascii="Arial" w:hAnsi="Arial" w:cs="Arial"/>
+        </w:rPr>
+      </w:pPr>
+    </w:p>
+    <w:p>
+      <w:pPr>
+        <w:pStyle w:val="ListParagraph"/>
+        <w:numPr>
+          <w:ilvl w:val="0"/>
+          <w:numId w:val="6"/>
+        </w:numPr>
+        <w:rPr>
+          <w:rFonts w:ascii="Arial" w:hAnsi="Arial" w:cs="Arial"/>
+        </w:rPr>
+      </w:pPr>
+      <w:r>
+        <w:rPr>
+          <w:rFonts w:ascii="Arial" w:hAnsi="Arial" w:cs="Arial"/>
+        </w:rPr>
+        <w:lastRenderedPageBreak/>
+        <w:t>Seleccione a uno sus compañeros, escriba un archivo en su directorio, llamado películas (use el</w:t>
+      </w:r>
+      <w:r>
+        <w:rPr>
+          <w:rFonts w:ascii="Arial" w:hAnsi="Arial" w:cs="Arial"/>
+        </w:rPr>
+        <w:t xml:space="preserve"> </w:t>
+      </w:r>
+      <w:r>
+        <w:rPr>
+          <w:rFonts w:ascii="Arial" w:hAnsi="Arial" w:cs="Arial"/>
+        </w:rPr>
+        <w:t xml:space="preserve">comando </w:t>
+      </w:r>
+      <w:proofErr w:type="spellStart"/>
+      <w:r>
+        <w:rPr>
+          <w:rFonts w:ascii="Arial" w:hAnsi="Arial" w:cs="Arial"/>
+        </w:rPr>
+        <w:t>cat</w:t>
+      </w:r>
+      <w:proofErr w:type="spellEnd"/>
+      <w:r>
+        <w:rPr>
+          <w:rFonts w:ascii="Arial" w:hAnsi="Arial" w:cs="Arial"/>
+        </w:rPr>
+        <w:t>). Escriba un párrafo sobre la última película o serie que haya visto, puede ser</w:t>
+      </w:r>
+      <w:r>
+        <w:rPr>
+          <w:rFonts w:ascii="Arial" w:hAnsi="Arial" w:cs="Arial"/>
+        </w:rPr>
+        <w:t xml:space="preserve"> </w:t>
+      </w:r>
+      <w:r>
+        <w:rPr>
+          <w:rFonts w:ascii="Arial" w:hAnsi="Arial" w:cs="Arial"/>
+        </w:rPr>
+        <w:t>una sinopsis o su opinión person</w:t>
+      </w:r>
+      <w:r>
+        <w:rPr>
+          <w:rFonts w:ascii="Arial" w:hAnsi="Arial" w:cs="Arial"/>
+        </w:rPr>
+        <w:t>al</w:t>
+      </w:r>
+    </w:p>
+    <w:p>
+      <w:pPr>
+        <w:ind w:left="360"/>
+        <w:rPr>
+          <w:rFonts w:ascii="Arial" w:hAnsi="Arial" w:cs="Arial"/>
+        </w:rPr>
+      </w:pPr>
+      <w:r>
+        <w:rPr>
+          <w:rFonts w:ascii="Arial" w:hAnsi="Arial" w:cs="Arial"/>
+          <w:noProof/>
+        </w:rPr>
+        <w:drawing>
+          <wp:inline distT="0" distB="0" distL="0" distR="0" wp14:anchorId="1EB77DFB" wp14:editId="5AAEE562">
+            <wp:extent cx="5400040" cy="2211070"/>
+            <wp:effectExtent l="0" t="0" r="0" b="0"/>
+            <wp:docPr id="19" name="Picture 19"/>
+            <wp:cNvGraphicFramePr>
+              <a:graphicFrameLocks xmlns:a="http://schemas.openxmlformats.org/drawingml/2006/main" noChangeAspect="1"/>
+            </wp:cNvGraphicFramePr>
+            <a:graphic xmlns:a="http://schemas.openxmlformats.org/drawingml/2006/main">
+              <a:graphicData uri="http://schemas.openxmlformats.org/drawingml/2006/picture">
+                <pic:pic xmlns:pic="http://schemas.openxmlformats.org/drawingml/2006/picture">
+                  <pic:nvPicPr>
+                    <pic:cNvPr id="1" name=""/>
+                    <pic:cNvPicPr/>
+                  </pic:nvPicPr>
+                  <pic:blipFill>
+                    <a:blip r:embed="rId31"/>
+                    <a:stretch>
+                      <a:fillRect/>
+                    </a:stretch>
+                  </pic:blipFill>
+                  <pic:spPr>
+                    <a:xfrm>
+                      <a:off x="0" y="0"/>
+                      <a:ext cx="5400040" cy="2211070"/>
+                    </a:xfrm>
+                    <a:prstGeom prst="rect">
+                      <a:avLst/>
+                    </a:prstGeom>
+                  </pic:spPr>
+                </pic:pic>
+              </a:graphicData>
+            </a:graphic>
+          </wp:inline>
+        </w:drawing>
+      </w:r>
+    </w:p>
+    <w:p>
+      <w:pPr>
+        <w:pStyle w:val="ListParagraph"/>
+        <w:numPr>
+          <w:ilvl w:val="0"/>
+          <w:numId w:val="6"/>
+        </w:numPr>
+        <w:rPr>
+          <w:rFonts w:ascii="Arial" w:hAnsi="Arial" w:cs="Arial"/>
+        </w:rPr>
+      </w:pPr>
+      <w:r>
+        <w:rPr>
+          <w:rFonts w:ascii="Arial" w:hAnsi="Arial" w:cs="Arial"/>
+        </w:rPr>
+        <w:t>Otorgar permiso de lectura al grupo para este archivo.</w:t>
+      </w:r>
+    </w:p>
+    <w:p>
+      <w:pPr>
+        <w:ind w:left="360"/>
+        <w:rPr>
+          <w:rFonts w:ascii="Arial" w:hAnsi="Arial" w:cs="Arial"/>
+        </w:rPr>
+      </w:pPr>
+      <w:r>
+        <w:rPr>
+          <w:rFonts w:ascii="Arial" w:hAnsi="Arial" w:cs="Arial"/>
+          <w:noProof/>
+        </w:rPr>
+        <w:drawing>
+          <wp:inline distT="0" distB="0" distL="0" distR="0" wp14:anchorId="5D4BCD56" wp14:editId="1D3FAA04">
+            <wp:extent cx="5400040" cy="2586990"/>
+            <wp:effectExtent l="0" t="0" r="0" b="3810"/>
+            <wp:docPr id="20" name="Picture 20"/>
+            <wp:cNvGraphicFramePr>
+              <a:graphicFrameLocks xmlns:a="http://schemas.openxmlformats.org/drawingml/2006/main" noChangeAspect="1"/>
+            </wp:cNvGraphicFramePr>
+            <a:graphic xmlns:a="http://schemas.openxmlformats.org/drawingml/2006/main">
+              <a:graphicData uri="http://schemas.openxmlformats.org/drawingml/2006/picture">
+                <pic:pic xmlns:pic="http://schemas.openxmlformats.org/drawingml/2006/picture">
+                  <pic:nvPicPr>
+                    <pic:cNvPr id="1" name=""/>
+                    <pic:cNvPicPr/>
+                  </pic:nvPicPr>
+                  <pic:blipFill>
+                    <a:blip r:embed="rId32"/>
+                    <a:stretch>
+                      <a:fillRect/>
+                    </a:stretch>
+                  </pic:blipFill>
+                  <pic:spPr>
+                    <a:xfrm>
+                      <a:off x="0" y="0"/>
                       <a:ext cx="5400040" cy="2586990"/>
                     </a:xfrm>
                     <a:prstGeom prst="rect">
@@ -2077,6 +4190,94 @@
     </w:p>
     <w:p>
       <w:pPr>
+        <w:ind w:left="360"/>
+        <w:rPr>
+          <w:rFonts w:ascii="Arial" w:hAnsi="Arial" w:cs="Arial"/>
+        </w:rPr>
+      </w:pPr>
+    </w:p>
+    <w:p>
+      <w:pPr>
+        <w:ind w:left="360"/>
+        <w:rPr>
+          <w:rFonts w:ascii="Arial" w:hAnsi="Arial" w:cs="Arial"/>
+        </w:rPr>
+      </w:pPr>
+    </w:p>
+    <w:p>
+      <w:pPr>
+        <w:ind w:left="360"/>
+        <w:rPr>
+          <w:rFonts w:ascii="Arial" w:hAnsi="Arial" w:cs="Arial"/>
+        </w:rPr>
+      </w:pPr>
+    </w:p>
+    <w:p>
+      <w:pPr>
+        <w:ind w:left="360"/>
+        <w:rPr>
+          <w:rFonts w:ascii="Arial" w:hAnsi="Arial" w:cs="Arial"/>
+        </w:rPr>
+      </w:pPr>
+    </w:p>
+    <w:p>
+      <w:pPr>
+        <w:ind w:left="360"/>
+        <w:rPr>
+          <w:rFonts w:ascii="Arial" w:hAnsi="Arial" w:cs="Arial"/>
+        </w:rPr>
+      </w:pPr>
+    </w:p>
+    <w:p>
+      <w:pPr>
+        <w:ind w:left="360"/>
+        <w:rPr>
+          <w:rFonts w:ascii="Arial" w:hAnsi="Arial" w:cs="Arial"/>
+        </w:rPr>
+      </w:pPr>
+    </w:p>
+    <w:p>
+      <w:pPr>
+        <w:ind w:left="360"/>
+        <w:rPr>
+          <w:rFonts w:ascii="Arial" w:hAnsi="Arial" w:cs="Arial"/>
+        </w:rPr>
+      </w:pPr>
+    </w:p>
+    <w:p>
+      <w:pPr>
+        <w:ind w:left="360"/>
+        <w:rPr>
+          <w:rFonts w:ascii="Arial" w:hAnsi="Arial" w:cs="Arial"/>
+        </w:rPr>
+      </w:pPr>
+    </w:p>
+    <w:p>
+      <w:pPr>
+        <w:ind w:left="360"/>
+        <w:rPr>
+          <w:rFonts w:ascii="Arial" w:hAnsi="Arial" w:cs="Arial"/>
+        </w:rPr>
+      </w:pPr>
+    </w:p>
+    <w:p>
+      <w:pPr>
+        <w:ind w:left="360"/>
+        <w:rPr>
+          <w:rFonts w:ascii="Arial" w:hAnsi="Arial" w:cs="Arial"/>
+        </w:rPr>
+      </w:pPr>
+    </w:p>
+    <w:p>
+      <w:pPr>
+        <w:ind w:left="360"/>
+        <w:rPr>
+          <w:rFonts w:ascii="Arial" w:hAnsi="Arial" w:cs="Arial"/>
+        </w:rPr>
+      </w:pPr>
+    </w:p>
+    <w:p>
+      <w:pPr>
         <w:pStyle w:val="ListParagraph"/>
         <w:numPr>
           <w:ilvl w:val="0"/>
@@ -2084,16 +4285,184 @@
         </w:numPr>
         <w:rPr>
           <w:rFonts w:ascii="Arial" w:hAnsi="Arial" w:cs="Arial"/>
-          <w:lang w:val="en-US"/>
-        </w:rPr>
-      </w:pPr>
-      <w:r>
-        <w:rPr>
-          <w:rFonts w:ascii="Arial" w:hAnsi="Arial" w:cs="Arial"/>
-          <w:lang w:val="en-US"/>
-        </w:rPr>
-        <w:t>D</w:t>
-      </w:r>
+        </w:rPr>
+      </w:pPr>
+      <w:r>
+        <w:rPr>
+          <w:rFonts w:ascii="Arial" w:hAnsi="Arial" w:cs="Arial"/>
+        </w:rPr>
+        <w:t>Copia la historia de tres de tus compañeros a un directorio llamado sinopsis.</w:t>
+      </w:r>
+    </w:p>
+    <w:p>
+      <w:pPr>
+        <w:rPr>
+          <w:rFonts w:ascii="Arial" w:hAnsi="Arial" w:cs="Arial"/>
+        </w:rPr>
+      </w:pPr>
+      <w:r>
+        <w:rPr>
+          <w:rFonts w:ascii="Arial" w:hAnsi="Arial" w:cs="Arial"/>
+          <w:noProof/>
+        </w:rPr>
+        <w:drawing>
+          <wp:anchor distT="0" distB="0" distL="114300" distR="114300" simplePos="0" relativeHeight="251658240" behindDoc="0" locked="0" layoutInCell="1" allowOverlap="1" wp14:anchorId="7E269FB3" wp14:editId="4138A3ED">
+            <wp:simplePos x="1079500" y="6775450"/>
+            <wp:positionH relativeFrom="column">
+              <wp:align>left</wp:align>
+            </wp:positionH>
+            <wp:positionV relativeFrom="paragraph">
+              <wp:align>top</wp:align>
+            </wp:positionV>
+            <wp:extent cx="5400040" cy="2440940"/>
+            <wp:effectExtent l="0" t="0" r="0" b="0"/>
+            <wp:wrapSquare wrapText="bothSides"/>
+            <wp:docPr id="3" name="Picture 3"/>
+            <wp:cNvGraphicFramePr>
+              <a:graphicFrameLocks xmlns:a="http://schemas.openxmlformats.org/drawingml/2006/main" noChangeAspect="1"/>
+            </wp:cNvGraphicFramePr>
+            <a:graphic xmlns:a="http://schemas.openxmlformats.org/drawingml/2006/main">
+              <a:graphicData uri="http://schemas.openxmlformats.org/drawingml/2006/picture">
+                <pic:pic xmlns:pic="http://schemas.openxmlformats.org/drawingml/2006/picture">
+                  <pic:nvPicPr>
+                    <pic:cNvPr id="1" name=""/>
+                    <pic:cNvPicPr/>
+                  </pic:nvPicPr>
+                  <pic:blipFill>
+                    <a:blip r:embed="rId33">
+                      <a:extLst>
+                        <a:ext uri="{28A0092B-C50C-407E-A947-70E740481C1C}">
+                          <a14:useLocalDpi xmlns:a14="http://schemas.microsoft.com/office/drawing/2010/main" val="0"/>
+                        </a:ext>
+                      </a:extLst>
+                    </a:blip>
+                    <a:stretch>
+                      <a:fillRect/>
+                    </a:stretch>
+                  </pic:blipFill>
+                  <pic:spPr>
+                    <a:xfrm>
+                      <a:off x="0" y="0"/>
+                      <a:ext cx="5400040" cy="2440940"/>
+                    </a:xfrm>
+                    <a:prstGeom prst="rect">
+                      <a:avLst/>
+                    </a:prstGeom>
+                  </pic:spPr>
+                </pic:pic>
+              </a:graphicData>
+            </a:graphic>
+          </wp:anchor>
+        </w:drawing>
+      </w:r>
+      <w:r>
+        <w:rPr>
+          <w:rFonts w:ascii="Arial" w:hAnsi="Arial" w:cs="Arial"/>
+        </w:rPr>
+        <w:br w:type="textWrapping" w:clear="all"/>
+      </w:r>
+      <w:r>
+        <w:rPr>
+          <w:rFonts w:ascii="Arial" w:hAnsi="Arial" w:cs="Arial"/>
+          <w:noProof/>
+        </w:rPr>
+        <w:drawing>
+          <wp:inline distT="0" distB="0" distL="0" distR="0" wp14:anchorId="2A787AB3" wp14:editId="36E69FED">
+            <wp:extent cx="5400040" cy="2382520"/>
+            <wp:effectExtent l="0" t="0" r="0" b="0"/>
+            <wp:docPr id="8" name="Picture 8"/>
+            <wp:cNvGraphicFramePr>
+              <a:graphicFrameLocks xmlns:a="http://schemas.openxmlformats.org/drawingml/2006/main" noChangeAspect="1"/>
+            </wp:cNvGraphicFramePr>
+            <a:graphic xmlns:a="http://schemas.openxmlformats.org/drawingml/2006/main">
+              <a:graphicData uri="http://schemas.openxmlformats.org/drawingml/2006/picture">
+                <pic:pic xmlns:pic="http://schemas.openxmlformats.org/drawingml/2006/picture">
+                  <pic:nvPicPr>
+                    <pic:cNvPr id="1" name=""/>
+                    <pic:cNvPicPr/>
+                  </pic:nvPicPr>
+                  <pic:blipFill>
+                    <a:blip r:embed="rId34"/>
+                    <a:stretch>
+                      <a:fillRect/>
+                    </a:stretch>
+                  </pic:blipFill>
+                  <pic:spPr>
+                    <a:xfrm>
+                      <a:off x="0" y="0"/>
+                      <a:ext cx="5400040" cy="2382520"/>
+                    </a:xfrm>
+                    <a:prstGeom prst="rect">
+                      <a:avLst/>
+                    </a:prstGeom>
+                  </pic:spPr>
+                </pic:pic>
+              </a:graphicData>
+            </a:graphic>
+          </wp:inline>
+        </w:drawing>
+      </w:r>
+    </w:p>
+    <w:p>
+      <w:pPr>
+        <w:rPr>
+          <w:rFonts w:ascii="Arial" w:hAnsi="Arial" w:cs="Arial"/>
+        </w:rPr>
+      </w:pPr>
+      <w:r>
+        <w:rPr>
+          <w:rFonts w:ascii="Arial" w:hAnsi="Arial" w:cs="Arial"/>
+        </w:rPr>
+        <w:drawing>
+          <wp:inline distT="0" distB="0" distL="0" distR="0" wp14:anchorId="33F723BC" wp14:editId="17BBE1B6">
+            <wp:extent cx="8877736" cy="1612900"/>
+            <wp:effectExtent l="0" t="0" r="0" b="6350"/>
+            <wp:docPr id="26" name="Picture 26"/>
+            <wp:cNvGraphicFramePr>
+              <a:graphicFrameLocks xmlns:a="http://schemas.openxmlformats.org/drawingml/2006/main" noChangeAspect="1"/>
+            </wp:cNvGraphicFramePr>
+            <a:graphic xmlns:a="http://schemas.openxmlformats.org/drawingml/2006/main">
+              <a:graphicData uri="http://schemas.openxmlformats.org/drawingml/2006/picture">
+                <pic:pic xmlns:pic="http://schemas.openxmlformats.org/drawingml/2006/picture">
+                  <pic:nvPicPr>
+                    <pic:cNvPr id="1" name=""/>
+                    <pic:cNvPicPr/>
+                  </pic:nvPicPr>
+                  <pic:blipFill>
+                    <a:blip r:embed="rId35"/>
+                    <a:stretch>
+                      <a:fillRect/>
+                    </a:stretch>
+                  </pic:blipFill>
+                  <pic:spPr>
+                    <a:xfrm>
+                      <a:off x="0" y="0"/>
+                      <a:ext cx="8879914" cy="1613296"/>
+                    </a:xfrm>
+                    <a:prstGeom prst="rect">
+                      <a:avLst/>
+                    </a:prstGeom>
+                  </pic:spPr>
+                </pic:pic>
+              </a:graphicData>
+            </a:graphic>
+          </wp:inline>
+        </w:drawing>
+      </w:r>
+    </w:p>
+    <w:p>
+      <w:pPr>
+        <w:rPr>
+          <w:rFonts w:ascii="Arial" w:hAnsi="Arial" w:cs="Arial"/>
+        </w:rPr>
+      </w:pPr>
+    </w:p>
+    <w:p>
+      <w:pPr>
+        <w:rPr>
+          <w:rFonts w:ascii="Arial" w:hAnsi="Arial" w:cs="Arial"/>
+        </w:rPr>
+      </w:pPr>
     </w:p>
     <w:p>
       <w:pPr>
@@ -2104,40 +4473,213 @@
         </w:numPr>
         <w:rPr>
           <w:rFonts w:ascii="Arial" w:hAnsi="Arial" w:cs="Arial"/>
-          <w:lang w:val="en-US"/>
-        </w:rPr>
-      </w:pPr>
-      <w:r>
-        <w:rPr>
-          <w:rFonts w:ascii="Arial" w:hAnsi="Arial" w:cs="Arial"/>
-          <w:lang w:val="en-US"/>
-        </w:rPr>
-        <w:t>Sd</w:t>
-      </w:r>
-    </w:p>
-    <w:p>
-      <w:pPr>
-        <w:pStyle w:val="ListParagraph"/>
-        <w:numPr>
-          <w:ilvl w:val="0"/>
-          <w:numId w:val="6"/>
-        </w:numPr>
-        <w:rPr>
-          <w:rFonts w:ascii="Arial" w:hAnsi="Arial" w:cs="Arial"/>
-          <w:lang w:val="en-US"/>
-        </w:rPr>
-      </w:pPr>
-      <w:r>
-        <w:rPr>
-          <w:rFonts w:ascii="Arial" w:hAnsi="Arial" w:cs="Arial"/>
-          <w:lang w:val="en-US"/>
-        </w:rPr>
-        <w:t>sdsd</w:t>
+        </w:rPr>
+      </w:pPr>
+      <w:r>
+        <w:rPr>
+          <w:rFonts w:ascii="Arial" w:hAnsi="Arial" w:cs="Arial"/>
+        </w:rPr>
+        <w:lastRenderedPageBreak/>
+        <w:t>. Restringir los permisos de lectura y escritura de tu directorio al grupo.</w:t>
+      </w:r>
+    </w:p>
+    <w:p>
+      <w:pPr>
+        <w:ind w:left="360"/>
+        <w:rPr>
+          <w:rFonts w:ascii="Arial" w:hAnsi="Arial" w:cs="Arial"/>
+        </w:rPr>
+      </w:pPr>
+      <w:r>
+        <w:rPr>
+          <w:rFonts w:ascii="Arial" w:hAnsi="Arial" w:cs="Arial"/>
+        </w:rPr>
+        <w:drawing>
+          <wp:inline distT="0" distB="0" distL="0" distR="0" wp14:anchorId="238EDA5A" wp14:editId="04E1D040">
+            <wp:extent cx="5400040" cy="2642870"/>
+            <wp:effectExtent l="0" t="0" r="0" b="5080"/>
+            <wp:docPr id="27" name="Picture 27"/>
+            <wp:cNvGraphicFramePr>
+              <a:graphicFrameLocks xmlns:a="http://schemas.openxmlformats.org/drawingml/2006/main" noChangeAspect="1"/>
+            </wp:cNvGraphicFramePr>
+            <a:graphic xmlns:a="http://schemas.openxmlformats.org/drawingml/2006/main">
+              <a:graphicData uri="http://schemas.openxmlformats.org/drawingml/2006/picture">
+                <pic:pic xmlns:pic="http://schemas.openxmlformats.org/drawingml/2006/picture">
+                  <pic:nvPicPr>
+                    <pic:cNvPr id="1" name=""/>
+                    <pic:cNvPicPr/>
+                  </pic:nvPicPr>
+                  <pic:blipFill>
+                    <a:blip r:embed="rId36"/>
+                    <a:stretch>
+                      <a:fillRect/>
+                    </a:stretch>
+                  </pic:blipFill>
+                  <pic:spPr>
+                    <a:xfrm>
+                      <a:off x="0" y="0"/>
+                      <a:ext cx="5400040" cy="2642870"/>
+                    </a:xfrm>
+                    <a:prstGeom prst="rect">
+                      <a:avLst/>
+                    </a:prstGeom>
+                  </pic:spPr>
+                </pic:pic>
+              </a:graphicData>
+            </a:graphic>
+          </wp:inline>
+        </w:drawing>
+      </w:r>
+    </w:p>
+    <w:p>
+      <w:pPr>
+        <w:ind w:left="360"/>
+        <w:rPr>
+          <w:rFonts w:ascii="Arial" w:hAnsi="Arial" w:cs="Arial"/>
+        </w:rPr>
+      </w:pPr>
+    </w:p>
+    <w:p>
+      <w:pPr>
+        <w:ind w:left="360"/>
+        <w:rPr>
+          <w:rFonts w:ascii="Arial" w:hAnsi="Arial" w:cs="Arial"/>
+        </w:rPr>
+      </w:pPr>
+      <w:r>
+        <w:rPr>
+          <w:rFonts w:ascii="Arial" w:hAnsi="Arial" w:cs="Arial"/>
+        </w:rPr>
+        <w:t xml:space="preserve">Conclusiones: </w:t>
+      </w:r>
+    </w:p>
+    <w:p>
+      <w:pPr>
+        <w:ind w:left="360"/>
+        <w:rPr>
+          <w:rFonts w:ascii="Arial" w:hAnsi="Arial" w:cs="Arial"/>
+        </w:rPr>
+      </w:pPr>
+      <w:r>
+        <w:rPr>
+          <w:rFonts w:ascii="Arial" w:hAnsi="Arial" w:cs="Arial"/>
+        </w:rPr>
+        <w:t xml:space="preserve">Durante el desarrollo de la actividad de vieron comandos muy </w:t>
+      </w:r>
+      <w:r>
+        <w:rPr>
+          <w:rFonts w:ascii="Arial" w:hAnsi="Arial" w:cs="Arial"/>
+        </w:rPr>
+        <w:t>importantes</w:t>
+      </w:r>
+      <w:r>
+        <w:rPr>
+          <w:rFonts w:ascii="Arial" w:hAnsi="Arial" w:cs="Arial"/>
+        </w:rPr>
+        <w:t xml:space="preserve"> al usar sistemas </w:t>
+      </w:r>
+      <w:proofErr w:type="spellStart"/>
+      <w:r>
+        <w:rPr>
+          <w:rFonts w:ascii="Arial" w:hAnsi="Arial" w:cs="Arial"/>
+        </w:rPr>
+        <w:t>unix</w:t>
+      </w:r>
+      <w:proofErr w:type="spellEnd"/>
+      <w:r>
+        <w:rPr>
+          <w:rFonts w:ascii="Arial" w:hAnsi="Arial" w:cs="Arial"/>
+        </w:rPr>
+        <w:t xml:space="preserve">, a mi </w:t>
+      </w:r>
+      <w:r>
+        <w:rPr>
+          <w:rFonts w:ascii="Arial" w:hAnsi="Arial" w:cs="Arial"/>
+        </w:rPr>
+        <w:t>consideración</w:t>
+      </w:r>
+      <w:r>
+        <w:rPr>
+          <w:rFonts w:ascii="Arial" w:hAnsi="Arial" w:cs="Arial"/>
+        </w:rPr>
+        <w:t xml:space="preserve"> uno de los que creo que tiene mas pesos es </w:t>
+      </w:r>
+      <w:proofErr w:type="spellStart"/>
+      <w:r>
+        <w:rPr>
+          <w:rFonts w:ascii="Arial" w:hAnsi="Arial" w:cs="Arial"/>
+          <w:b/>
+          <w:bCs/>
+        </w:rPr>
+        <w:t>chmod</w:t>
+      </w:r>
+      <w:proofErr w:type="spellEnd"/>
+      <w:r>
+        <w:rPr>
+          <w:rFonts w:ascii="Arial" w:hAnsi="Arial" w:cs="Arial"/>
+          <w:b/>
+          <w:bCs/>
+        </w:rPr>
+        <w:t xml:space="preserve"> </w:t>
+      </w:r>
+      <w:r>
+        <w:rPr>
+          <w:rFonts w:ascii="Arial" w:hAnsi="Arial" w:cs="Arial"/>
+        </w:rPr>
+        <w:t xml:space="preserve">ya que </w:t>
+      </w:r>
+      <w:r>
+        <w:rPr>
+          <w:rFonts w:ascii="Arial" w:hAnsi="Arial" w:cs="Arial"/>
+        </w:rPr>
+        <w:t>otorga</w:t>
+      </w:r>
+      <w:r>
+        <w:rPr>
+          <w:rFonts w:ascii="Arial" w:hAnsi="Arial" w:cs="Arial"/>
+        </w:rPr>
+        <w:t xml:space="preserve"> </w:t>
+      </w:r>
+      <w:r>
+        <w:rPr>
+          <w:rFonts w:ascii="Arial" w:hAnsi="Arial" w:cs="Arial"/>
+        </w:rPr>
+        <w:t>permisos</w:t>
+      </w:r>
+      <w:r>
+        <w:rPr>
+          <w:rFonts w:ascii="Arial" w:hAnsi="Arial" w:cs="Arial"/>
+        </w:rPr>
+        <w:t xml:space="preserve"> a archivos y carpetas, esto es importante para un administrador de sistemas para que no cualquiera pueda tocar lo que no le corresponda, porque si se deja el libre acceso personal que no esta tan capacitado puede borrar un archivo o modificar alguno por error y </w:t>
+      </w:r>
+      <w:r>
+        <w:rPr>
+          <w:rFonts w:ascii="Arial" w:hAnsi="Arial" w:cs="Arial"/>
+        </w:rPr>
+        <w:t>ocasionar</w:t>
+      </w:r>
+      <w:r>
+        <w:rPr>
+          <w:rFonts w:ascii="Arial" w:hAnsi="Arial" w:cs="Arial"/>
+        </w:rPr>
+        <w:t xml:space="preserve"> problemas o no, pero para mayor seguridad esto mantiene el sistema seguro y que cada usuario </w:t>
+      </w:r>
+      <w:r>
+        <w:rPr>
+          <w:rFonts w:ascii="Arial" w:hAnsi="Arial" w:cs="Arial"/>
+        </w:rPr>
+        <w:t>dependiendo</w:t>
+      </w:r>
+      <w:r>
+        <w:rPr>
+          <w:rFonts w:ascii="Arial" w:hAnsi="Arial" w:cs="Arial"/>
+        </w:rPr>
+        <w:t xml:space="preserve"> de si cargo pueda acceder a archivos y carpetas que le correspondan. </w:t>
       </w:r>
     </w:p>
     <w:sectPr>
-      <w:headerReference w:type="default" r:id="rId31"/>
-      <w:footerReference w:type="default" r:id="rId32"/>
+      <w:headerReference w:type="default" r:id="rId37"/>
+      <w:footerReference w:type="default" r:id="rId38"/>
       <w:pgSz w:w="11906" w:h="16838"/>
       <w:pgMar w:top="1417" w:right="1701" w:bottom="1417" w:left="1701" w:header="708" w:footer="708" w:gutter="0"/>
       <w:cols w:space="708"/>
@@ -2877,6 +5419,119 @@
       </w:pPr>
     </w:lvl>
   </w:abstractNum>
+  <w:abstractNum w:abstractNumId="6" w15:restartNumberingAfterBreak="0">
+    <w:nsid w:val="76137994"/>
+    <w:multiLevelType w:val="hybridMultilevel"/>
+    <w:tmpl w:val="E292A0E4"/>
+    <w:lvl w:ilvl="0" w:tplc="73C0E996">
+      <w:numFmt w:val="bullet"/>
+      <w:lvlText w:val="-"/>
+      <w:lvlJc w:val="left"/>
+      <w:pPr>
+        <w:ind w:left="720" w:hanging="360"/>
+      </w:pPr>
+      <w:rPr>
+        <w:rFonts w:ascii="Arial" w:eastAsiaTheme="minorHAnsi" w:hAnsi="Arial" w:cs="Arial" w:hint="default"/>
+        <w:b/>
+      </w:rPr>
+    </w:lvl>
+    <w:lvl w:ilvl="1" w:tplc="04090003">
+      <w:start w:val="1"/>
+      <w:numFmt w:val="bullet"/>
+      <w:lvlText w:val="o"/>
+      <w:lvlJc w:val="left"/>
+      <w:pPr>
+        <w:ind w:left="1440" w:hanging="360"/>
+      </w:pPr>
+      <w:rPr>
+        <w:rFonts w:ascii="Courier New" w:hAnsi="Courier New" w:cs="Courier New" w:hint="default"/>
+      </w:rPr>
+    </w:lvl>
+    <w:lvl w:ilvl="2" w:tplc="04090005" w:tentative="1">
+      <w:start w:val="1"/>
+      <w:numFmt w:val="bullet"/>
+      <w:lvlText w:val=""/>
+      <w:lvlJc w:val="left"/>
+      <w:pPr>
+        <w:ind w:left="2160" w:hanging="360"/>
+      </w:pPr>
+      <w:rPr>
+        <w:rFonts w:ascii="Wingdings" w:hAnsi="Wingdings" w:hint="default"/>
+      </w:rPr>
+    </w:lvl>
+    <w:lvl w:ilvl="3" w:tplc="04090001" w:tentative="1">
+      <w:start w:val="1"/>
+      <w:numFmt w:val="bullet"/>
+      <w:lvlText w:val=""/>
+      <w:lvlJc w:val="left"/>
+      <w:pPr>
+        <w:ind w:left="2880" w:hanging="360"/>
+      </w:pPr>
+      <w:rPr>
+        <w:rFonts w:ascii="Symbol" w:hAnsi="Symbol" w:hint="default"/>
+      </w:rPr>
+    </w:lvl>
+    <w:lvl w:ilvl="4" w:tplc="04090003" w:tentative="1">
+      <w:start w:val="1"/>
+      <w:numFmt w:val="bullet"/>
+      <w:lvlText w:val="o"/>
+      <w:lvlJc w:val="left"/>
+      <w:pPr>
+        <w:ind w:left="3600" w:hanging="360"/>
+      </w:pPr>
+      <w:rPr>
+        <w:rFonts w:ascii="Courier New" w:hAnsi="Courier New" w:cs="Courier New" w:hint="default"/>
+      </w:rPr>
+    </w:lvl>
+    <w:lvl w:ilvl="5" w:tplc="04090005" w:tentative="1">
+      <w:start w:val="1"/>
+      <w:numFmt w:val="bullet"/>
+      <w:lvlText w:val=""/>
+      <w:lvlJc w:val="left"/>
+      <w:pPr>
+        <w:ind w:left="4320" w:hanging="360"/>
+      </w:pPr>
+      <w:rPr>
+        <w:rFonts w:ascii="Wingdings" w:hAnsi="Wingdings" w:hint="default"/>
+      </w:rPr>
+    </w:lvl>
+    <w:lvl w:ilvl="6" w:tplc="04090001" w:tentative="1">
+      <w:start w:val="1"/>
+      <w:numFmt w:val="bullet"/>
+      <w:lvlText w:val=""/>
+      <w:lvlJc w:val="left"/>
+      <w:pPr>
+        <w:ind w:left="5040" w:hanging="360"/>
+      </w:pPr>
+      <w:rPr>
+        <w:rFonts w:ascii="Symbol" w:hAnsi="Symbol" w:hint="default"/>
+      </w:rPr>
+    </w:lvl>
+    <w:lvl w:ilvl="7" w:tplc="04090003" w:tentative="1">
+      <w:start w:val="1"/>
+      <w:numFmt w:val="bullet"/>
+      <w:lvlText w:val="o"/>
+      <w:lvlJc w:val="left"/>
+      <w:pPr>
+        <w:ind w:left="5760" w:hanging="360"/>
+      </w:pPr>
+      <w:rPr>
+        <w:rFonts w:ascii="Courier New" w:hAnsi="Courier New" w:cs="Courier New" w:hint="default"/>
+      </w:rPr>
+    </w:lvl>
+    <w:lvl w:ilvl="8" w:tplc="04090005" w:tentative="1">
+      <w:start w:val="1"/>
+      <w:numFmt w:val="bullet"/>
+      <w:lvlText w:val=""/>
+      <w:lvlJc w:val="left"/>
+      <w:pPr>
+        <w:ind w:left="6480" w:hanging="360"/>
+      </w:pPr>
+      <w:rPr>
+        <w:rFonts w:ascii="Wingdings" w:hAnsi="Wingdings" w:hint="default"/>
+      </w:rPr>
+    </w:lvl>
+  </w:abstractNum>
   <w:num w:numId="1" w16cid:durableId="370571857">
     <w:abstractNumId w:val="4"/>
   </w:num>
@@ -2894,6 +5549,9 @@
   </w:num>
   <w:num w:numId="6" w16cid:durableId="1991707294">
     <w:abstractNumId w:val="3"/>
+  </w:num>
+  <w:num w:numId="7" w16cid:durableId="2053534178">
+    <w:abstractNumId w:val="6"/>
   </w:num>
 </w:numbering>
 </file>
@@ -3300,7 +5958,6 @@
   <w:style w:type="character" w:default="1" w:styleId="DefaultParagraphFont">
     <w:name w:val="Default Paragraph Font"/>
     <w:uiPriority w:val="1"/>
-    <w:semiHidden/>
     <w:unhideWhenUsed/>
   </w:style>
   <w:style w:type="table" w:default="1" w:styleId="TableNormal">

</xml_diff>